<commit_message>
complete mid sem pdr
</commit_message>
<xml_diff>
--- a/Studio/Studio 3 PDR Planning Worksheet.docx
+++ b/Studio/Studio 3 PDR Planning Worksheet.docx
@@ -1,6 +1,6 @@
 
 <file path=word/document.xml><?xml version="1.0" encoding="utf-8"?>
-<w:document xmlns:wpc="http://schemas.microsoft.com/office/word/2010/wordprocessingCanvas" xmlns:cx="http://schemas.microsoft.com/office/drawing/2014/chartex" xmlns:cx1="http://schemas.microsoft.com/office/drawing/2015/9/8/chartex" xmlns:cx2="http://schemas.microsoft.com/office/drawing/2015/10/21/chartex" xmlns:cx3="http://schemas.microsoft.com/office/drawing/2016/5/9/chartex" xmlns:cx4="http://schemas.microsoft.com/office/drawing/2016/5/10/chartex" xmlns:cx5="http://schemas.microsoft.com/office/drawing/2016/5/11/chartex" xmlns:cx6="http://schemas.microsoft.com/office/drawing/2016/5/12/chartex" xmlns:cx7="http://schemas.microsoft.com/office/drawing/2016/5/13/chartex" xmlns:cx8="http://schemas.microsoft.com/office/drawing/2016/5/14/chartex" xmlns:mc="http://schemas.openxmlformats.org/markup-compatibility/2006" xmlns:aink="http://schemas.microsoft.com/office/drawing/2016/ink" xmlns:am3d="http://schemas.microsoft.com/office/drawing/2017/model3d" xmlns:o="urn:schemas-microsoft-com:office:office" xmlns:oel="http://schemas.microsoft.com/office/2019/extlst" xmlns:r="http://schemas.openxmlformats.org/officeDocument/2006/relationships" xmlns:m="http://schemas.openxmlformats.org/officeDocument/2006/math" xmlns:v="urn:schemas-microsoft-com:vml" xmlns:wp14="http://schemas.microsoft.com/office/word/2010/wordprocessingDrawing" xmlns:wp="http://schemas.openxmlformats.org/drawingml/2006/wordprocessingDrawing" xmlns:w10="urn:schemas-microsoft-com:office:word" xmlns:w="http://schemas.openxmlformats.org/wordprocessingml/2006/main" xmlns:w14="http://schemas.microsoft.com/office/word/2010/wordml" xmlns:w15="http://schemas.microsoft.com/office/word/2012/wordml" xmlns:w16cex="http://schemas.microsoft.com/office/word/2018/wordml/cex" xmlns:w16cid="http://schemas.microsoft.com/office/word/2016/wordml/cid" xmlns:w16="http://schemas.microsoft.com/office/word/2018/wordml" xmlns:w16du="http://schemas.microsoft.com/office/word/2023/wordml/word16du" xmlns:w16sdtdh="http://schemas.microsoft.com/office/word/2020/wordml/sdtdatahash" xmlns:w16sdtfl="http://schemas.microsoft.com/office/word/2024/wordml/sdtformatlock" xmlns:w16se="http://schemas.microsoft.com/office/word/2015/wordml/symex" xmlns:wpg="http://schemas.microsoft.com/office/word/2010/wordprocessingGroup" xmlns:wpi="http://schemas.microsoft.com/office/word/2010/wordprocessingInk" xmlns:wne="http://schemas.microsoft.com/office/word/2006/wordml" xmlns:wps="http://schemas.microsoft.com/office/word/2010/wordprocessingShape" mc:Ignorable="w14 w15 w16se w16cid w16 w16cex w16sdtdh w16sdtfl w16du wp14">
+<w:document xmlns:wpc="http://schemas.microsoft.com/office/word/2010/wordprocessingCanvas" xmlns:cx="http://schemas.microsoft.com/office/drawing/2014/chartex" xmlns:cx1="http://schemas.microsoft.com/office/drawing/2015/9/8/chartex" xmlns:cx2="http://schemas.microsoft.com/office/drawing/2015/10/21/chartex" xmlns:cx3="http://schemas.microsoft.com/office/drawing/2016/5/9/chartex" xmlns:cx4="http://schemas.microsoft.com/office/drawing/2016/5/10/chartex" xmlns:cx5="http://schemas.microsoft.com/office/drawing/2016/5/11/chartex" xmlns:cx6="http://schemas.microsoft.com/office/drawing/2016/5/12/chartex" xmlns:cx7="http://schemas.microsoft.com/office/drawing/2016/5/13/chartex" xmlns:cx8="http://schemas.microsoft.com/office/drawing/2016/5/14/chartex" xmlns:mc="http://schemas.openxmlformats.org/markup-compatibility/2006" xmlns:aink="http://schemas.microsoft.com/office/drawing/2016/ink" xmlns:am3d="http://schemas.microsoft.com/office/drawing/2017/model3d" xmlns:o="urn:schemas-microsoft-com:office:office" xmlns:oel="http://schemas.microsoft.com/office/2019/extlst" xmlns:r="http://schemas.openxmlformats.org/officeDocument/2006/relationships" xmlns:m="http://schemas.openxmlformats.org/officeDocument/2006/math" xmlns:v="urn:schemas-microsoft-com:vml" xmlns:wp14="http://schemas.microsoft.com/office/word/2010/wordprocessingDrawing" xmlns:wp="http://schemas.openxmlformats.org/drawingml/2006/wordprocessingDrawing" xmlns:w10="urn:schemas-microsoft-com:office:word" xmlns:w="http://schemas.openxmlformats.org/wordprocessingml/2006/main" xmlns:w14="http://schemas.microsoft.com/office/word/2010/wordml" xmlns:w15="http://schemas.microsoft.com/office/word/2012/wordml" xmlns:w16cex="http://schemas.microsoft.com/office/word/2018/wordml/cex" xmlns:w16cid="http://schemas.microsoft.com/office/word/2016/wordml/cid" xmlns:w16="http://schemas.microsoft.com/office/word/2018/wordml" xmlns:w16du="http://schemas.microsoft.com/office/word/2023/wordml/word16du" xmlns:w16sdtdh="http://schemas.microsoft.com/office/word/2020/wordml/sdtdatahash" xmlns:w16sdtfl="http://schemas.microsoft.com/office/word/2024/wordml/sdtformatlock" xmlns:w16se="http://schemas.microsoft.com/office/word/2015/wordml/symex" xmlns:wpg="http://schemas.microsoft.com/office/word/2010/wordprocessingGroup" xmlns:wpi="http://schemas.microsoft.com/office/word/2010/wordprocessingInk" xmlns:wne="http://schemas.microsoft.com/office/word/2006/wordml" xmlns:wps="http://schemas.microsoft.com/office/word/2010/wordprocessingShape" xmlns:a="http://schemas.openxmlformats.org/drawingml/2006/main" xmlns:pic="http://schemas.openxmlformats.org/drawingml/2006/picture" xmlns:a14="http://schemas.microsoft.com/office/drawing/2010/main" mc:Ignorable="w14 w15 w16se w16cid w16 w16cex w16sdtdh w16sdtfl w16du wp14">
   <w:body>
     <w:p>
       <w:pPr>
@@ -670,11 +670,12 @@
       </w:tblGrid>
       <w:tr>
         <w:trPr>
-          <w:trHeight w:val="5733"/>
+          <w:trHeight w:val="4200"/>
         </w:trPr>
         <w:tc>
           <w:tcPr>
             <w:tcW w:w="9010" w:type="dxa"/>
+            <w:tcMar/>
           </w:tcPr>
           <w:p>
             <w:pPr>
@@ -720,66 +721,58 @@
             <w:pPr>
               <w:rPr>
                 <w:rFonts w:eastAsia="Calibri"/>
-                <w:szCs w:val="22"/>
               </w:rPr>
             </w:pPr>
             <w:r>
               <w:rPr>
                 <w:rFonts w:eastAsia="Calibri"/>
-                <w:szCs w:val="22"/>
-              </w:rPr>
-              <w:t>To achieve an industry standard</w:t>
+              </w:rPr>
+              <w:t>I’d</w:t>
             </w:r>
             <w:r>
               <w:rPr>
                 <w:rFonts w:eastAsia="Calibri"/>
-                <w:szCs w:val="22"/>
-              </w:rPr>
-              <w:t xml:space="preserve"> level</w:t>
-            </w:r>
-            <w:r>
+              </w:rPr>
+              <w:t xml:space="preserve"> like to develop skills catered towards cybersecurity and app development namely full-stack and pen-testing. </w:t>
+            </w:r>
+          </w:p>
+          <w:p>
+            <w:pPr>
               <w:rPr>
                 <w:rFonts w:eastAsia="Calibri"/>
-                <w:szCs w:val="22"/>
-              </w:rPr>
-              <w:t xml:space="preserve"> of skill to get a job quickly.</w:t>
-            </w:r>
+              </w:rPr>
+            </w:pPr>
             <w:r>
               <w:rPr>
                 <w:rFonts w:eastAsia="Calibri"/>
-                <w:szCs w:val="22"/>
-              </w:rPr>
-              <w:t xml:space="preserve"> </w:t>
-            </w:r>
-          </w:p>
-          <w:p>
-            <w:pPr>
+              </w:rPr>
+              <w:t>I hope to gather experience in the field when I perform level 1 support technician work for my job</w:t>
+            </w:r>
+            <w:r>
               <w:rPr>
                 <w:rFonts w:eastAsia="Calibri"/>
-                <w:szCs w:val="22"/>
-              </w:rPr>
-            </w:pPr>
-            <w:r>
+              </w:rPr>
+              <w:t xml:space="preserve"> helping patch network vulnerabilities.</w:t>
+            </w:r>
+          </w:p>
+          <w:p>
+            <w:pPr>
+              <w:pStyle w:val="Normal"/>
               <w:rPr>
                 <w:rFonts w:eastAsia="Calibri"/>
-                <w:szCs w:val="22"/>
-              </w:rPr>
-              <w:t>To make connections with working professionals and clients.</w:t>
-            </w:r>
-          </w:p>
-          <w:p>
-            <w:pPr>
+              </w:rPr>
+            </w:pPr>
+            <w:r>
               <w:rPr>
                 <w:rFonts w:eastAsia="Calibri"/>
-                <w:szCs w:val="22"/>
-              </w:rPr>
-            </w:pPr>
+              </w:rPr>
+              <w:t>I’d</w:t>
+            </w:r>
             <w:r>
               <w:rPr>
                 <w:rFonts w:eastAsia="Calibri"/>
-                <w:szCs w:val="22"/>
-              </w:rPr>
-              <w:t>To develop the skills necessary for work in cybersecurity.</w:t>
+              </w:rPr>
+              <w:t xml:space="preserve"> like to learn more about Linux systems along the way.</w:t>
             </w:r>
           </w:p>
         </w:tc>
@@ -791,6 +784,7 @@
         <w:tc>
           <w:tcPr>
             <w:tcW w:w="9010" w:type="dxa"/>
+            <w:tcMar/>
           </w:tcPr>
           <w:p>
             <w:pPr>
@@ -823,21 +817,81 @@
               <w:rPr>
                 <w:rFonts w:cs="Arial"/>
               </w:rPr>
-              <w:t xml:space="preserve">I’ve picked up code faster than last year which shows improvement in that field. It’s also become easier to communicate with my classmates. </w:t>
-            </w:r>
-          </w:p>
-          <w:p>
-            <w:pPr>
-              <w:rPr>
-                <w:rFonts w:cs="Arial"/>
-              </w:rPr>
-            </w:pPr>
-            <w:r>
-              <w:rPr>
-                <w:rFonts w:cs="Arial"/>
-              </w:rPr>
-              <w:t>I believe I’m strong when it comes to absorbing the curriculum.</w:t>
-            </w:r>
+              <w:t xml:space="preserve">This semester has had some ups and </w:t>
+            </w:r>
+            <w:r>
+              <w:rPr>
+                <w:rFonts w:cs="Arial"/>
+              </w:rPr>
+              <w:t>downs,</w:t>
+            </w:r>
+            <w:r>
+              <w:rPr>
+                <w:rFonts w:cs="Arial"/>
+              </w:rPr>
+              <w:t xml:space="preserve"> but I think my project work has been of a </w:t>
+            </w:r>
+            <w:r>
+              <w:rPr/>
+              <w:t xml:space="preserve">consistently </w:t>
+            </w:r>
+            <w:r>
+              <w:rPr>
+                <w:rFonts w:cs="Arial"/>
+              </w:rPr>
+              <w:t>high standard.</w:t>
+            </w:r>
+          </w:p>
+          <w:p>
+            <w:pPr>
+              <w:pStyle w:val="Normal"/>
+              <w:suppressLineNumbers w:val="0"/>
+              <w:bidi w:val="0"/>
+              <w:spacing w:before="120" w:beforeAutospacing="off" w:after="120" w:afterAutospacing="off" w:line="259" w:lineRule="auto"/>
+              <w:ind w:left="0" w:right="0"/>
+              <w:jc w:val="left"/>
+            </w:pPr>
+            <w:r>
+              <w:rPr>
+                <w:rFonts w:cs="Arial"/>
+              </w:rPr>
+              <w:t xml:space="preserve">I love learning and I know where to find what I need to know to advance my skillset further. </w:t>
+            </w:r>
+          </w:p>
+          <w:p>
+            <w:pPr>
+              <w:pStyle w:val="Normal"/>
+              <w:suppressLineNumbers w:val="0"/>
+              <w:bidi w:val="0"/>
+              <w:spacing w:before="120" w:beforeAutospacing="off" w:after="120" w:afterAutospacing="off" w:line="259" w:lineRule="auto"/>
+              <w:ind w:left="0" w:right="0"/>
+              <w:jc w:val="left"/>
+            </w:pPr>
+            <w:r>
+              <w:rPr>
+                <w:rFonts w:cs="Arial"/>
+              </w:rPr>
+              <w:t xml:space="preserve">I think </w:t>
+            </w:r>
+            <w:r>
+              <w:rPr>
+                <w:rFonts w:cs="Arial"/>
+              </w:rPr>
+              <w:t>I’m</w:t>
+            </w:r>
+            <w:r>
+              <w:rPr>
+                <w:rFonts w:cs="Arial"/>
+              </w:rPr>
+              <w:t xml:space="preserve"> decent at directing a group towards what should be done or just getting them on track to considering what needs doing. </w:t>
+            </w:r>
+          </w:p>
+          <w:p>
+            <w:pPr>
+              <w:rPr>
+                <w:rFonts w:cs="Arial"/>
+              </w:rPr>
+            </w:pPr>
           </w:p>
         </w:tc>
       </w:tr>
@@ -848,6 +902,7 @@
         <w:tc>
           <w:tcPr>
             <w:tcW w:w="9010" w:type="dxa"/>
+            <w:tcMar/>
           </w:tcPr>
           <w:p>
             <w:pPr>
@@ -893,15 +948,38 @@
             <w:pPr>
               <w:rPr>
                 <w:rFonts w:eastAsia="Calibri"/>
-                <w:szCs w:val="22"/>
               </w:rPr>
             </w:pPr>
             <w:r>
               <w:rPr>
                 <w:rFonts w:eastAsia="Calibri"/>
-                <w:szCs w:val="22"/>
-              </w:rPr>
-              <w:t>Getting on top of projects has been a bit of a struggle this semester as life has gotten in the way a small bit. If I were to do it again with this knowledge, I would be better at organising my time and splitting it between home, clubs and assignments.</w:t>
+              </w:rPr>
+              <w:t xml:space="preserve">Getting on top of projects has been a bit of a struggle this semester as life has gotten in the way a small bit. </w:t>
+            </w:r>
+          </w:p>
+          <w:p>
+            <w:pPr>
+              <w:rPr>
+                <w:rFonts w:eastAsia="Calibri"/>
+              </w:rPr>
+            </w:pPr>
+            <w:r>
+              <w:rPr>
+                <w:rFonts w:eastAsia="Calibri"/>
+              </w:rPr>
+              <w:t xml:space="preserve">If I were to do it again with this knowledge, </w:t>
+            </w:r>
+            <w:r>
+              <w:rPr>
+                <w:rFonts w:eastAsia="Calibri"/>
+              </w:rPr>
+              <w:t>I’d</w:t>
+            </w:r>
+            <w:r>
+              <w:rPr>
+                <w:rFonts w:eastAsia="Calibri"/>
+              </w:rPr>
+              <w:t xml:space="preserve"> manage my schedule better to allow me more time to work on projects.</w:t>
             </w:r>
           </w:p>
         </w:tc>
@@ -913,6 +991,7 @@
         <w:tc>
           <w:tcPr>
             <w:tcW w:w="9010" w:type="dxa"/>
+            <w:tcMar/>
           </w:tcPr>
           <w:p>
             <w:pPr>
@@ -957,20 +1036,26 @@
               <w:rPr>
                 <w:rFonts w:cs="Arial"/>
               </w:rPr>
-              <w:t xml:space="preserve">I aim to explore the Linux ecosystem and try my hand at some ethical hacking courses. </w:t>
-            </w:r>
-          </w:p>
-          <w:p>
-            <w:pPr>
-              <w:rPr>
-                <w:rFonts w:cs="Arial"/>
-              </w:rPr>
-            </w:pPr>
-            <w:r>
-              <w:rPr>
-                <w:rFonts w:cs="Arial"/>
-              </w:rPr>
-              <w:t xml:space="preserve">I’d like to remain flexible across many </w:t>
+              <w:t xml:space="preserve">I aim to try my hand at some ethical hacking courses. </w:t>
+            </w:r>
+          </w:p>
+          <w:p>
+            <w:pPr>
+              <w:rPr>
+                <w:rFonts w:cs="Arial"/>
+              </w:rPr>
+            </w:pPr>
+            <w:r>
+              <w:rPr>
+                <w:rFonts w:cs="Arial"/>
+              </w:rPr>
+              <w:t>I’d</w:t>
+            </w:r>
+            <w:r>
+              <w:rPr>
+                <w:rFonts w:cs="Arial"/>
+              </w:rPr>
+              <w:t xml:space="preserve"> like to remain flexible across many </w:t>
             </w:r>
             <w:r>
               <w:rPr>
@@ -982,8 +1067,52 @@
               <w:rPr>
                 <w:rFonts w:cs="Arial"/>
               </w:rPr>
-              <w:t xml:space="preserve"> so I’d like to also work on my full-stack app development skills.</w:t>
-            </w:r>
+              <w:t xml:space="preserve"> so </w:t>
+            </w:r>
+            <w:r>
+              <w:rPr>
+                <w:rFonts w:cs="Arial"/>
+              </w:rPr>
+              <w:t>I’d</w:t>
+            </w:r>
+            <w:r>
+              <w:rPr>
+                <w:rFonts w:cs="Arial"/>
+              </w:rPr>
+              <w:t xml:space="preserve"> like to also work on my full-stack app development skills.</w:t>
+            </w:r>
+          </w:p>
+          <w:p>
+            <w:pPr>
+              <w:rPr>
+                <w:rFonts w:eastAsia="Calibri"/>
+              </w:rPr>
+            </w:pPr>
+            <w:r>
+              <w:rPr>
+                <w:rFonts w:eastAsia="Calibri"/>
+              </w:rPr>
+              <w:t xml:space="preserve">Following cybersecurity, my focus should be towards building an understanding of </w:t>
+            </w:r>
+            <w:r>
+              <w:rPr>
+                <w:rFonts w:eastAsia="Calibri"/>
+              </w:rPr>
+              <w:t>Linux-</w:t>
+            </w:r>
+            <w:r>
+              <w:rPr>
+                <w:rFonts w:eastAsia="Calibri"/>
+              </w:rPr>
+              <w:t>based systems for its versatility and complexity.</w:t>
+            </w:r>
+          </w:p>
+          <w:p>
+            <w:pPr>
+              <w:rPr>
+                <w:rFonts w:cs="Arial"/>
+              </w:rPr>
+            </w:pPr>
           </w:p>
         </w:tc>
       </w:tr>
@@ -994,6 +1123,7 @@
         <w:tc>
           <w:tcPr>
             <w:tcW w:w="9010" w:type="dxa"/>
+            <w:tcMar/>
           </w:tcPr>
           <w:p>
             <w:pPr>
@@ -1011,35 +1141,148 @@
           </w:p>
           <w:p>
             <w:pPr>
-              <w:rPr>
-                <w:rFonts w:cs="Arial"/>
-              </w:rPr>
-            </w:pPr>
-          </w:p>
-          <w:p>
-            <w:pPr>
-              <w:rPr>
-                <w:rFonts w:cs="Arial"/>
-              </w:rPr>
-            </w:pPr>
-            <w:r>
-              <w:rPr>
-                <w:rFonts w:cs="Arial"/>
-              </w:rPr>
-              <w:t>Travel between work and Polytech can be difficult but I should be able to deal with it by downsizing my vehicle and taking public transport more often.</w:t>
-            </w:r>
-          </w:p>
-          <w:p>
-            <w:pPr>
-              <w:rPr>
-                <w:rFonts w:cs="Arial"/>
-              </w:rPr>
-            </w:pPr>
-            <w:r>
-              <w:rPr>
-                <w:rFonts w:cs="Arial"/>
-              </w:rPr>
-              <w:t>Money is also an issue that I’m working on now. I have a job but as it is contract work with a newer company, it’s been a bit slow to start.</w:t>
+              <w:pStyle w:val="Normal"/>
+              <w:rPr>
+                <w:rFonts w:cs="Arial"/>
+              </w:rPr>
+            </w:pPr>
+          </w:p>
+          <w:p>
+            <w:pPr>
+              <w:pStyle w:val="Normal"/>
+              <w:rPr>
+                <w:rFonts w:cs="Arial"/>
+              </w:rPr>
+            </w:pPr>
+            <w:r>
+              <w:rPr>
+                <w:rFonts w:cs="Arial"/>
+              </w:rPr>
+              <w:t>Time management</w:t>
+            </w:r>
+            <w:r>
+              <w:rPr>
+                <w:rFonts w:cs="Arial"/>
+              </w:rPr>
+              <w:t xml:space="preserve"> issues are something</w:t>
+            </w:r>
+            <w:r>
+              <w:rPr>
+                <w:rFonts w:cs="Arial"/>
+              </w:rPr>
+              <w:t xml:space="preserve"> I deal with </w:t>
+            </w:r>
+            <w:r>
+              <w:rPr>
+                <w:rFonts w:cs="Arial"/>
+              </w:rPr>
+              <w:t>frequently</w:t>
+            </w:r>
+            <w:r>
+              <w:rPr>
+                <w:rFonts w:cs="Arial"/>
+              </w:rPr>
+              <w:t xml:space="preserve">. </w:t>
+            </w:r>
+            <w:r>
+              <w:rPr>
+                <w:rFonts w:cs="Arial"/>
+              </w:rPr>
+              <w:t xml:space="preserve">I hope to better manage my time by using a calendar and properly </w:t>
+            </w:r>
+            <w:r>
+              <w:rPr>
+                <w:rFonts w:cs="Arial"/>
+              </w:rPr>
+              <w:t>allocating</w:t>
+            </w:r>
+            <w:r>
+              <w:rPr>
+                <w:rFonts w:cs="Arial"/>
+              </w:rPr>
+              <w:t xml:space="preserve"> study times throughout the week.</w:t>
+            </w:r>
+            <w:r>
+              <w:rPr>
+                <w:rFonts w:cs="Arial"/>
+              </w:rPr>
+              <w:t xml:space="preserve"> </w:t>
+            </w:r>
+            <w:r>
+              <w:rPr>
+                <w:rFonts w:cs="Arial"/>
+              </w:rPr>
+              <w:t xml:space="preserve">I also plan </w:t>
+            </w:r>
+            <w:r>
+              <w:rPr>
+                <w:rFonts w:cs="Arial"/>
+              </w:rPr>
+              <w:t>on cutting</w:t>
+            </w:r>
+            <w:r>
+              <w:rPr>
+                <w:rFonts w:cs="Arial"/>
+              </w:rPr>
+              <w:t xml:space="preserve"> down extracurricular activities so I can dedicate more time to projects.</w:t>
+            </w:r>
+          </w:p>
+          <w:p>
+            <w:pPr>
+              <w:pStyle w:val="Normal"/>
+              <w:rPr>
+                <w:rFonts w:cs="Arial"/>
+              </w:rPr>
+            </w:pPr>
+          </w:p>
+          <w:p>
+            <w:pPr>
+              <w:pStyle w:val="Normal"/>
+              <w:rPr>
+                <w:rFonts w:cs="Arial"/>
+              </w:rPr>
+            </w:pPr>
+            <w:r>
+              <w:rPr>
+                <w:rFonts w:cs="Arial"/>
+              </w:rPr>
+              <w:t xml:space="preserve">My sleep schedule has been a bit messy of late, and </w:t>
+            </w:r>
+            <w:r>
+              <w:rPr>
+                <w:rFonts w:cs="Arial"/>
+              </w:rPr>
+              <w:t>I’d</w:t>
+            </w:r>
+            <w:r>
+              <w:rPr>
+                <w:rFonts w:cs="Arial"/>
+              </w:rPr>
+              <w:t xml:space="preserve"> like to work on waking up earlier to maximise </w:t>
+            </w:r>
+            <w:r>
+              <w:rPr>
+                <w:rFonts w:cs="Arial"/>
+              </w:rPr>
+              <w:t xml:space="preserve">the </w:t>
+            </w:r>
+            <w:r>
+              <w:rPr>
+                <w:rFonts w:cs="Arial"/>
+              </w:rPr>
+              <w:t xml:space="preserve">time </w:t>
+            </w:r>
+            <w:r>
+              <w:rPr>
+                <w:rFonts w:cs="Arial"/>
+              </w:rPr>
+              <w:t>I’m</w:t>
+            </w:r>
+            <w:r>
+              <w:rPr>
+                <w:rFonts w:cs="Arial"/>
+              </w:rPr>
+              <w:t xml:space="preserve"> able to dedicate towards study.</w:t>
             </w:r>
           </w:p>
         </w:tc>
@@ -1051,6 +1294,7 @@
         <w:tc>
           <w:tcPr>
             <w:tcW w:w="9010" w:type="dxa"/>
+            <w:tcMar/>
           </w:tcPr>
           <w:p>
             <w:pPr>
@@ -1086,34 +1330,120 @@
           </w:p>
           <w:p>
             <w:pPr>
+              <w:pStyle w:val="Normal"/>
               <w:rPr>
                 <w:rFonts w:eastAsia="Calibri" w:cs="Arial"/>
-                <w:i/>
-                <w:iCs/>
-                <w:szCs w:val="22"/>
-              </w:rPr>
-            </w:pPr>
-          </w:p>
-          <w:p>
-            <w:pPr>
+                <w:i w:val="1"/>
+                <w:iCs w:val="1"/>
+              </w:rPr>
+            </w:pPr>
+          </w:p>
+          <w:p>
+            <w:pPr>
+              <w:pStyle w:val="Normal"/>
               <w:rPr>
                 <w:rFonts w:eastAsia="Calibri" w:cs="Arial"/>
-                <w:szCs w:val="22"/>
+                <w:i w:val="0"/>
+                <w:iCs w:val="0"/>
               </w:rPr>
             </w:pPr>
             <w:r>
               <w:rPr>
                 <w:rFonts w:eastAsia="Calibri" w:cs="Arial"/>
-                <w:szCs w:val="22"/>
-              </w:rPr>
-              <w:t xml:space="preserve">My enthusiasm for game development has declined and that’s left me at a bit of a loss for what to do next. Thankfully I’ve already considered cybersecurity, </w:t>
+                <w:i w:val="0"/>
+                <w:iCs w:val="0"/>
+              </w:rPr>
+              <w:t xml:space="preserve">I entered this course to learn game programming so I could get a job in game </w:t>
             </w:r>
             <w:r>
               <w:rPr>
                 <w:rFonts w:eastAsia="Calibri" w:cs="Arial"/>
-                <w:szCs w:val="22"/>
-              </w:rPr>
-              <w:t>but my decision remains unclear.</w:t>
+                <w:i w:val="0"/>
+                <w:iCs w:val="0"/>
+              </w:rPr>
+              <w:t>development,</w:t>
+            </w:r>
+            <w:r>
+              <w:rPr>
+                <w:rFonts w:eastAsia="Calibri" w:cs="Arial"/>
+                <w:i w:val="0"/>
+                <w:iCs w:val="0"/>
+              </w:rPr>
+              <w:t xml:space="preserve"> but my interests are leaning towards cybersecurity and</w:t>
+            </w:r>
+            <w:r>
+              <w:rPr>
+                <w:rFonts w:eastAsia="Calibri" w:cs="Arial"/>
+                <w:i w:val="0"/>
+                <w:iCs w:val="0"/>
+              </w:rPr>
+              <w:t xml:space="preserve"> app development. </w:t>
+            </w:r>
+          </w:p>
+          <w:p>
+            <w:pPr>
+              <w:pStyle w:val="Normal"/>
+              <w:rPr>
+                <w:rFonts w:eastAsia="Calibri" w:cs="Arial"/>
+                <w:i w:val="0"/>
+                <w:iCs w:val="0"/>
+              </w:rPr>
+            </w:pPr>
+            <w:r>
+              <w:rPr>
+                <w:rFonts w:eastAsia="Calibri" w:cs="Arial"/>
+                <w:i w:val="0"/>
+                <w:iCs w:val="0"/>
+              </w:rPr>
+              <w:t>I’ve</w:t>
+            </w:r>
+            <w:r>
+              <w:rPr>
+                <w:rFonts w:eastAsia="Calibri" w:cs="Arial"/>
+                <w:i w:val="0"/>
+                <w:iCs w:val="0"/>
+              </w:rPr>
+              <w:t xml:space="preserve"> signed on for a job but have been waiting for a while to </w:t>
+            </w:r>
+            <w:r>
+              <w:rPr>
+                <w:rFonts w:eastAsia="Calibri" w:cs="Arial"/>
+                <w:i w:val="0"/>
+                <w:iCs w:val="0"/>
+              </w:rPr>
+              <w:t>start</w:t>
+            </w:r>
+            <w:r>
+              <w:rPr>
+                <w:rFonts w:eastAsia="Calibri" w:cs="Arial"/>
+                <w:i w:val="0"/>
+                <w:iCs w:val="0"/>
+              </w:rPr>
+              <w:t xml:space="preserve"> working</w:t>
+            </w:r>
+            <w:r>
+              <w:rPr>
+                <w:rFonts w:eastAsia="Calibri" w:cs="Arial"/>
+                <w:i w:val="0"/>
+                <w:iCs w:val="0"/>
+              </w:rPr>
+              <w:t xml:space="preserve"> ~ t</w:t>
+            </w:r>
+            <w:r>
+              <w:rPr>
+                <w:rFonts w:eastAsia="Calibri" w:cs="Arial"/>
+                <w:i w:val="0"/>
+                <w:iCs w:val="0"/>
+              </w:rPr>
+              <w:t>he job is contract work so my study hours may be shifted</w:t>
+            </w:r>
+            <w:r>
+              <w:rPr>
+                <w:rFonts w:eastAsia="Calibri" w:cs="Arial"/>
+                <w:i w:val="0"/>
+                <w:iCs w:val="0"/>
+              </w:rPr>
+              <w:t xml:space="preserve"> around a bit.</w:t>
             </w:r>
           </w:p>
         </w:tc>
@@ -1125,6 +1455,7 @@
         <w:tc>
           <w:tcPr>
             <w:tcW w:w="9010" w:type="dxa"/>
+            <w:tcMar/>
           </w:tcPr>
           <w:p>
             <w:pPr>
@@ -1276,7 +1607,59 @@
           <w:p>
             <w:pPr>
               <w:pStyle w:val="paragraph"/>
-              <w:spacing w:before="0" w:beforeAutospacing="0" w:after="0" w:afterAutospacing="0"/>
+              <w:spacing w:before="0" w:beforeAutospacing="off" w:after="0" w:afterAutospacing="off"/>
+              <w:ind w:left="25"/>
+              <w:textAlignment w:val="baseline"/>
+              <w:rPr>
+                <w:rFonts w:ascii="Arial" w:hAnsi="Arial" w:cs="Arial"/>
+                <w:sz w:val="22"/>
+                <w:szCs w:val="22"/>
+                <w:lang w:val="en-US"/>
+              </w:rPr>
+            </w:pPr>
+            <w:hyperlink r:id="R25e8698221394729">
+              <w:r>
+                <w:rPr>
+                  <w:rStyle w:val="Hyperlink"/>
+                  <w:rFonts w:ascii="Arial" w:hAnsi="Arial" w:cs="Arial"/>
+                  <w:sz w:val="22"/>
+                  <w:szCs w:val="22"/>
+                  <w:lang w:val="en-US"/>
+                </w:rPr>
+                <w:t>https://github.com/BIT-Studio-3/project-26-1-red-team/issues/97</w:t>
+              </w:r>
+            </w:hyperlink>
+          </w:p>
+          <w:p>
+            <w:pPr>
+              <w:pStyle w:val="paragraph"/>
+              <w:spacing w:before="0" w:beforeAutospacing="off" w:after="0" w:afterAutospacing="off"/>
+              <w:ind w:left="25"/>
+              <w:textAlignment w:val="baseline"/>
+              <w:rPr>
+                <w:rFonts w:ascii="Arial" w:hAnsi="Arial" w:cs="Arial"/>
+                <w:sz w:val="22"/>
+                <w:szCs w:val="22"/>
+                <w:lang w:val="en-US"/>
+              </w:rPr>
+            </w:pPr>
+            <w:hyperlink r:id="R9a0671a9e66c4ef5">
+              <w:r>
+                <w:rPr>
+                  <w:rStyle w:val="Hyperlink"/>
+                  <w:rFonts w:ascii="Arial" w:hAnsi="Arial" w:cs="Arial"/>
+                  <w:sz w:val="22"/>
+                  <w:szCs w:val="22"/>
+                  <w:lang w:val="en-US"/>
+                </w:rPr>
+                <w:t>https://github.com/BIT-Studio-3/project-26-1-red-team/issues/98\</w:t>
+              </w:r>
+            </w:hyperlink>
+          </w:p>
+          <w:p>
+            <w:pPr>
+              <w:pStyle w:val="paragraph"/>
+              <w:spacing w:before="0" w:beforeAutospacing="off" w:after="0" w:afterAutospacing="off"/>
               <w:ind w:left="25"/>
               <w:textAlignment w:val="baseline"/>
               <w:rPr>
@@ -1294,12 +1677,32 @@
               <w:ind w:left="25"/>
               <w:textAlignment w:val="baseline"/>
               <w:rPr>
-                <w:rFonts w:ascii="Arial" w:hAnsi="Arial" w:cs="Arial"/>
-                <w:sz w:val="22"/>
-                <w:szCs w:val="22"/>
-                <w:lang w:val="en-US"/>
-              </w:rPr>
-            </w:pPr>
+                <w:rStyle w:val="eop"/>
+                <w:rFonts w:ascii="Arial" w:hAnsi="Arial" w:cs="Arial"/>
+                <w:sz w:val="22"/>
+                <w:szCs w:val="22"/>
+                <w:lang w:val="en-US"/>
+              </w:rPr>
+            </w:pPr>
+            <w:r>
+              <w:rPr>
+                <w:rStyle w:val="normaltextrun"/>
+                <w:rFonts w:ascii="Arial" w:hAnsi="Arial" w:cs="Arial"/>
+                <w:sz w:val="22"/>
+                <w:szCs w:val="22"/>
+              </w:rPr>
+              <w:t>Contribute in a meaningful way to coding and releasing features that meet the user requirements</w:t>
+            </w:r>
+            <w:r>
+              <w:rPr>
+                <w:rStyle w:val="eop"/>
+                <w:rFonts w:ascii="Arial" w:hAnsi="Arial" w:cs="Arial"/>
+                <w:sz w:val="22"/>
+                <w:szCs w:val="22"/>
+                <w:lang w:val="en-US"/>
+              </w:rPr>
+              <w:t> </w:t>
+            </w:r>
           </w:p>
           <w:p>
             <w:pPr>
@@ -1309,30 +1712,23 @@
               <w:textAlignment w:val="baseline"/>
               <w:rPr>
                 <w:rStyle w:val="eop"/>
-                <w:rFonts w:ascii="Arial" w:hAnsi="Arial" w:cs="Arial"/>
-                <w:sz w:val="22"/>
-                <w:szCs w:val="22"/>
-                <w:lang w:val="en-US"/>
-              </w:rPr>
-            </w:pPr>
-            <w:r>
-              <w:rPr>
-                <w:rStyle w:val="normaltextrun"/>
-                <w:rFonts w:ascii="Arial" w:hAnsi="Arial" w:cs="Arial"/>
-                <w:sz w:val="22"/>
-                <w:szCs w:val="22"/>
-              </w:rPr>
-              <w:t>Contribute in a meaningful way to coding and releasing features that meet the user requirements</w:t>
-            </w:r>
+                <w:rFonts w:ascii="Arial" w:hAnsi="Arial"/>
+                <w:i/>
+                <w:iCs/>
+                <w:sz w:val="22"/>
+                <w:lang w:val="en-US"/>
+              </w:rPr>
+            </w:pPr>
             <w:r>
               <w:rPr>
                 <w:rStyle w:val="eop"/>
-                <w:rFonts w:ascii="Arial" w:hAnsi="Arial" w:cs="Arial"/>
-                <w:sz w:val="22"/>
-                <w:szCs w:val="22"/>
-                <w:lang w:val="en-US"/>
-              </w:rPr>
-              <w:t> </w:t>
+                <w:rFonts w:ascii="Arial" w:hAnsi="Arial"/>
+                <w:i/>
+                <w:iCs/>
+                <w:sz w:val="22"/>
+                <w:lang w:val="en-US"/>
+              </w:rPr>
+              <w:t>e.g. Links to Pull Requests showing the contributions you are most proud of</w:t>
             </w:r>
           </w:p>
           <w:p>
@@ -1342,54 +1738,27 @@
               <w:ind w:left="25"/>
               <w:textAlignment w:val="baseline"/>
               <w:rPr>
-                <w:rStyle w:val="eop"/>
-                <w:rFonts w:ascii="Arial" w:hAnsi="Arial"/>
-                <w:i/>
-                <w:iCs/>
-                <w:sz w:val="22"/>
-                <w:lang w:val="en-US"/>
-              </w:rPr>
-            </w:pPr>
-            <w:r>
-              <w:rPr>
-                <w:rStyle w:val="eop"/>
-                <w:rFonts w:ascii="Arial" w:hAnsi="Arial"/>
-                <w:i/>
-                <w:iCs/>
-                <w:sz w:val="22"/>
-                <w:lang w:val="en-US"/>
-              </w:rPr>
-              <w:t>e.g. Links to Pull Requests showing the contributions you are most proud of</w:t>
-            </w:r>
+                <w:rFonts w:ascii="Arial" w:hAnsi="Arial" w:cs="Arial"/>
+                <w:sz w:val="22"/>
+                <w:szCs w:val="22"/>
+                <w:lang w:val="en-US"/>
+              </w:rPr>
+            </w:pPr>
           </w:p>
           <w:p>
             <w:pPr>
               <w:pStyle w:val="paragraph"/>
-              <w:spacing w:before="0" w:beforeAutospacing="0" w:after="0" w:afterAutospacing="0"/>
+              <w:spacing w:before="0" w:beforeAutospacing="off" w:after="0" w:afterAutospacing="off"/>
               <w:ind w:left="25"/>
               <w:textAlignment w:val="baseline"/>
               <w:rPr>
                 <w:rFonts w:ascii="Arial" w:hAnsi="Arial" w:cs="Arial"/>
                 <w:sz w:val="22"/>
                 <w:szCs w:val="22"/>
-                <w:lang w:val="en-US"/>
-              </w:rPr>
-            </w:pPr>
-          </w:p>
-          <w:p>
-            <w:pPr>
-              <w:pStyle w:val="paragraph"/>
-              <w:spacing w:before="0" w:beforeAutospacing="0" w:after="0" w:afterAutospacing="0"/>
-              <w:ind w:left="25"/>
-              <w:textAlignment w:val="baseline"/>
-              <w:rPr>
-                <w:rFonts w:ascii="Arial" w:hAnsi="Arial" w:cs="Arial"/>
-                <w:sz w:val="22"/>
-                <w:szCs w:val="22"/>
-                <w:lang w:val="en-US"/>
-              </w:rPr>
-            </w:pPr>
-            <w:hyperlink r:id="rId8" w:history="1">
+                <w:lang w:val="en-GB"/>
+              </w:rPr>
+            </w:pPr>
+            <w:hyperlink r:id="Rd6fc3a49fc8e49d1">
               <w:r>
                 <w:rPr>
                   <w:rStyle w:val="Hyperlink"/>
@@ -1398,9 +1767,48 @@
                   <w:szCs w:val="22"/>
                   <w:lang w:val="en-GB"/>
                 </w:rPr>
-                <w:t>Pull requests · BIT-Studio-3/project-26-1-red-team</w:t>
+                <w:t>https://github.com/BIT-Studio-3/project-26-1-red-team/pull/39</w:t>
               </w:r>
             </w:hyperlink>
+          </w:p>
+          <w:p>
+            <w:pPr>
+              <w:pStyle w:val="paragraph"/>
+              <w:spacing w:before="0" w:beforeAutospacing="off" w:after="0" w:afterAutospacing="off"/>
+              <w:ind w:left="25"/>
+              <w:textAlignment w:val="baseline"/>
+              <w:rPr>
+                <w:rFonts w:ascii="Arial" w:hAnsi="Arial" w:cs="Arial"/>
+                <w:sz w:val="22"/>
+                <w:szCs w:val="22"/>
+                <w:lang w:val="en-GB"/>
+              </w:rPr>
+            </w:pPr>
+            <w:hyperlink r:id="Ra9d07ce1671e4844">
+              <w:r>
+                <w:rPr>
+                  <w:rStyle w:val="Hyperlink"/>
+                  <w:rFonts w:ascii="Arial" w:hAnsi="Arial" w:cs="Arial"/>
+                  <w:sz w:val="22"/>
+                  <w:szCs w:val="22"/>
+                  <w:lang w:val="en-GB"/>
+                </w:rPr>
+                <w:t>https://github.com/BIT-Studio-3/project-26-1-red-team/pull/64</w:t>
+              </w:r>
+            </w:hyperlink>
+          </w:p>
+          <w:p>
+            <w:pPr>
+              <w:pStyle w:val="paragraph"/>
+              <w:spacing w:before="0" w:beforeAutospacing="off" w:after="0" w:afterAutospacing="off"/>
+              <w:ind w:left="25"/>
+              <w:rPr>
+                <w:rFonts w:ascii="Arial" w:hAnsi="Arial" w:cs="Arial"/>
+                <w:sz w:val="22"/>
+                <w:szCs w:val="22"/>
+                <w:lang w:val="en-GB"/>
+              </w:rPr>
+            </w:pPr>
           </w:p>
           <w:p>
             <w:pPr>
@@ -1409,12 +1817,32 @@
               <w:ind w:left="25"/>
               <w:textAlignment w:val="baseline"/>
               <w:rPr>
-                <w:rFonts w:ascii="Arial" w:hAnsi="Arial" w:cs="Arial"/>
-                <w:sz w:val="22"/>
-                <w:szCs w:val="22"/>
-                <w:lang w:val="en-US"/>
-              </w:rPr>
-            </w:pPr>
+                <w:rStyle w:val="eop"/>
+                <w:rFonts w:ascii="Arial" w:hAnsi="Arial" w:cs="Arial"/>
+                <w:sz w:val="22"/>
+                <w:szCs w:val="22"/>
+                <w:lang w:val="en-US"/>
+              </w:rPr>
+            </w:pPr>
+            <w:r>
+              <w:rPr>
+                <w:rStyle w:val="normaltextrun"/>
+                <w:rFonts w:ascii="Arial" w:hAnsi="Arial" w:cs="Arial"/>
+                <w:sz w:val="22"/>
+                <w:szCs w:val="22"/>
+              </w:rPr>
+              <w:t>Demonstrate an iterative approach to project work using Design Thinking techniques</w:t>
+            </w:r>
+            <w:r>
+              <w:rPr>
+                <w:rStyle w:val="eop"/>
+                <w:rFonts w:ascii="Arial" w:hAnsi="Arial" w:cs="Arial"/>
+                <w:sz w:val="22"/>
+                <w:szCs w:val="22"/>
+                <w:lang w:val="en-US"/>
+              </w:rPr>
+              <w:t> </w:t>
+            </w:r>
           </w:p>
           <w:p>
             <w:pPr>
@@ -1424,30 +1852,23 @@
               <w:textAlignment w:val="baseline"/>
               <w:rPr>
                 <w:rStyle w:val="eop"/>
-                <w:rFonts w:ascii="Arial" w:hAnsi="Arial" w:cs="Arial"/>
-                <w:sz w:val="22"/>
-                <w:szCs w:val="22"/>
-                <w:lang w:val="en-US"/>
-              </w:rPr>
-            </w:pPr>
-            <w:r>
-              <w:rPr>
-                <w:rStyle w:val="normaltextrun"/>
-                <w:rFonts w:ascii="Arial" w:hAnsi="Arial" w:cs="Arial"/>
-                <w:sz w:val="22"/>
-                <w:szCs w:val="22"/>
-              </w:rPr>
-              <w:t>Demonstrate an iterative approach to project work using Design Thinking techniques</w:t>
-            </w:r>
+                <w:rFonts w:ascii="Arial" w:hAnsi="Arial"/>
+                <w:i/>
+                <w:iCs/>
+                <w:sz w:val="22"/>
+                <w:lang w:val="en-US"/>
+              </w:rPr>
+            </w:pPr>
             <w:r>
               <w:rPr>
                 <w:rStyle w:val="eop"/>
-                <w:rFonts w:ascii="Arial" w:hAnsi="Arial" w:cs="Arial"/>
-                <w:sz w:val="22"/>
-                <w:szCs w:val="22"/>
-                <w:lang w:val="en-US"/>
-              </w:rPr>
-              <w:t> </w:t>
+                <w:rFonts w:ascii="Arial" w:hAnsi="Arial"/>
+                <w:i/>
+                <w:iCs/>
+                <w:sz w:val="22"/>
+                <w:lang w:val="en-US"/>
+              </w:rPr>
+              <w:t>How have you been iterative this semester? What improvements have you made?</w:t>
             </w:r>
           </w:p>
           <w:p>
@@ -1457,6 +1878,418 @@
               <w:ind w:left="25"/>
               <w:textAlignment w:val="baseline"/>
               <w:rPr>
+                <w:rFonts w:ascii="Arial" w:hAnsi="Arial" w:cs="Arial"/>
+                <w:sz w:val="22"/>
+                <w:szCs w:val="22"/>
+                <w:lang w:val="en-US"/>
+              </w:rPr>
+            </w:pPr>
+          </w:p>
+          <w:p>
+            <w:pPr>
+              <w:pStyle w:val="paragraph"/>
+              <w:spacing w:before="0" w:beforeAutospacing="off" w:after="0" w:afterAutospacing="off"/>
+              <w:ind w:left="25"/>
+              <w:textAlignment w:val="baseline"/>
+              <w:rPr>
+                <w:rFonts w:ascii="Arial" w:hAnsi="Arial" w:cs="Arial"/>
+                <w:sz w:val="22"/>
+                <w:szCs w:val="22"/>
+                <w:lang w:val="en-US"/>
+              </w:rPr>
+            </w:pPr>
+            <w:r>
+              <w:rPr>
+                <w:rFonts w:ascii="Arial" w:hAnsi="Arial" w:cs="Arial"/>
+                <w:sz w:val="22"/>
+                <w:szCs w:val="22"/>
+                <w:lang w:val="en-US"/>
+              </w:rPr>
+              <w:t>We’ve</w:t>
+            </w:r>
+            <w:r>
+              <w:rPr>
+                <w:rFonts w:ascii="Arial" w:hAnsi="Arial" w:cs="Arial"/>
+                <w:sz w:val="22"/>
+                <w:szCs w:val="22"/>
+                <w:lang w:val="en-US"/>
+              </w:rPr>
+              <w:t xml:space="preserve"> gathered information weekly (at a minimum) from the product owner and ensured we were on the right track when it came to user compatibility. </w:t>
+            </w:r>
+            <w:r>
+              <w:rPr>
+                <w:rFonts w:ascii="Arial" w:hAnsi="Arial" w:cs="Arial"/>
+                <w:sz w:val="22"/>
+                <w:szCs w:val="22"/>
+                <w:lang w:val="en-US"/>
+              </w:rPr>
+              <w:t xml:space="preserve">I made sure to ask our product owner more </w:t>
+            </w:r>
+            <w:r>
+              <w:rPr>
+                <w:rFonts w:ascii="Arial" w:hAnsi="Arial" w:cs="Arial"/>
+                <w:sz w:val="22"/>
+                <w:szCs w:val="22"/>
+                <w:lang w:val="en-US"/>
+              </w:rPr>
+              <w:t>frequently</w:t>
+            </w:r>
+            <w:r>
+              <w:rPr>
+                <w:rFonts w:ascii="Arial" w:hAnsi="Arial" w:cs="Arial"/>
+                <w:sz w:val="22"/>
+                <w:szCs w:val="22"/>
+                <w:lang w:val="en-US"/>
+              </w:rPr>
+              <w:t xml:space="preserve"> when it seemed like our progress was slowing or veering off track. </w:t>
+            </w:r>
+            <w:r>
+              <w:rPr>
+                <w:rFonts w:ascii="Arial" w:hAnsi="Arial" w:cs="Arial"/>
+                <w:sz w:val="22"/>
+                <w:szCs w:val="22"/>
+                <w:lang w:val="en-US"/>
+              </w:rPr>
+              <w:t>I’ve</w:t>
+            </w:r>
+            <w:r>
+              <w:rPr>
+                <w:rFonts w:ascii="Arial" w:hAnsi="Arial" w:cs="Arial"/>
+                <w:sz w:val="22"/>
+                <w:szCs w:val="22"/>
+                <w:lang w:val="en-US"/>
+              </w:rPr>
+              <w:t xml:space="preserve"> also included various methods to </w:t>
+            </w:r>
+            <w:r>
+              <w:rPr>
+                <w:rFonts w:ascii="Arial" w:hAnsi="Arial" w:cs="Arial"/>
+                <w:sz w:val="22"/>
+                <w:szCs w:val="22"/>
+                <w:lang w:val="en-US"/>
+              </w:rPr>
+              <w:t>accomplish</w:t>
+            </w:r>
+            <w:r>
+              <w:rPr>
+                <w:rFonts w:ascii="Arial" w:hAnsi="Arial" w:cs="Arial"/>
+                <w:sz w:val="22"/>
+                <w:szCs w:val="22"/>
+                <w:lang w:val="en-US"/>
+              </w:rPr>
+              <w:t xml:space="preserve"> </w:t>
+            </w:r>
+            <w:r>
+              <w:rPr>
+                <w:rFonts w:ascii="Arial" w:hAnsi="Arial" w:cs="Arial"/>
+                <w:sz w:val="22"/>
+                <w:szCs w:val="22"/>
+                <w:lang w:val="en-US"/>
+              </w:rPr>
+              <w:t>each</w:t>
+            </w:r>
+            <w:r>
+              <w:rPr>
+                <w:rFonts w:ascii="Arial" w:hAnsi="Arial" w:cs="Arial"/>
+                <w:sz w:val="22"/>
+                <w:szCs w:val="22"/>
+                <w:lang w:val="en-US"/>
+              </w:rPr>
+              <w:t xml:space="preserve"> </w:t>
+            </w:r>
+            <w:r>
+              <w:rPr>
+                <w:rFonts w:ascii="Arial" w:hAnsi="Arial" w:cs="Arial"/>
+                <w:sz w:val="22"/>
+                <w:szCs w:val="22"/>
+                <w:lang w:val="en-US"/>
+              </w:rPr>
+              <w:t xml:space="preserve">issue </w:t>
+            </w:r>
+            <w:r>
+              <w:rPr>
+                <w:rFonts w:ascii="Arial" w:hAnsi="Arial" w:cs="Arial"/>
+                <w:sz w:val="22"/>
+                <w:szCs w:val="22"/>
+                <w:lang w:val="en-US"/>
+              </w:rPr>
+              <w:t xml:space="preserve">raised </w:t>
+            </w:r>
+            <w:r>
+              <w:rPr>
+                <w:rFonts w:ascii="Arial" w:hAnsi="Arial" w:cs="Arial"/>
+                <w:sz w:val="22"/>
+                <w:szCs w:val="22"/>
+                <w:lang w:val="en-US"/>
+              </w:rPr>
+              <w:t>by user stories.</w:t>
+            </w:r>
+          </w:p>
+          <w:p>
+            <w:pPr>
+              <w:pStyle w:val="paragraph"/>
+              <w:spacing w:before="0" w:beforeAutospacing="off" w:after="0" w:afterAutospacing="off"/>
+              <w:ind w:left="25"/>
+              <w:rPr>
+                <w:rFonts w:ascii="Arial" w:hAnsi="Arial" w:cs="Arial"/>
+                <w:sz w:val="22"/>
+                <w:szCs w:val="22"/>
+                <w:lang w:val="en-US"/>
+              </w:rPr>
+            </w:pPr>
+          </w:p>
+          <w:p>
+            <w:pPr>
+              <w:pStyle w:val="paragraph"/>
+              <w:spacing w:before="0" w:beforeAutospacing="0" w:after="0" w:afterAutospacing="0"/>
+              <w:ind w:left="25"/>
+              <w:textAlignment w:val="baseline"/>
+              <w:rPr>
+                <w:rFonts w:ascii="Arial" w:hAnsi="Arial" w:cs="Arial"/>
+                <w:sz w:val="22"/>
+                <w:szCs w:val="22"/>
+                <w:lang w:val="en-US"/>
+              </w:rPr>
+            </w:pPr>
+          </w:p>
+          <w:p>
+            <w:pPr>
+              <w:pStyle w:val="paragraph"/>
+              <w:spacing w:before="0" w:beforeAutospacing="0" w:after="0" w:afterAutospacing="0"/>
+              <w:ind w:left="25"/>
+              <w:textAlignment w:val="baseline"/>
+              <w:rPr>
+                <w:rStyle w:val="eop"/>
+                <w:rFonts w:ascii="Arial" w:hAnsi="Arial" w:cs="Arial"/>
+                <w:sz w:val="22"/>
+                <w:szCs w:val="22"/>
+                <w:lang w:val="en-US"/>
+              </w:rPr>
+            </w:pPr>
+            <w:r>
+              <w:rPr>
+                <w:rStyle w:val="normaltextrun"/>
+                <w:rFonts w:ascii="Arial" w:hAnsi="Arial" w:cs="Arial"/>
+                <w:sz w:val="22"/>
+                <w:szCs w:val="22"/>
+              </w:rPr>
+              <w:t>Participate in code review to ensure high-quality outputs</w:t>
+            </w:r>
+            <w:r>
+              <w:rPr>
+                <w:rStyle w:val="eop"/>
+                <w:rFonts w:ascii="Arial" w:hAnsi="Arial" w:cs="Arial"/>
+                <w:sz w:val="22"/>
+                <w:szCs w:val="22"/>
+                <w:lang w:val="en-US"/>
+              </w:rPr>
+              <w:t> </w:t>
+            </w:r>
+          </w:p>
+          <w:p>
+            <w:pPr>
+              <w:pStyle w:val="paragraph"/>
+              <w:spacing w:before="0" w:beforeAutospacing="0" w:after="0" w:afterAutospacing="0"/>
+              <w:ind w:left="25"/>
+              <w:textAlignment w:val="baseline"/>
+              <w:rPr>
+                <w:rFonts w:ascii="Arial" w:hAnsi="Arial" w:cs="Arial"/>
+                <w:i/>
+                <w:iCs/>
+                <w:sz w:val="22"/>
+                <w:szCs w:val="22"/>
+                <w:lang w:val="en-US"/>
+              </w:rPr>
+            </w:pPr>
+            <w:r>
+              <w:rPr>
+                <w:rFonts w:ascii="Arial" w:hAnsi="Arial" w:cs="Arial"/>
+                <w:i/>
+                <w:iCs/>
+                <w:sz w:val="22"/>
+                <w:szCs w:val="22"/>
+                <w:lang w:val="en-US"/>
+              </w:rPr>
+              <w:t>e.g. Links to PRs where you have written constructive criticism in a code review</w:t>
+            </w:r>
+          </w:p>
+          <w:p>
+            <w:pPr>
+              <w:pStyle w:val="paragraph"/>
+              <w:spacing w:before="0" w:beforeAutospacing="0" w:after="0" w:afterAutospacing="0"/>
+              <w:ind w:left="25"/>
+              <w:textAlignment w:val="baseline"/>
+              <w:rPr>
+                <w:rFonts w:ascii="Arial" w:hAnsi="Arial" w:cs="Arial"/>
+                <w:sz w:val="22"/>
+                <w:szCs w:val="22"/>
+                <w:lang w:val="en-US"/>
+              </w:rPr>
+            </w:pPr>
+          </w:p>
+          <w:p>
+            <w:pPr>
+              <w:pStyle w:val="paragraph"/>
+              <w:spacing w:before="0" w:beforeAutospacing="off" w:after="0" w:afterAutospacing="off"/>
+              <w:ind w:left="25"/>
+              <w:textAlignment w:val="baseline"/>
+              <w:rPr>
+                <w:rStyle w:val="eop"/>
+                <w:rFonts w:ascii="Arial" w:hAnsi="Arial" w:cs="Arial"/>
+                <w:sz w:val="22"/>
+                <w:szCs w:val="22"/>
+                <w:lang w:val="en-US"/>
+              </w:rPr>
+            </w:pPr>
+            <w:hyperlink r:id="R5d5e69d8738f45a0">
+              <w:r>
+                <w:rPr>
+                  <w:rStyle w:val="Hyperlink"/>
+                  <w:rFonts w:ascii="Arial" w:hAnsi="Arial" w:cs="Arial"/>
+                  <w:sz w:val="22"/>
+                  <w:szCs w:val="22"/>
+                  <w:lang w:val="en-US"/>
+                </w:rPr>
+                <w:t>https://github.com/BIT-Studio-3/project-26-1-red-team/pull/73</w:t>
+              </w:r>
+            </w:hyperlink>
+          </w:p>
+          <w:p>
+            <w:pPr>
+              <w:pStyle w:val="paragraph"/>
+              <w:spacing w:before="0" w:beforeAutospacing="off" w:after="0" w:afterAutospacing="off"/>
+              <w:ind w:left="25"/>
+              <w:rPr>
+                <w:rStyle w:val="eop"/>
+                <w:rFonts w:ascii="Arial" w:hAnsi="Arial" w:cs="Arial"/>
+                <w:sz w:val="22"/>
+                <w:szCs w:val="22"/>
+                <w:lang w:val="en-US"/>
+              </w:rPr>
+            </w:pPr>
+            <w:hyperlink r:id="R6293f4c131c04311">
+              <w:r>
+                <w:rPr>
+                  <w:rStyle w:val="Hyperlink"/>
+                  <w:rFonts w:ascii="Arial" w:hAnsi="Arial" w:cs="Arial"/>
+                  <w:sz w:val="22"/>
+                  <w:szCs w:val="22"/>
+                  <w:lang w:val="en-US"/>
+                </w:rPr>
+                <w:t>https://github.com/BIT-Studio-3/project-26-1-red-team/pull/46</w:t>
+              </w:r>
+            </w:hyperlink>
+          </w:p>
+          <w:p>
+            <w:pPr>
+              <w:pStyle w:val="paragraph"/>
+              <w:spacing w:before="0" w:beforeAutospacing="off" w:after="0" w:afterAutospacing="off"/>
+              <w:ind w:left="25"/>
+              <w:rPr>
+                <w:rStyle w:val="eop"/>
+                <w:rFonts w:ascii="Arial" w:hAnsi="Arial" w:cs="Arial"/>
+                <w:sz w:val="22"/>
+                <w:szCs w:val="22"/>
+                <w:lang w:val="en-US"/>
+              </w:rPr>
+            </w:pPr>
+          </w:p>
+          <w:p>
+            <w:pPr>
+              <w:pStyle w:val="paragraph"/>
+              <w:spacing w:before="0" w:beforeAutospacing="off" w:after="0" w:afterAutospacing="off"/>
+              <w:ind w:left="25"/>
+              <w:textAlignment w:val="baseline"/>
+              <w:rPr>
+                <w:rFonts w:ascii="Arial" w:hAnsi="Arial" w:cs="Arial"/>
+                <w:sz w:val="22"/>
+                <w:szCs w:val="22"/>
+                <w:lang w:val="en-US"/>
+              </w:rPr>
+            </w:pPr>
+            <w:r>
+              <w:rPr>
+                <w:rFonts w:ascii="Arial" w:hAnsi="Arial" w:cs="Arial"/>
+                <w:sz w:val="22"/>
+                <w:szCs w:val="22"/>
+                <w:lang w:val="en-US"/>
+              </w:rPr>
+              <w:t>Upon reviewing my reviews, I might need to work on being more constructive in my critique rather than just praising the code.</w:t>
+            </w:r>
+          </w:p>
+          <w:p>
+            <w:pPr>
+              <w:pStyle w:val="paragraph"/>
+              <w:spacing w:before="0" w:beforeAutospacing="off" w:after="0" w:afterAutospacing="off"/>
+              <w:ind w:left="25"/>
+              <w:rPr>
+                <w:rFonts w:ascii="Arial" w:hAnsi="Arial" w:cs="Arial"/>
+                <w:sz w:val="22"/>
+                <w:szCs w:val="22"/>
+                <w:lang w:val="en-US"/>
+              </w:rPr>
+            </w:pPr>
+          </w:p>
+          <w:p>
+            <w:pPr>
+              <w:pStyle w:val="paragraph"/>
+              <w:spacing w:before="0" w:beforeAutospacing="0" w:after="0" w:afterAutospacing="0"/>
+              <w:ind w:left="25"/>
+              <w:textAlignment w:val="baseline"/>
+              <w:rPr>
+                <w:rStyle w:val="eop"/>
+                <w:rFonts w:ascii="Arial" w:hAnsi="Arial" w:cs="Arial"/>
+                <w:sz w:val="22"/>
+                <w:szCs w:val="22"/>
+                <w:lang w:val="en-US"/>
+              </w:rPr>
+            </w:pPr>
+            <w:r>
+              <w:rPr>
+                <w:rStyle w:val="normaltextrun"/>
+                <w:rFonts w:ascii="Arial" w:hAnsi="Arial" w:cs="Arial"/>
+                <w:sz w:val="22"/>
+                <w:szCs w:val="22"/>
+              </w:rPr>
+              <w:t xml:space="preserve">Communicate within a team </w:t>
+            </w:r>
+            <w:proofErr w:type="gramStart"/>
+            <w:r>
+              <w:rPr>
+                <w:rStyle w:val="normaltextrun"/>
+                <w:rFonts w:ascii="Arial" w:hAnsi="Arial" w:cs="Arial"/>
+                <w:sz w:val="22"/>
+                <w:szCs w:val="22"/>
+              </w:rPr>
+              <w:t>in order to</w:t>
+            </w:r>
+            <w:proofErr w:type="gramEnd"/>
+            <w:r>
+              <w:rPr>
+                <w:rStyle w:val="normaltextrun"/>
+                <w:rFonts w:ascii="Arial" w:hAnsi="Arial" w:cs="Arial"/>
+                <w:sz w:val="22"/>
+                <w:szCs w:val="22"/>
+              </w:rPr>
+              <w:t xml:space="preserve"> maintain sustainable productivity</w:t>
+            </w:r>
+            <w:r>
+              <w:rPr>
+                <w:rStyle w:val="eop"/>
+                <w:rFonts w:ascii="Arial" w:hAnsi="Arial" w:cs="Arial"/>
+                <w:sz w:val="22"/>
+                <w:szCs w:val="22"/>
+                <w:lang w:val="en-US"/>
+              </w:rPr>
+              <w:t> </w:t>
+            </w:r>
+          </w:p>
+          <w:p>
+            <w:pPr>
+              <w:pStyle w:val="paragraph"/>
+              <w:spacing w:before="0" w:beforeAutospacing="0" w:after="0" w:afterAutospacing="0"/>
+              <w:textAlignment w:val="baseline"/>
+              <w:rPr>
                 <w:rStyle w:val="eop"/>
                 <w:rFonts w:ascii="Arial" w:hAnsi="Arial"/>
                 <w:i/>
@@ -1474,7 +2307,7 @@
                 <w:sz w:val="22"/>
                 <w:lang w:val="en-US"/>
               </w:rPr>
-              <w:t>How have you been iterative this semester? What improvements have you made?</w:t>
+              <w:t>Have you been Agile this semester? Have you been a good team member?</w:t>
             </w:r>
           </w:p>
           <w:p>
@@ -1494,9 +2327,167 @@
           <w:p>
             <w:pPr>
               <w:pStyle w:val="paragraph"/>
-              <w:spacing w:before="0" w:beforeAutospacing="0" w:after="0" w:afterAutospacing="0"/>
+              <w:spacing w:before="0" w:beforeAutospacing="off" w:after="0" w:afterAutospacing="off"/>
               <w:ind w:left="25"/>
               <w:textAlignment w:val="baseline"/>
+              <w:rPr>
+                <w:rFonts w:ascii="Arial" w:hAnsi="Arial" w:cs="Arial"/>
+                <w:sz w:val="22"/>
+                <w:szCs w:val="22"/>
+                <w:lang w:val="en-US"/>
+              </w:rPr>
+            </w:pPr>
+            <w:r>
+              <w:rPr>
+                <w:rFonts w:ascii="Arial" w:hAnsi="Arial" w:cs="Arial"/>
+                <w:sz w:val="22"/>
+                <w:szCs w:val="22"/>
+                <w:lang w:val="en-US"/>
+              </w:rPr>
+              <w:t>During each class and occasionally outside of class, we would communicate during s</w:t>
+            </w:r>
+            <w:r>
+              <w:rPr>
+                <w:rFonts w:ascii="Arial" w:hAnsi="Arial" w:cs="Arial"/>
+                <w:sz w:val="22"/>
+                <w:szCs w:val="22"/>
+                <w:lang w:val="en-US"/>
+              </w:rPr>
+              <w:t xml:space="preserve">tand-up </w:t>
+            </w:r>
+            <w:r>
+              <w:rPr>
+                <w:rFonts w:ascii="Arial" w:hAnsi="Arial" w:cs="Arial"/>
+                <w:sz w:val="22"/>
+                <w:szCs w:val="22"/>
+                <w:lang w:val="en-US"/>
+              </w:rPr>
+              <w:t>meetings and helping each other out with various coding issues.</w:t>
+            </w:r>
+            <w:r>
+              <w:rPr>
+                <w:rFonts w:ascii="Arial" w:hAnsi="Arial" w:cs="Arial"/>
+                <w:sz w:val="22"/>
+                <w:szCs w:val="22"/>
+                <w:lang w:val="en-US"/>
+              </w:rPr>
+              <w:t xml:space="preserve"> </w:t>
+            </w:r>
+            <w:r>
+              <w:rPr>
+                <w:rFonts w:ascii="Arial" w:hAnsi="Arial" w:cs="Arial"/>
+                <w:sz w:val="22"/>
+                <w:szCs w:val="22"/>
+                <w:lang w:val="en-US"/>
+              </w:rPr>
+              <w:t>I’ve</w:t>
+            </w:r>
+            <w:r>
+              <w:rPr>
+                <w:rFonts w:ascii="Arial" w:hAnsi="Arial" w:cs="Arial"/>
+                <w:sz w:val="22"/>
+                <w:szCs w:val="22"/>
+                <w:lang w:val="en-US"/>
+              </w:rPr>
+              <w:t xml:space="preserve"> also been communicating through Teams when necessary.</w:t>
+            </w:r>
+          </w:p>
+          <w:p>
+            <w:pPr>
+              <w:pStyle w:val="paragraph"/>
+              <w:spacing w:before="0" w:beforeAutospacing="off" w:after="0" w:afterAutospacing="off"/>
+              <w:ind w:left="25"/>
+              <w:textAlignment w:val="baseline"/>
+            </w:pPr>
+            <w:r>
+              <w:drawing>
+                <wp:inline wp14:editId="40A1E14C" wp14:anchorId="67AC8A30">
+                  <wp:extent cx="5572125" cy="2571750"/>
+                  <wp:effectExtent l="0" t="0" r="0" b="0"/>
+                  <wp:docPr id="331334840" name="drawing"/>
+                  <wp:cNvGraphicFramePr>
+                    <a:graphicFrameLocks noChangeAspect="1"/>
+                  </wp:cNvGraphicFramePr>
+                  <a:graphic>
+                    <a:graphicData xmlns:a="http://schemas.openxmlformats.org/drawingml/2006/main" uri="http://schemas.openxmlformats.org/drawingml/2006/picture">
+                      <pic:pic xmlns:pic="http://schemas.openxmlformats.org/drawingml/2006/picture">
+                        <pic:nvPicPr>
+                          <pic:cNvPr id="331334840" name="Picture 331334840"/>
+                          <pic:cNvPicPr/>
+                        </pic:nvPicPr>
+                        <pic:blipFill>
+                          <a:blip xmlns:r="http://schemas.openxmlformats.org/officeDocument/2006/relationships" r:embed="rId749722260">
+                            <a:extLst>
+                              <a:ext uri="{28A0092B-C50C-407E-A947-70E740481C1C}">
+                                <a14:useLocalDpi xmlns:a14="http://schemas.microsoft.com/office/drawing/2010/main"/>
+                              </a:ext>
+                            </a:extLst>
+                          </a:blip>
+                          <a:stretch>
+                            <a:fillRect/>
+                          </a:stretch>
+                        </pic:blipFill>
+                        <pic:spPr>
+                          <a:xfrm>
+                            <a:off x="0" y="0"/>
+                            <a:ext cx="5572125" cy="2571750"/>
+                          </a:xfrm>
+                          <a:prstGeom prst="rect">
+                            <a:avLst/>
+                          </a:prstGeom>
+                        </pic:spPr>
+                      </pic:pic>
+                    </a:graphicData>
+                  </a:graphic>
+                </wp:inline>
+              </w:drawing>
+            </w:r>
+          </w:p>
+          <w:p>
+            <w:pPr>
+              <w:pStyle w:val="paragraph"/>
+              <w:spacing w:before="0" w:beforeAutospacing="off" w:after="0" w:afterAutospacing="off"/>
+              <w:ind w:left="25"/>
+              <w:rPr>
+                <w:rFonts w:ascii="Arial" w:hAnsi="Arial" w:cs="Arial"/>
+                <w:sz w:val="22"/>
+                <w:szCs w:val="22"/>
+                <w:lang w:val="en-US"/>
+              </w:rPr>
+            </w:pPr>
+            <w:r>
+              <w:rPr>
+                <w:rFonts w:ascii="Arial" w:hAnsi="Arial" w:cs="Arial"/>
+                <w:sz w:val="22"/>
+                <w:szCs w:val="22"/>
+                <w:lang w:val="en-US"/>
+              </w:rPr>
+              <w:t>I acknowledge that there was a time during the third sprint when I went off the radar for a few days due to life-stuff.</w:t>
+            </w:r>
+            <w:r>
+              <w:rPr>
+                <w:rFonts w:ascii="Arial" w:hAnsi="Arial" w:cs="Arial"/>
+                <w:sz w:val="22"/>
+                <w:szCs w:val="22"/>
+                <w:lang w:val="en-US"/>
+              </w:rPr>
+              <w:t xml:space="preserve"> Going forward, I’ll</w:t>
+            </w:r>
+            <w:r>
+              <w:rPr>
+                <w:rFonts w:ascii="Arial" w:hAnsi="Arial" w:cs="Arial"/>
+                <w:sz w:val="22"/>
+                <w:szCs w:val="22"/>
+                <w:lang w:val="en-US"/>
+              </w:rPr>
+              <w:t xml:space="preserve"> do my best to ensure that personal business doesn’t interfere with prior group commitments.</w:t>
+            </w:r>
+          </w:p>
+          <w:p>
+            <w:pPr>
+              <w:pStyle w:val="paragraph"/>
+              <w:spacing w:before="0" w:beforeAutospacing="off" w:after="0" w:afterAutospacing="off"/>
+              <w:ind w:left="25"/>
               <w:rPr>
                 <w:rFonts w:ascii="Arial" w:hAnsi="Arial" w:cs="Arial"/>
                 <w:sz w:val="22"/>
@@ -1512,12 +2503,58 @@
               <w:ind w:left="25"/>
               <w:textAlignment w:val="baseline"/>
               <w:rPr>
-                <w:rFonts w:ascii="Arial" w:hAnsi="Arial" w:cs="Arial"/>
-                <w:sz w:val="22"/>
-                <w:szCs w:val="22"/>
-                <w:lang w:val="en-US"/>
-              </w:rPr>
-            </w:pPr>
+                <w:rStyle w:val="eop"/>
+                <w:rFonts w:ascii="Arial" w:hAnsi="Arial" w:cs="Arial"/>
+                <w:sz w:val="22"/>
+                <w:szCs w:val="22"/>
+                <w:lang w:val="en-US"/>
+              </w:rPr>
+            </w:pPr>
+            <w:r>
+              <w:rPr>
+                <w:rStyle w:val="normaltextrun"/>
+                <w:rFonts w:ascii="Arial" w:hAnsi="Arial" w:cs="Arial"/>
+                <w:sz w:val="22"/>
+                <w:szCs w:val="22"/>
+              </w:rPr>
+              <w:t>Use industry-standard communication and project management tools in a professional manner</w:t>
+            </w:r>
+            <w:r>
+              <w:rPr>
+                <w:rStyle w:val="eop"/>
+                <w:rFonts w:ascii="Arial" w:hAnsi="Arial" w:cs="Arial"/>
+                <w:sz w:val="22"/>
+                <w:szCs w:val="22"/>
+                <w:lang w:val="en-US"/>
+              </w:rPr>
+              <w:t> </w:t>
+            </w:r>
+          </w:p>
+          <w:p>
+            <w:pPr>
+              <w:pStyle w:val="paragraph"/>
+              <w:spacing w:before="0" w:beforeAutospacing="0" w:after="0" w:afterAutospacing="0"/>
+              <w:textAlignment w:val="baseline"/>
+              <w:rPr>
+                <w:rStyle w:val="eop"/>
+                <w:rFonts w:ascii="Arial" w:hAnsi="Arial"/>
+                <w:i/>
+                <w:iCs/>
+                <w:sz w:val="22"/>
+                <w:lang w:val="en-US"/>
+              </w:rPr>
+            </w:pPr>
+            <w:r>
+              <w:rPr>
+                <w:rStyle w:val="eop"/>
+                <w:rFonts w:ascii="Arial" w:hAnsi="Arial"/>
+                <w:i/>
+                <w:iCs/>
+                <w:sz w:val="22"/>
+                <w:lang w:val="en-US"/>
+              </w:rPr>
+              <w:t>e.g. Have you had a strong presence on GitHub? Have you been proactive in the project?</w:t>
+            </w:r>
           </w:p>
           <w:p>
             <w:pPr>
@@ -1527,31 +2564,115 @@
               <w:textAlignment w:val="baseline"/>
               <w:rPr>
                 <w:rStyle w:val="eop"/>
-                <w:rFonts w:ascii="Arial" w:hAnsi="Arial" w:cs="Arial"/>
-                <w:sz w:val="22"/>
-                <w:szCs w:val="22"/>
-                <w:lang w:val="en-US"/>
-              </w:rPr>
-            </w:pPr>
-            <w:r>
-              <w:rPr>
-                <w:rStyle w:val="normaltextrun"/>
-                <w:rFonts w:ascii="Arial" w:hAnsi="Arial" w:cs="Arial"/>
-                <w:sz w:val="22"/>
-                <w:szCs w:val="22"/>
-              </w:rPr>
-              <w:t>Participate in code review to ensure high-quality outputs</w:t>
-            </w:r>
-            <w:r>
-              <w:rPr>
-                <w:rStyle w:val="eop"/>
-                <w:rFonts w:ascii="Arial" w:hAnsi="Arial" w:cs="Arial"/>
-                <w:sz w:val="22"/>
-                <w:szCs w:val="22"/>
-                <w:lang w:val="en-US"/>
-              </w:rPr>
-              <w:t> </w:t>
-            </w:r>
+                <w:rFonts w:ascii="Arial" w:hAnsi="Arial"/>
+                <w:sz w:val="22"/>
+                <w:lang w:val="en-US"/>
+              </w:rPr>
+            </w:pPr>
+          </w:p>
+          <w:p>
+            <w:pPr>
+              <w:pStyle w:val="paragraph"/>
+              <w:spacing w:before="0" w:beforeAutospacing="off" w:after="0" w:afterAutospacing="off"/>
+              <w:ind w:left="25"/>
+            </w:pPr>
+            <w:r>
+              <w:drawing>
+                <wp:inline wp14:editId="0E7D63FE" wp14:anchorId="7DB382C0">
+                  <wp:extent cx="5228571" cy="2600000"/>
+                  <wp:effectExtent l="0" t="0" r="0" b="0"/>
+                  <wp:docPr id="694993524" name="drawing"/>
+                  <wp:cNvGraphicFramePr>
+                    <a:graphicFrameLocks noChangeAspect="1"/>
+                  </wp:cNvGraphicFramePr>
+                  <a:graphic>
+                    <a:graphicData xmlns:a="http://schemas.openxmlformats.org/drawingml/2006/main" uri="http://schemas.openxmlformats.org/drawingml/2006/picture">
+                      <pic:pic xmlns:pic="http://schemas.openxmlformats.org/drawingml/2006/picture">
+                        <pic:nvPicPr>
+                          <pic:cNvPr id="694993524" name="Picture 694993524"/>
+                          <pic:cNvPicPr/>
+                        </pic:nvPicPr>
+                        <pic:blipFill>
+                          <a:blip xmlns:r="http://schemas.openxmlformats.org/officeDocument/2006/relationships" r:embed="rId1969938474">
+                            <a:extLst>
+                              <a:ext uri="{28A0092B-C50C-407E-A947-70E740481C1C}">
+                                <a14:useLocalDpi xmlns:a14="http://schemas.microsoft.com/office/drawing/2010/main"/>
+                              </a:ext>
+                            </a:extLst>
+                          </a:blip>
+                          <a:stretch>
+                            <a:fillRect/>
+                          </a:stretch>
+                        </pic:blipFill>
+                        <pic:spPr>
+                          <a:xfrm>
+                            <a:off x="0" y="0"/>
+                            <a:ext cx="5228571" cy="2600000"/>
+                          </a:xfrm>
+                          <a:prstGeom prst="rect">
+                            <a:avLst/>
+                          </a:prstGeom>
+                        </pic:spPr>
+                      </pic:pic>
+                    </a:graphicData>
+                  </a:graphic>
+                </wp:inline>
+              </w:drawing>
+            </w:r>
+          </w:p>
+          <w:p>
+            <w:pPr>
+              <w:pStyle w:val="paragraph"/>
+              <w:spacing w:before="0" w:beforeAutospacing="off" w:after="0" w:afterAutospacing="off"/>
+              <w:ind w:left="25"/>
+              <w:textAlignment w:val="baseline"/>
+              <w:rPr>
+                <w:rFonts w:ascii="Arial" w:hAnsi="Arial" w:cs="Arial"/>
+                <w:sz w:val="22"/>
+                <w:szCs w:val="22"/>
+                <w:lang w:val="en-US"/>
+              </w:rPr>
+            </w:pPr>
+            <w:r>
+              <w:rPr>
+                <w:rFonts w:ascii="Arial" w:hAnsi="Arial" w:cs="Arial"/>
+                <w:sz w:val="22"/>
+                <w:szCs w:val="22"/>
+                <w:lang w:val="en-US"/>
+              </w:rPr>
+              <w:t xml:space="preserve">I had a pretty strong presence early </w:t>
+            </w:r>
+            <w:r>
+              <w:rPr>
+                <w:rFonts w:ascii="Arial" w:hAnsi="Arial" w:cs="Arial"/>
+                <w:sz w:val="22"/>
+                <w:szCs w:val="22"/>
+                <w:lang w:val="en-US"/>
+              </w:rPr>
+              <w:t>on,</w:t>
+            </w:r>
+            <w:r>
+              <w:rPr>
+                <w:rFonts w:ascii="Arial" w:hAnsi="Arial" w:cs="Arial"/>
+                <w:sz w:val="22"/>
+                <w:szCs w:val="22"/>
+                <w:lang w:val="en-US"/>
+              </w:rPr>
+              <w:t xml:space="preserve"> but I will admit that I’ve been dropping off a small bit due to complications with other classes and life getting in the way.</w:t>
+            </w:r>
+          </w:p>
+          <w:p>
+            <w:pPr>
+              <w:pStyle w:val="paragraph"/>
+              <w:spacing w:before="0" w:beforeAutospacing="off" w:after="0" w:afterAutospacing="off"/>
+              <w:ind w:left="25"/>
+              <w:rPr>
+                <w:rFonts w:ascii="Arial" w:hAnsi="Arial" w:cs="Arial"/>
+                <w:sz w:val="22"/>
+                <w:szCs w:val="22"/>
+                <w:lang w:val="en-US"/>
+              </w:rPr>
+            </w:pPr>
           </w:p>
           <w:p>
             <w:pPr>
@@ -1560,24 +2681,57 @@
               <w:ind w:left="25"/>
               <w:textAlignment w:val="baseline"/>
               <w:rPr>
-                <w:rFonts w:ascii="Arial" w:hAnsi="Arial" w:cs="Arial"/>
+                <w:rStyle w:val="eop"/>
+                <w:rFonts w:ascii="Arial" w:hAnsi="Arial" w:cs="Arial"/>
+                <w:sz w:val="22"/>
+                <w:szCs w:val="22"/>
+                <w:lang w:val="en-US"/>
+              </w:rPr>
+            </w:pPr>
+            <w:r>
+              <w:rPr>
+                <w:rStyle w:val="normaltextrun"/>
+                <w:rFonts w:ascii="Arial" w:hAnsi="Arial" w:cs="Arial"/>
+                <w:sz w:val="22"/>
+                <w:szCs w:val="22"/>
+              </w:rPr>
+              <w:t>Contribute to producing safe, accessible, usable and useful software</w:t>
+            </w:r>
+            <w:r>
+              <w:rPr>
+                <w:rStyle w:val="eop"/>
+                <w:rFonts w:ascii="Arial" w:hAnsi="Arial" w:cs="Arial"/>
+                <w:sz w:val="22"/>
+                <w:szCs w:val="22"/>
+                <w:lang w:val="en-US"/>
+              </w:rPr>
+              <w:t> </w:t>
+            </w:r>
+          </w:p>
+          <w:p>
+            <w:pPr>
+              <w:pStyle w:val="paragraph"/>
+              <w:spacing w:before="0" w:beforeAutospacing="0" w:after="0" w:afterAutospacing="0"/>
+              <w:textAlignment w:val="baseline"/>
+              <w:rPr>
+                <w:rStyle w:val="eop"/>
+                <w:rFonts w:ascii="Arial" w:hAnsi="Arial"/>
                 <w:i/>
                 <w:iCs/>
                 <w:sz w:val="22"/>
-                <w:szCs w:val="22"/>
-                <w:lang w:val="en-US"/>
-              </w:rPr>
-            </w:pPr>
-            <w:r>
-              <w:rPr>
-                <w:rFonts w:ascii="Arial" w:hAnsi="Arial" w:cs="Arial"/>
+                <w:lang w:val="en-US"/>
+              </w:rPr>
+            </w:pPr>
+            <w:r>
+              <w:rPr>
+                <w:rStyle w:val="eop"/>
+                <w:rFonts w:ascii="Arial" w:hAnsi="Arial"/>
                 <w:i/>
                 <w:iCs/>
                 <w:sz w:val="22"/>
-                <w:szCs w:val="22"/>
-                <w:lang w:val="en-US"/>
-              </w:rPr>
-              <w:t>e.g. Links to PRs where you have written constructive criticism in a code review</w:t>
+                <w:lang w:val="en-US"/>
+              </w:rPr>
+              <w:t>e.g. Show evidence that you have made accessibility/privacy/security improvements or suggestions</w:t>
             </w:r>
           </w:p>
           <w:p>
@@ -1597,26 +2751,126 @@
           <w:p>
             <w:pPr>
               <w:pStyle w:val="paragraph"/>
-              <w:spacing w:before="0" w:beforeAutospacing="0" w:after="0" w:afterAutospacing="0"/>
+              <w:spacing w:before="0" w:beforeAutospacing="off" w:after="0" w:afterAutospacing="off"/>
               <w:ind w:left="25"/>
               <w:textAlignment w:val="baseline"/>
               <w:rPr>
-                <w:rStyle w:val="eop"/>
-                <w:rFonts w:ascii="Arial" w:hAnsi="Arial" w:cs="Arial"/>
-                <w:sz w:val="22"/>
-                <w:szCs w:val="22"/>
-                <w:lang w:val="en-US"/>
-              </w:rPr>
-            </w:pPr>
-            <w:r>
-              <w:rPr>
-                <w:rStyle w:val="eop"/>
-                <w:rFonts w:ascii="Arial" w:hAnsi="Arial" w:cs="Arial"/>
-                <w:sz w:val="22"/>
-                <w:szCs w:val="22"/>
-                <w:lang w:val="en-US"/>
-              </w:rPr>
-              <w:t> </w:t>
+                <w:rFonts w:ascii="Arial" w:hAnsi="Arial" w:cs="Arial"/>
+                <w:sz w:val="22"/>
+                <w:szCs w:val="22"/>
+                <w:lang w:val="en-US"/>
+              </w:rPr>
+            </w:pPr>
+            <w:r>
+              <w:rPr>
+                <w:rFonts w:ascii="Arial" w:hAnsi="Arial" w:cs="Arial"/>
+                <w:sz w:val="22"/>
+                <w:szCs w:val="22"/>
+                <w:lang w:val="en-US"/>
+              </w:rPr>
+              <w:t>I’ve</w:t>
+            </w:r>
+            <w:r>
+              <w:rPr>
+                <w:rFonts w:ascii="Arial" w:hAnsi="Arial" w:cs="Arial"/>
+                <w:sz w:val="22"/>
+                <w:szCs w:val="22"/>
+                <w:lang w:val="en-US"/>
+              </w:rPr>
+              <w:t xml:space="preserve"> added a dark mode to the site to reduce eye strain when viewing for extended periods or at night.</w:t>
+            </w:r>
+          </w:p>
+          <w:p>
+            <w:pPr>
+              <w:pStyle w:val="paragraph"/>
+              <w:spacing w:before="0" w:beforeAutospacing="off" w:after="0" w:afterAutospacing="off"/>
+              <w:ind w:left="25"/>
+            </w:pPr>
+            <w:r>
+              <w:drawing>
+                <wp:inline wp14:editId="5A4492CA" wp14:anchorId="28CA0484">
+                  <wp:extent cx="5572125" cy="2838450"/>
+                  <wp:effectExtent l="0" t="0" r="0" b="0"/>
+                  <wp:docPr id="238259084" name="drawing"/>
+                  <wp:cNvGraphicFramePr>
+                    <a:graphicFrameLocks noChangeAspect="1"/>
+                  </wp:cNvGraphicFramePr>
+                  <a:graphic>
+                    <a:graphicData xmlns:a="http://schemas.openxmlformats.org/drawingml/2006/main" uri="http://schemas.openxmlformats.org/drawingml/2006/picture">
+                      <pic:pic xmlns:pic="http://schemas.openxmlformats.org/drawingml/2006/picture">
+                        <pic:nvPicPr>
+                          <pic:cNvPr id="238259084" name="Picture 238259084"/>
+                          <pic:cNvPicPr/>
+                        </pic:nvPicPr>
+                        <pic:blipFill>
+                          <a:blip xmlns:r="http://schemas.openxmlformats.org/officeDocument/2006/relationships" r:embed="rId1370205352">
+                            <a:extLst>
+                              <a:ext uri="{28A0092B-C50C-407E-A947-70E740481C1C}">
+                                <a14:useLocalDpi xmlns:a14="http://schemas.microsoft.com/office/drawing/2010/main"/>
+                              </a:ext>
+                            </a:extLst>
+                          </a:blip>
+                          <a:stretch>
+                            <a:fillRect/>
+                          </a:stretch>
+                        </pic:blipFill>
+                        <pic:spPr>
+                          <a:xfrm>
+                            <a:off x="0" y="0"/>
+                            <a:ext cx="5572125" cy="2838450"/>
+                          </a:xfrm>
+                          <a:prstGeom prst="rect">
+                            <a:avLst/>
+                          </a:prstGeom>
+                        </pic:spPr>
+                      </pic:pic>
+                    </a:graphicData>
+                  </a:graphic>
+                </wp:inline>
+              </w:drawing>
+            </w:r>
+            <w:r>
+              <w:drawing>
+                <wp:inline wp14:editId="679FD135" wp14:anchorId="4AD3D58B">
+                  <wp:extent cx="5572125" cy="3181350"/>
+                  <wp:effectExtent l="0" t="0" r="0" b="0"/>
+                  <wp:docPr id="726063474" name="drawing"/>
+                  <wp:cNvGraphicFramePr>
+                    <a:graphicFrameLocks noChangeAspect="1"/>
+                  </wp:cNvGraphicFramePr>
+                  <a:graphic>
+                    <a:graphicData xmlns:a="http://schemas.openxmlformats.org/drawingml/2006/main" uri="http://schemas.openxmlformats.org/drawingml/2006/picture">
+                      <pic:pic xmlns:pic="http://schemas.openxmlformats.org/drawingml/2006/picture">
+                        <pic:nvPicPr>
+                          <pic:cNvPr id="726063474" name="Picture 726063474"/>
+                          <pic:cNvPicPr/>
+                        </pic:nvPicPr>
+                        <pic:blipFill>
+                          <a:blip xmlns:r="http://schemas.openxmlformats.org/officeDocument/2006/relationships" r:embed="rId772530672">
+                            <a:extLst>
+                              <a:ext uri="{28A0092B-C50C-407E-A947-70E740481C1C}">
+                                <a14:useLocalDpi xmlns:a14="http://schemas.microsoft.com/office/drawing/2010/main"/>
+                              </a:ext>
+                            </a:extLst>
+                          </a:blip>
+                          <a:stretch>
+                            <a:fillRect/>
+                          </a:stretch>
+                        </pic:blipFill>
+                        <pic:spPr>
+                          <a:xfrm>
+                            <a:off x="0" y="0"/>
+                            <a:ext cx="5572125" cy="3181350"/>
+                          </a:xfrm>
+                          <a:prstGeom prst="rect">
+                            <a:avLst/>
+                          </a:prstGeom>
+                        </pic:spPr>
+                      </pic:pic>
+                    </a:graphicData>
+                  </a:graphic>
+                </wp:inline>
+              </w:drawing>
             </w:r>
           </w:p>
           <w:p>
@@ -1654,27 +2908,7 @@
                 <w:sz w:val="22"/>
                 <w:szCs w:val="22"/>
               </w:rPr>
-              <w:t xml:space="preserve">Communicate within a team </w:t>
-            </w:r>
-            <w:proofErr w:type="gramStart"/>
-            <w:r>
-              <w:rPr>
-                <w:rStyle w:val="normaltextrun"/>
-                <w:rFonts w:ascii="Arial" w:hAnsi="Arial" w:cs="Arial"/>
-                <w:sz w:val="22"/>
-                <w:szCs w:val="22"/>
-              </w:rPr>
-              <w:t>in order to</w:t>
-            </w:r>
-            <w:proofErr w:type="gramEnd"/>
-            <w:r>
-              <w:rPr>
-                <w:rStyle w:val="normaltextrun"/>
-                <w:rFonts w:ascii="Arial" w:hAnsi="Arial" w:cs="Arial"/>
-                <w:sz w:val="22"/>
-                <w:szCs w:val="22"/>
-              </w:rPr>
-              <w:t xml:space="preserve"> maintain sustainable productivity</w:t>
+              <w:t>Employ leadership and conflict management techniques to sustain an agreed workflow</w:t>
             </w:r>
             <w:r>
               <w:rPr>
@@ -1690,37 +2924,38 @@
           <w:p>
             <w:pPr>
               <w:pStyle w:val="paragraph"/>
-              <w:spacing w:before="0" w:beforeAutospacing="0" w:after="0" w:afterAutospacing="0"/>
+              <w:spacing w:before="0" w:beforeAutospacing="off" w:after="0" w:afterAutospacing="off"/>
               <w:textAlignment w:val="baseline"/>
               <w:rPr>
-                <w:rStyle w:val="eop"/>
-                <w:rFonts w:ascii="Arial" w:hAnsi="Arial"/>
-                <w:i/>
-                <w:iCs/>
-                <w:sz w:val="22"/>
-                <w:lang w:val="en-US"/>
-              </w:rPr>
-            </w:pPr>
-            <w:r>
-              <w:rPr>
-                <w:rStyle w:val="eop"/>
-                <w:rFonts w:ascii="Arial" w:hAnsi="Arial"/>
-                <w:i/>
-                <w:iCs/>
-                <w:sz w:val="22"/>
-                <w:lang w:val="en-US"/>
-              </w:rPr>
-              <w:t>Have you been Agile this semester? Have you been a good team member?</w:t>
+                <w:rFonts w:ascii="Arial" w:hAnsi="Arial" w:cs="Arial"/>
+                <w:i w:val="1"/>
+                <w:iCs w:val="1"/>
+                <w:sz w:val="22"/>
+                <w:szCs w:val="22"/>
+                <w:lang w:val="en-US"/>
+              </w:rPr>
+            </w:pPr>
+            <w:r>
+              <w:rPr>
+                <w:rFonts w:ascii="Arial" w:hAnsi="Arial" w:cs="Arial"/>
+                <w:i w:val="1"/>
+                <w:iCs w:val="1"/>
+                <w:sz w:val="22"/>
+                <w:szCs w:val="22"/>
+                <w:lang w:val="en-US"/>
+              </w:rPr>
+              <w:t>e.g. Did you adhere to the group’s agreed processes? Did you encourage using Scrum properly?</w:t>
             </w:r>
           </w:p>
           <w:p>
             <w:pPr>
               <w:pStyle w:val="paragraph"/>
-              <w:spacing w:before="0" w:beforeAutospacing="0" w:after="0" w:afterAutospacing="0"/>
-              <w:ind w:left="25"/>
+              <w:spacing w:before="0" w:beforeAutospacing="off" w:after="0" w:afterAutospacing="off"/>
               <w:textAlignment w:val="baseline"/>
               <w:rPr>
                 <w:rFonts w:ascii="Arial" w:hAnsi="Arial" w:cs="Arial"/>
+                <w:i w:val="1"/>
+                <w:iCs w:val="1"/>
                 <w:sz w:val="22"/>
                 <w:szCs w:val="22"/>
                 <w:lang w:val="en-US"/>
@@ -1730,293 +2965,137 @@
           <w:p>
             <w:pPr>
               <w:pStyle w:val="paragraph"/>
-              <w:spacing w:before="0" w:beforeAutospacing="0" w:after="0" w:afterAutospacing="0"/>
-              <w:ind w:left="25"/>
+              <w:spacing w:before="0" w:beforeAutospacing="off" w:after="0" w:afterAutospacing="off"/>
               <w:textAlignment w:val="baseline"/>
               <w:rPr>
                 <w:rFonts w:ascii="Arial" w:hAnsi="Arial" w:cs="Arial"/>
-                <w:sz w:val="22"/>
-                <w:szCs w:val="22"/>
-                <w:lang w:val="en-US"/>
-              </w:rPr>
-            </w:pPr>
-          </w:p>
-          <w:p>
-            <w:pPr>
-              <w:pStyle w:val="paragraph"/>
-              <w:spacing w:before="0" w:beforeAutospacing="0" w:after="0" w:afterAutospacing="0"/>
-              <w:ind w:left="25"/>
-              <w:textAlignment w:val="baseline"/>
-              <w:rPr>
-                <w:rFonts w:ascii="Arial" w:hAnsi="Arial" w:cs="Arial"/>
-                <w:sz w:val="22"/>
-                <w:szCs w:val="22"/>
-                <w:lang w:val="en-US"/>
-              </w:rPr>
-            </w:pPr>
-          </w:p>
-          <w:p>
-            <w:pPr>
-              <w:pStyle w:val="paragraph"/>
-              <w:spacing w:before="0" w:beforeAutospacing="0" w:after="0" w:afterAutospacing="0"/>
-              <w:ind w:left="25"/>
-              <w:textAlignment w:val="baseline"/>
-              <w:rPr>
-                <w:rStyle w:val="eop"/>
-                <w:rFonts w:ascii="Arial" w:hAnsi="Arial" w:cs="Arial"/>
-                <w:sz w:val="22"/>
-                <w:szCs w:val="22"/>
-                <w:lang w:val="en-US"/>
-              </w:rPr>
-            </w:pPr>
-            <w:r>
-              <w:rPr>
-                <w:rStyle w:val="normaltextrun"/>
-                <w:rFonts w:ascii="Arial" w:hAnsi="Arial" w:cs="Arial"/>
-                <w:sz w:val="22"/>
-                <w:szCs w:val="22"/>
-              </w:rPr>
-              <w:t>Use industry-standard communication and project management tools in a professional manner</w:t>
-            </w:r>
-            <w:r>
-              <w:rPr>
-                <w:rStyle w:val="eop"/>
-                <w:rFonts w:ascii="Arial" w:hAnsi="Arial" w:cs="Arial"/>
-                <w:sz w:val="22"/>
-                <w:szCs w:val="22"/>
-                <w:lang w:val="en-US"/>
-              </w:rPr>
-              <w:t> </w:t>
-            </w:r>
-          </w:p>
-          <w:p>
-            <w:pPr>
-              <w:pStyle w:val="paragraph"/>
-              <w:spacing w:before="0" w:beforeAutospacing="0" w:after="0" w:afterAutospacing="0"/>
-              <w:textAlignment w:val="baseline"/>
-              <w:rPr>
-                <w:rStyle w:val="eop"/>
-                <w:rFonts w:ascii="Arial" w:hAnsi="Arial"/>
-                <w:i/>
-                <w:iCs/>
-                <w:sz w:val="22"/>
-                <w:lang w:val="en-US"/>
-              </w:rPr>
-            </w:pPr>
-            <w:r>
-              <w:rPr>
-                <w:rStyle w:val="eop"/>
-                <w:rFonts w:ascii="Arial" w:hAnsi="Arial"/>
-                <w:i/>
-                <w:iCs/>
-                <w:sz w:val="22"/>
-                <w:lang w:val="en-US"/>
-              </w:rPr>
-              <w:t>e.g. Have you had a strong presence on GitHub? Have you been proactive in the project?</w:t>
-            </w:r>
-          </w:p>
-          <w:p>
-            <w:pPr>
-              <w:pStyle w:val="paragraph"/>
-              <w:spacing w:before="0" w:beforeAutospacing="0" w:after="0" w:afterAutospacing="0"/>
-              <w:ind w:left="25"/>
-              <w:textAlignment w:val="baseline"/>
-              <w:rPr>
-                <w:rStyle w:val="eop"/>
-                <w:rFonts w:ascii="Arial" w:hAnsi="Arial"/>
-                <w:sz w:val="22"/>
-                <w:lang w:val="en-US"/>
-              </w:rPr>
-            </w:pPr>
-          </w:p>
-          <w:p>
-            <w:pPr>
-              <w:pStyle w:val="paragraph"/>
-              <w:spacing w:before="0" w:beforeAutospacing="0" w:after="0" w:afterAutospacing="0"/>
-              <w:ind w:left="25"/>
-              <w:textAlignment w:val="baseline"/>
-              <w:rPr>
-                <w:rStyle w:val="eop"/>
-                <w:rFonts w:ascii="Arial" w:hAnsi="Arial"/>
-                <w:sz w:val="22"/>
-                <w:lang w:val="en-US"/>
-              </w:rPr>
-            </w:pPr>
-          </w:p>
-          <w:p>
-            <w:pPr>
-              <w:pStyle w:val="paragraph"/>
-              <w:spacing w:before="0" w:beforeAutospacing="0" w:after="0" w:afterAutospacing="0"/>
-              <w:ind w:left="25"/>
-              <w:textAlignment w:val="baseline"/>
-              <w:rPr>
-                <w:rFonts w:ascii="Arial" w:hAnsi="Arial" w:cs="Arial"/>
-                <w:sz w:val="22"/>
-                <w:szCs w:val="22"/>
-                <w:lang w:val="en-US"/>
-              </w:rPr>
-            </w:pPr>
-          </w:p>
-          <w:p>
-            <w:pPr>
-              <w:pStyle w:val="paragraph"/>
-              <w:spacing w:before="0" w:beforeAutospacing="0" w:after="0" w:afterAutospacing="0"/>
-              <w:ind w:left="25"/>
-              <w:textAlignment w:val="baseline"/>
-              <w:rPr>
-                <w:rStyle w:val="eop"/>
-                <w:rFonts w:ascii="Arial" w:hAnsi="Arial" w:cs="Arial"/>
-                <w:sz w:val="22"/>
-                <w:szCs w:val="22"/>
-                <w:lang w:val="en-US"/>
-              </w:rPr>
-            </w:pPr>
-            <w:r>
-              <w:rPr>
-                <w:rStyle w:val="normaltextrun"/>
-                <w:rFonts w:ascii="Arial" w:hAnsi="Arial" w:cs="Arial"/>
-                <w:sz w:val="22"/>
-                <w:szCs w:val="22"/>
-              </w:rPr>
-              <w:t>Contribute to producing safe, accessible, usable and useful software</w:t>
-            </w:r>
-            <w:r>
-              <w:rPr>
-                <w:rStyle w:val="eop"/>
-                <w:rFonts w:ascii="Arial" w:hAnsi="Arial" w:cs="Arial"/>
-                <w:sz w:val="22"/>
-                <w:szCs w:val="22"/>
-                <w:lang w:val="en-US"/>
-              </w:rPr>
-              <w:t> </w:t>
-            </w:r>
-          </w:p>
-          <w:p>
-            <w:pPr>
-              <w:pStyle w:val="paragraph"/>
-              <w:spacing w:before="0" w:beforeAutospacing="0" w:after="0" w:afterAutospacing="0"/>
-              <w:textAlignment w:val="baseline"/>
-              <w:rPr>
-                <w:rStyle w:val="eop"/>
-                <w:rFonts w:ascii="Arial" w:hAnsi="Arial"/>
-                <w:i/>
-                <w:iCs/>
-                <w:sz w:val="22"/>
-                <w:lang w:val="en-US"/>
-              </w:rPr>
-            </w:pPr>
-            <w:r>
-              <w:rPr>
-                <w:rStyle w:val="eop"/>
-                <w:rFonts w:ascii="Arial" w:hAnsi="Arial"/>
-                <w:i/>
-                <w:iCs/>
-                <w:sz w:val="22"/>
-                <w:lang w:val="en-US"/>
-              </w:rPr>
-              <w:t>e.g. Show evidence that you have made accessibility/privacy/security improvements or suggestions</w:t>
-            </w:r>
-          </w:p>
-          <w:p>
-            <w:pPr>
-              <w:pStyle w:val="paragraph"/>
-              <w:spacing w:before="0" w:beforeAutospacing="0" w:after="0" w:afterAutospacing="0"/>
-              <w:ind w:left="25"/>
-              <w:textAlignment w:val="baseline"/>
-              <w:rPr>
-                <w:rFonts w:ascii="Arial" w:hAnsi="Arial" w:cs="Arial"/>
-                <w:sz w:val="22"/>
-                <w:szCs w:val="22"/>
-                <w:lang w:val="en-US"/>
-              </w:rPr>
-            </w:pPr>
-          </w:p>
-          <w:p>
-            <w:pPr>
-              <w:pStyle w:val="paragraph"/>
-              <w:spacing w:before="0" w:beforeAutospacing="0" w:after="0" w:afterAutospacing="0"/>
-              <w:ind w:left="25"/>
-              <w:textAlignment w:val="baseline"/>
-              <w:rPr>
-                <w:rFonts w:ascii="Arial" w:hAnsi="Arial" w:cs="Arial"/>
-                <w:sz w:val="22"/>
-                <w:szCs w:val="22"/>
-                <w:lang w:val="en-US"/>
-              </w:rPr>
-            </w:pPr>
-          </w:p>
-          <w:p>
-            <w:pPr>
-              <w:pStyle w:val="paragraph"/>
-              <w:spacing w:before="0" w:beforeAutospacing="0" w:after="0" w:afterAutospacing="0"/>
-              <w:ind w:left="25"/>
-              <w:textAlignment w:val="baseline"/>
-              <w:rPr>
-                <w:rFonts w:ascii="Arial" w:hAnsi="Arial" w:cs="Arial"/>
-                <w:sz w:val="22"/>
-                <w:szCs w:val="22"/>
-                <w:lang w:val="en-US"/>
-              </w:rPr>
-            </w:pPr>
-          </w:p>
-          <w:p>
-            <w:pPr>
-              <w:pStyle w:val="paragraph"/>
-              <w:spacing w:before="0" w:beforeAutospacing="0" w:after="0" w:afterAutospacing="0"/>
-              <w:ind w:left="25"/>
-              <w:textAlignment w:val="baseline"/>
-              <w:rPr>
-                <w:rStyle w:val="eop"/>
-                <w:rFonts w:ascii="Arial" w:hAnsi="Arial" w:cs="Arial"/>
-                <w:sz w:val="22"/>
-                <w:szCs w:val="22"/>
-                <w:lang w:val="en-US"/>
-              </w:rPr>
-            </w:pPr>
-            <w:r>
-              <w:rPr>
-                <w:rStyle w:val="normaltextrun"/>
-                <w:rFonts w:ascii="Arial" w:hAnsi="Arial" w:cs="Arial"/>
-                <w:sz w:val="22"/>
-                <w:szCs w:val="22"/>
-              </w:rPr>
-              <w:t>Employ leadership and conflict management techniques to sustain an agreed workflow</w:t>
-            </w:r>
-            <w:r>
-              <w:rPr>
-                <w:rStyle w:val="eop"/>
-                <w:rFonts w:ascii="Arial" w:hAnsi="Arial" w:cs="Arial"/>
-                <w:sz w:val="22"/>
-                <w:szCs w:val="22"/>
-                <w:lang w:val="en-US"/>
-              </w:rPr>
-              <w:t> </w:t>
-            </w:r>
-          </w:p>
-          <w:p>
-            <w:pPr>
-              <w:pStyle w:val="paragraph"/>
-              <w:spacing w:before="0" w:beforeAutospacing="0" w:after="0" w:afterAutospacing="0"/>
-              <w:textAlignment w:val="baseline"/>
-              <w:rPr>
-                <w:rFonts w:ascii="Arial" w:hAnsi="Arial" w:cs="Arial"/>
-                <w:i/>
-                <w:iCs/>
-                <w:sz w:val="22"/>
-                <w:szCs w:val="22"/>
-                <w:lang w:val="en-US"/>
-              </w:rPr>
-            </w:pPr>
-            <w:r>
-              <w:rPr>
-                <w:rFonts w:ascii="Arial" w:hAnsi="Arial" w:cs="Arial"/>
-                <w:i/>
-                <w:iCs/>
-                <w:sz w:val="22"/>
-                <w:szCs w:val="22"/>
-                <w:lang w:val="en-US"/>
-              </w:rPr>
-              <w:t>e.g. Did you adhere to the group’s agreed processes? Did you encourage using Scrum properly?</w:t>
+                <w:i w:val="0"/>
+                <w:iCs w:val="0"/>
+                <w:sz w:val="22"/>
+                <w:szCs w:val="22"/>
+                <w:lang w:val="en-US"/>
+              </w:rPr>
+            </w:pPr>
+            <w:r>
+              <w:rPr>
+                <w:rFonts w:ascii="Arial" w:hAnsi="Arial" w:cs="Arial"/>
+                <w:i w:val="0"/>
+                <w:iCs w:val="0"/>
+                <w:sz w:val="22"/>
+                <w:szCs w:val="22"/>
+                <w:lang w:val="en-US"/>
+              </w:rPr>
+              <w:t xml:space="preserve">I </w:t>
+            </w:r>
+            <w:r>
+              <w:rPr>
+                <w:rFonts w:ascii="Arial" w:hAnsi="Arial" w:cs="Arial"/>
+                <w:i w:val="0"/>
+                <w:iCs w:val="0"/>
+                <w:sz w:val="22"/>
+                <w:szCs w:val="22"/>
+                <w:lang w:val="en-US"/>
+              </w:rPr>
+              <w:t>haven’t</w:t>
+            </w:r>
+            <w:r>
+              <w:rPr>
+                <w:rFonts w:ascii="Arial" w:hAnsi="Arial" w:cs="Arial"/>
+                <w:i w:val="0"/>
+                <w:iCs w:val="0"/>
+                <w:sz w:val="22"/>
+                <w:szCs w:val="22"/>
+                <w:lang w:val="en-US"/>
+              </w:rPr>
+              <w:t xml:space="preserve"> had the chance to be a scum </w:t>
+            </w:r>
+            <w:r>
+              <w:rPr>
+                <w:rFonts w:ascii="Arial" w:hAnsi="Arial" w:cs="Arial"/>
+                <w:i w:val="0"/>
+                <w:iCs w:val="0"/>
+                <w:sz w:val="22"/>
+                <w:szCs w:val="22"/>
+                <w:lang w:val="en-US"/>
+              </w:rPr>
+              <w:t>leader,</w:t>
+            </w:r>
+            <w:r>
+              <w:rPr>
+                <w:rFonts w:ascii="Arial" w:hAnsi="Arial" w:cs="Arial"/>
+                <w:i w:val="0"/>
+                <w:iCs w:val="0"/>
+                <w:sz w:val="22"/>
+                <w:szCs w:val="22"/>
+                <w:lang w:val="en-US"/>
+              </w:rPr>
+              <w:t xml:space="preserve"> but </w:t>
+            </w:r>
+            <w:r>
+              <w:rPr>
+                <w:rFonts w:ascii="Arial" w:hAnsi="Arial" w:cs="Arial"/>
+                <w:i w:val="0"/>
+                <w:iCs w:val="0"/>
+                <w:sz w:val="22"/>
+                <w:szCs w:val="22"/>
+                <w:lang w:val="en-US"/>
+              </w:rPr>
+              <w:t>I’ve</w:t>
+            </w:r>
+            <w:r>
+              <w:rPr>
+                <w:rFonts w:ascii="Arial" w:hAnsi="Arial" w:cs="Arial"/>
+                <w:i w:val="0"/>
+                <w:iCs w:val="0"/>
+                <w:sz w:val="22"/>
+                <w:szCs w:val="22"/>
+                <w:lang w:val="en-US"/>
+              </w:rPr>
+              <w:t xml:space="preserve"> pushed the team occasionally to speak with our product manager and to progress through team meetings. </w:t>
+            </w:r>
+            <w:r>
+              <w:rPr>
+                <w:rFonts w:ascii="Arial" w:hAnsi="Arial" w:cs="Arial"/>
+                <w:i w:val="0"/>
+                <w:iCs w:val="0"/>
+                <w:sz w:val="22"/>
+                <w:szCs w:val="22"/>
+                <w:lang w:val="en-US"/>
+              </w:rPr>
+              <w:t>I’ve</w:t>
+            </w:r>
+            <w:r>
+              <w:rPr>
+                <w:rFonts w:ascii="Arial" w:hAnsi="Arial" w:cs="Arial"/>
+                <w:i w:val="0"/>
+                <w:iCs w:val="0"/>
+                <w:sz w:val="22"/>
+                <w:szCs w:val="22"/>
+                <w:lang w:val="en-US"/>
+              </w:rPr>
+              <w:t xml:space="preserve"> also </w:t>
+            </w:r>
+            <w:r>
+              <w:rPr>
+                <w:rFonts w:ascii="Arial" w:hAnsi="Arial" w:cs="Arial"/>
+                <w:i w:val="0"/>
+                <w:iCs w:val="0"/>
+                <w:sz w:val="22"/>
+                <w:szCs w:val="22"/>
+                <w:lang w:val="en-US"/>
+              </w:rPr>
+              <w:t>requested</w:t>
+            </w:r>
+            <w:r>
+              <w:rPr>
+                <w:rFonts w:ascii="Arial" w:hAnsi="Arial" w:cs="Arial"/>
+                <w:i w:val="0"/>
+                <w:iCs w:val="0"/>
+                <w:sz w:val="22"/>
+                <w:szCs w:val="22"/>
+                <w:lang w:val="en-US"/>
+              </w:rPr>
+              <w:t xml:space="preserve"> that the team meet outside of our typical meeting times in class.</w:t>
             </w:r>
           </w:p>
         </w:tc>
@@ -2024,7 +3103,7 @@
     </w:tbl>
     <w:p/>
     <w:sectPr>
-      <w:pgSz w:w="11900" w:h="16840"/>
+      <w:pgSz w:w="11900" w:h="16840" w:orient="portrait"/>
       <w:pgMar w:top="1440" w:right="1080" w:bottom="1440" w:left="1080" w:header="708" w:footer="708" w:gutter="0"/>
       <w:cols w:space="708"/>
       <w:docGrid w:linePitch="360"/>
@@ -2064,7 +3143,7 @@
         <w:ind w:left="1440" w:hanging="360"/>
       </w:pPr>
       <w:rPr>
-        <w:rFonts w:ascii="Symbol" w:hAnsi="Symbol" w:hint="default"/>
+        <w:rFonts w:hint="default" w:ascii="Symbol" w:hAnsi="Symbol"/>
         <w:sz w:val="20"/>
       </w:rPr>
     </w:lvl>
@@ -2080,7 +3159,7 @@
         <w:ind w:left="2160" w:hanging="360"/>
       </w:pPr>
       <w:rPr>
-        <w:rFonts w:ascii="Symbol" w:hAnsi="Symbol" w:hint="default"/>
+        <w:rFonts w:hint="default" w:ascii="Symbol" w:hAnsi="Symbol"/>
         <w:sz w:val="20"/>
       </w:rPr>
     </w:lvl>
@@ -2096,7 +3175,7 @@
         <w:ind w:left="2880" w:hanging="360"/>
       </w:pPr>
       <w:rPr>
-        <w:rFonts w:ascii="Symbol" w:hAnsi="Symbol" w:hint="default"/>
+        <w:rFonts w:hint="default" w:ascii="Symbol" w:hAnsi="Symbol"/>
         <w:sz w:val="20"/>
       </w:rPr>
     </w:lvl>
@@ -2112,7 +3191,7 @@
         <w:ind w:left="3600" w:hanging="360"/>
       </w:pPr>
       <w:rPr>
-        <w:rFonts w:ascii="Symbol" w:hAnsi="Symbol" w:hint="default"/>
+        <w:rFonts w:hint="default" w:ascii="Symbol" w:hAnsi="Symbol"/>
         <w:sz w:val="20"/>
       </w:rPr>
     </w:lvl>
@@ -2128,7 +3207,7 @@
         <w:ind w:left="4320" w:hanging="360"/>
       </w:pPr>
       <w:rPr>
-        <w:rFonts w:ascii="Symbol" w:hAnsi="Symbol" w:hint="default"/>
+        <w:rFonts w:hint="default" w:ascii="Symbol" w:hAnsi="Symbol"/>
         <w:sz w:val="20"/>
       </w:rPr>
     </w:lvl>
@@ -2144,7 +3223,7 @@
         <w:ind w:left="5040" w:hanging="360"/>
       </w:pPr>
       <w:rPr>
-        <w:rFonts w:ascii="Symbol" w:hAnsi="Symbol" w:hint="default"/>
+        <w:rFonts w:hint="default" w:ascii="Symbol" w:hAnsi="Symbol"/>
         <w:sz w:val="20"/>
       </w:rPr>
     </w:lvl>
@@ -2160,7 +3239,7 @@
         <w:ind w:left="5760" w:hanging="360"/>
       </w:pPr>
       <w:rPr>
-        <w:rFonts w:ascii="Symbol" w:hAnsi="Symbol" w:hint="default"/>
+        <w:rFonts w:hint="default" w:ascii="Symbol" w:hAnsi="Symbol"/>
         <w:sz w:val="20"/>
       </w:rPr>
     </w:lvl>
@@ -2176,7 +3255,7 @@
         <w:ind w:left="6480" w:hanging="360"/>
       </w:pPr>
       <w:rPr>
-        <w:rFonts w:ascii="Symbol" w:hAnsi="Symbol" w:hint="default"/>
+        <w:rFonts w:hint="default" w:ascii="Symbol" w:hAnsi="Symbol"/>
         <w:sz w:val="20"/>
       </w:rPr>
     </w:lvl>
@@ -2323,7 +3402,7 @@
         <w:ind w:left="1440" w:hanging="360"/>
       </w:pPr>
       <w:rPr>
-        <w:rFonts w:ascii="Symbol" w:hAnsi="Symbol" w:hint="default"/>
+        <w:rFonts w:hint="default" w:ascii="Symbol" w:hAnsi="Symbol"/>
         <w:sz w:val="20"/>
       </w:rPr>
     </w:lvl>
@@ -2339,7 +3418,7 @@
         <w:ind w:left="2160" w:hanging="360"/>
       </w:pPr>
       <w:rPr>
-        <w:rFonts w:ascii="Symbol" w:hAnsi="Symbol" w:hint="default"/>
+        <w:rFonts w:hint="default" w:ascii="Symbol" w:hAnsi="Symbol"/>
         <w:sz w:val="20"/>
       </w:rPr>
     </w:lvl>
@@ -2355,7 +3434,7 @@
         <w:ind w:left="2880" w:hanging="360"/>
       </w:pPr>
       <w:rPr>
-        <w:rFonts w:ascii="Symbol" w:hAnsi="Symbol" w:hint="default"/>
+        <w:rFonts w:hint="default" w:ascii="Symbol" w:hAnsi="Symbol"/>
         <w:sz w:val="20"/>
       </w:rPr>
     </w:lvl>
@@ -2371,7 +3450,7 @@
         <w:ind w:left="3600" w:hanging="360"/>
       </w:pPr>
       <w:rPr>
-        <w:rFonts w:ascii="Symbol" w:hAnsi="Symbol" w:hint="default"/>
+        <w:rFonts w:hint="default" w:ascii="Symbol" w:hAnsi="Symbol"/>
         <w:sz w:val="20"/>
       </w:rPr>
     </w:lvl>
@@ -2387,7 +3466,7 @@
         <w:ind w:left="4320" w:hanging="360"/>
       </w:pPr>
       <w:rPr>
-        <w:rFonts w:ascii="Symbol" w:hAnsi="Symbol" w:hint="default"/>
+        <w:rFonts w:hint="default" w:ascii="Symbol" w:hAnsi="Symbol"/>
         <w:sz w:val="20"/>
       </w:rPr>
     </w:lvl>
@@ -2403,7 +3482,7 @@
         <w:ind w:left="5040" w:hanging="360"/>
       </w:pPr>
       <w:rPr>
-        <w:rFonts w:ascii="Symbol" w:hAnsi="Symbol" w:hint="default"/>
+        <w:rFonts w:hint="default" w:ascii="Symbol" w:hAnsi="Symbol"/>
         <w:sz w:val="20"/>
       </w:rPr>
     </w:lvl>
@@ -2419,7 +3498,7 @@
         <w:ind w:left="5760" w:hanging="360"/>
       </w:pPr>
       <w:rPr>
-        <w:rFonts w:ascii="Symbol" w:hAnsi="Symbol" w:hint="default"/>
+        <w:rFonts w:hint="default" w:ascii="Symbol" w:hAnsi="Symbol"/>
         <w:sz w:val="20"/>
       </w:rPr>
     </w:lvl>
@@ -2435,7 +3514,7 @@
         <w:ind w:left="6480" w:hanging="360"/>
       </w:pPr>
       <w:rPr>
-        <w:rFonts w:ascii="Symbol" w:hAnsi="Symbol" w:hint="default"/>
+        <w:rFonts w:hint="default" w:ascii="Symbol" w:hAnsi="Symbol"/>
         <w:sz w:val="20"/>
       </w:rPr>
     </w:lvl>
@@ -2576,7 +3655,7 @@
         <w:ind w:left="360" w:hanging="360"/>
       </w:pPr>
       <w:rPr>
-        <w:rFonts w:ascii="Arial" w:hAnsi="Arial" w:cs="Arial" w:hint="default"/>
+        <w:rFonts w:hint="default" w:ascii="Arial" w:hAnsi="Arial" w:cs="Arial"/>
       </w:rPr>
     </w:lvl>
     <w:lvl w:ilvl="2">
@@ -2589,7 +3668,7 @@
         <w:ind w:left="720" w:hanging="720"/>
       </w:pPr>
       <w:rPr>
-        <w:rFonts w:ascii="Arial" w:hAnsi="Arial" w:cs="Arial" w:hint="default"/>
+        <w:rFonts w:hint="default" w:ascii="Arial" w:hAnsi="Arial" w:cs="Arial"/>
       </w:rPr>
     </w:lvl>
     <w:lvl w:ilvl="3">
@@ -2602,7 +3681,7 @@
         <w:ind w:left="720" w:hanging="720"/>
       </w:pPr>
       <w:rPr>
-        <w:rFonts w:ascii="Arial" w:hAnsi="Arial" w:cs="Arial" w:hint="default"/>
+        <w:rFonts w:hint="default" w:ascii="Arial" w:hAnsi="Arial" w:cs="Arial"/>
       </w:rPr>
     </w:lvl>
     <w:lvl w:ilvl="4">
@@ -2615,7 +3694,7 @@
         <w:ind w:left="1080" w:hanging="1080"/>
       </w:pPr>
       <w:rPr>
-        <w:rFonts w:ascii="Arial" w:hAnsi="Arial" w:cs="Arial" w:hint="default"/>
+        <w:rFonts w:hint="default" w:ascii="Arial" w:hAnsi="Arial" w:cs="Arial"/>
       </w:rPr>
     </w:lvl>
     <w:lvl w:ilvl="5">
@@ -2628,7 +3707,7 @@
         <w:ind w:left="1080" w:hanging="1080"/>
       </w:pPr>
       <w:rPr>
-        <w:rFonts w:ascii="Arial" w:hAnsi="Arial" w:cs="Arial" w:hint="default"/>
+        <w:rFonts w:hint="default" w:ascii="Arial" w:hAnsi="Arial" w:cs="Arial"/>
       </w:rPr>
     </w:lvl>
     <w:lvl w:ilvl="6">
@@ -2641,7 +3720,7 @@
         <w:ind w:left="1440" w:hanging="1440"/>
       </w:pPr>
       <w:rPr>
-        <w:rFonts w:ascii="Arial" w:hAnsi="Arial" w:cs="Arial" w:hint="default"/>
+        <w:rFonts w:hint="default" w:ascii="Arial" w:hAnsi="Arial" w:cs="Arial"/>
       </w:rPr>
     </w:lvl>
     <w:lvl w:ilvl="7">
@@ -2654,7 +3733,7 @@
         <w:ind w:left="1440" w:hanging="1440"/>
       </w:pPr>
       <w:rPr>
-        <w:rFonts w:ascii="Arial" w:hAnsi="Arial" w:cs="Arial" w:hint="default"/>
+        <w:rFonts w:hint="default" w:ascii="Arial" w:hAnsi="Arial" w:cs="Arial"/>
       </w:rPr>
     </w:lvl>
     <w:lvl w:ilvl="8">
@@ -2667,7 +3746,7 @@
         <w:ind w:left="1800" w:hanging="1800"/>
       </w:pPr>
       <w:rPr>
-        <w:rFonts w:ascii="Arial" w:hAnsi="Arial" w:cs="Arial" w:hint="default"/>
+        <w:rFonts w:hint="default" w:ascii="Arial" w:hAnsi="Arial" w:cs="Arial"/>
       </w:rPr>
     </w:lvl>
   </w:abstractNum>
@@ -2694,7 +3773,7 @@
   <w:docDefaults>
     <w:rPrDefault>
       <w:rPr>
-        <w:rFonts w:asciiTheme="minorHAnsi" w:eastAsiaTheme="minorHAnsi" w:hAnsiTheme="minorHAnsi" w:cstheme="minorBidi"/>
+        <w:rFonts w:asciiTheme="minorHAnsi" w:hAnsiTheme="minorHAnsi" w:eastAsiaTheme="minorHAnsi" w:cstheme="minorBidi"/>
         <w:sz w:val="24"/>
         <w:szCs w:val="24"/>
         <w:lang w:val="en-NZ" w:eastAsia="en-US" w:bidi="ar-SA"/>
@@ -2705,14 +3784,14 @@
   <w:latentStyles w:defLockedState="0" w:defUIPriority="99" w:defSemiHidden="0" w:defUnhideWhenUsed="0" w:defQFormat="0" w:count="376">
     <w:lsdException w:name="Normal" w:uiPriority="0" w:qFormat="1"/>
     <w:lsdException w:name="heading 1" w:uiPriority="9" w:qFormat="1"/>
-    <w:lsdException w:name="heading 2" w:semiHidden="1" w:uiPriority="9" w:unhideWhenUsed="1" w:qFormat="1"/>
-    <w:lsdException w:name="heading 3" w:semiHidden="1" w:uiPriority="9" w:unhideWhenUsed="1" w:qFormat="1"/>
-    <w:lsdException w:name="heading 4" w:semiHidden="1" w:uiPriority="9" w:unhideWhenUsed="1" w:qFormat="1"/>
-    <w:lsdException w:name="heading 5" w:semiHidden="1" w:uiPriority="9" w:unhideWhenUsed="1" w:qFormat="1"/>
-    <w:lsdException w:name="heading 6" w:semiHidden="1" w:uiPriority="9" w:unhideWhenUsed="1" w:qFormat="1"/>
-    <w:lsdException w:name="heading 7" w:semiHidden="1" w:uiPriority="9" w:unhideWhenUsed="1" w:qFormat="1"/>
-    <w:lsdException w:name="heading 8" w:semiHidden="1" w:uiPriority="9" w:unhideWhenUsed="1" w:qFormat="1"/>
-    <w:lsdException w:name="heading 9" w:semiHidden="1" w:uiPriority="9" w:unhideWhenUsed="1" w:qFormat="1"/>
+    <w:lsdException w:name="heading 2" w:uiPriority="9" w:semiHidden="1" w:unhideWhenUsed="1" w:qFormat="1"/>
+    <w:lsdException w:name="heading 3" w:uiPriority="9" w:semiHidden="1" w:unhideWhenUsed="1" w:qFormat="1"/>
+    <w:lsdException w:name="heading 4" w:uiPriority="9" w:semiHidden="1" w:unhideWhenUsed="1" w:qFormat="1"/>
+    <w:lsdException w:name="heading 5" w:uiPriority="9" w:semiHidden="1" w:unhideWhenUsed="1" w:qFormat="1"/>
+    <w:lsdException w:name="heading 6" w:uiPriority="9" w:semiHidden="1" w:unhideWhenUsed="1" w:qFormat="1"/>
+    <w:lsdException w:name="heading 7" w:uiPriority="9" w:semiHidden="1" w:unhideWhenUsed="1" w:qFormat="1"/>
+    <w:lsdException w:name="heading 8" w:uiPriority="9" w:semiHidden="1" w:unhideWhenUsed="1" w:qFormat="1"/>
+    <w:lsdException w:name="heading 9" w:uiPriority="9" w:semiHidden="1" w:unhideWhenUsed="1" w:qFormat="1"/>
     <w:lsdException w:name="index 1" w:semiHidden="1" w:unhideWhenUsed="1"/>
     <w:lsdException w:name="index 2" w:semiHidden="1" w:unhideWhenUsed="1"/>
     <w:lsdException w:name="index 3" w:semiHidden="1" w:unhideWhenUsed="1"/>
@@ -2722,22 +3801,22 @@
     <w:lsdException w:name="index 7" w:semiHidden="1" w:unhideWhenUsed="1"/>
     <w:lsdException w:name="index 8" w:semiHidden="1" w:unhideWhenUsed="1"/>
     <w:lsdException w:name="index 9" w:semiHidden="1" w:unhideWhenUsed="1"/>
-    <w:lsdException w:name="toc 1" w:semiHidden="1" w:uiPriority="39" w:unhideWhenUsed="1"/>
-    <w:lsdException w:name="toc 2" w:semiHidden="1" w:uiPriority="39" w:unhideWhenUsed="1"/>
-    <w:lsdException w:name="toc 3" w:semiHidden="1" w:uiPriority="39" w:unhideWhenUsed="1"/>
-    <w:lsdException w:name="toc 4" w:semiHidden="1" w:uiPriority="39" w:unhideWhenUsed="1"/>
-    <w:lsdException w:name="toc 5" w:semiHidden="1" w:uiPriority="39" w:unhideWhenUsed="1"/>
-    <w:lsdException w:name="toc 6" w:semiHidden="1" w:uiPriority="39" w:unhideWhenUsed="1"/>
-    <w:lsdException w:name="toc 7" w:semiHidden="1" w:uiPriority="39" w:unhideWhenUsed="1"/>
-    <w:lsdException w:name="toc 8" w:semiHidden="1" w:uiPriority="39" w:unhideWhenUsed="1"/>
-    <w:lsdException w:name="toc 9" w:semiHidden="1" w:uiPriority="39" w:unhideWhenUsed="1"/>
+    <w:lsdException w:name="toc 1" w:uiPriority="39" w:semiHidden="1" w:unhideWhenUsed="1"/>
+    <w:lsdException w:name="toc 2" w:uiPriority="39" w:semiHidden="1" w:unhideWhenUsed="1"/>
+    <w:lsdException w:name="toc 3" w:uiPriority="39" w:semiHidden="1" w:unhideWhenUsed="1"/>
+    <w:lsdException w:name="toc 4" w:uiPriority="39" w:semiHidden="1" w:unhideWhenUsed="1"/>
+    <w:lsdException w:name="toc 5" w:uiPriority="39" w:semiHidden="1" w:unhideWhenUsed="1"/>
+    <w:lsdException w:name="toc 6" w:uiPriority="39" w:semiHidden="1" w:unhideWhenUsed="1"/>
+    <w:lsdException w:name="toc 7" w:uiPriority="39" w:semiHidden="1" w:unhideWhenUsed="1"/>
+    <w:lsdException w:name="toc 8" w:uiPriority="39" w:semiHidden="1" w:unhideWhenUsed="1"/>
+    <w:lsdException w:name="toc 9" w:uiPriority="39" w:semiHidden="1" w:unhideWhenUsed="1"/>
     <w:lsdException w:name="Normal Indent" w:semiHidden="1" w:unhideWhenUsed="1"/>
     <w:lsdException w:name="footnote text" w:semiHidden="1" w:unhideWhenUsed="1"/>
     <w:lsdException w:name="annotation text" w:semiHidden="1" w:unhideWhenUsed="1"/>
     <w:lsdException w:name="header" w:semiHidden="1" w:unhideWhenUsed="1"/>
     <w:lsdException w:name="footer" w:semiHidden="1" w:unhideWhenUsed="1"/>
     <w:lsdException w:name="index heading" w:semiHidden="1" w:unhideWhenUsed="1"/>
-    <w:lsdException w:name="caption" w:semiHidden="1" w:uiPriority="35" w:unhideWhenUsed="1" w:qFormat="1"/>
+    <w:lsdException w:name="caption" w:uiPriority="35" w:semiHidden="1" w:unhideWhenUsed="1" w:qFormat="1"/>
     <w:lsdException w:name="table of figures" w:semiHidden="1" w:unhideWhenUsed="1"/>
     <w:lsdException w:name="envelope address" w:semiHidden="1" w:unhideWhenUsed="1"/>
     <w:lsdException w:name="envelope return" w:semiHidden="1" w:unhideWhenUsed="1"/>
@@ -2768,7 +3847,7 @@
     <w:lsdException w:name="Title" w:uiPriority="10" w:qFormat="1"/>
     <w:lsdException w:name="Closing" w:semiHidden="1" w:unhideWhenUsed="1"/>
     <w:lsdException w:name="Signature" w:semiHidden="1" w:unhideWhenUsed="1"/>
-    <w:lsdException w:name="Default Paragraph Font" w:semiHidden="1" w:uiPriority="1" w:unhideWhenUsed="1"/>
+    <w:lsdException w:name="Default Paragraph Font" w:uiPriority="1" w:semiHidden="1" w:unhideWhenUsed="1"/>
     <w:lsdException w:name="Body Text" w:semiHidden="1" w:unhideWhenUsed="1"/>
     <w:lsdException w:name="Body Text Indent" w:semiHidden="1" w:unhideWhenUsed="1"/>
     <w:lsdException w:name="List Continue" w:semiHidden="1" w:unhideWhenUsed="1"/>
@@ -2968,8 +4047,8 @@
     <w:lsdException w:name="Subtle Reference" w:uiPriority="31" w:qFormat="1"/>
     <w:lsdException w:name="Intense Reference" w:uiPriority="32" w:qFormat="1"/>
     <w:lsdException w:name="Book Title" w:uiPriority="33" w:qFormat="1"/>
-    <w:lsdException w:name="Bibliography" w:semiHidden="1" w:uiPriority="37" w:unhideWhenUsed="1"/>
-    <w:lsdException w:name="TOC Heading" w:semiHidden="1" w:uiPriority="39" w:unhideWhenUsed="1" w:qFormat="1"/>
+    <w:lsdException w:name="Bibliography" w:uiPriority="37" w:semiHidden="1" w:unhideWhenUsed="1"/>
+    <w:lsdException w:name="TOC Heading" w:uiPriority="39" w:semiHidden="1" w:unhideWhenUsed="1" w:qFormat="1"/>
     <w:lsdException w:name="Plain Table 1" w:uiPriority="41"/>
     <w:lsdException w:name="Plain Table 2" w:uiPriority="42"/>
     <w:lsdException w:name="Plain Table 3" w:uiPriority="43"/>
@@ -3080,7 +4159,7 @@
     <w:lsdException w:name="Unresolved Mention" w:semiHidden="1" w:unhideWhenUsed="1"/>
     <w:lsdException w:name="Smart Link" w:semiHidden="1" w:unhideWhenUsed="1"/>
   </w:latentStyles>
-  <w:style w:type="paragraph" w:default="1" w:styleId="Normal">
+  <w:style w:type="paragraph" w:styleId="Normal" w:default="1">
     <w:name w:val="Normal"/>
     <w:qFormat/>
     <w:rsid w:val="00F65138"/>
@@ -3108,7 +4187,7 @@
       <w:outlineLvl w:val="0"/>
     </w:pPr>
     <w:rPr>
-      <w:rFonts w:asciiTheme="majorHAnsi" w:eastAsiaTheme="majorEastAsia" w:hAnsiTheme="majorHAnsi" w:cstheme="majorBidi"/>
+      <w:rFonts w:asciiTheme="majorHAnsi" w:hAnsiTheme="majorHAnsi" w:eastAsiaTheme="majorEastAsia" w:cstheme="majorBidi"/>
       <w:color w:val="2F5496" w:themeColor="accent1" w:themeShade="BF"/>
       <w:sz w:val="32"/>
       <w:szCs w:val="32"/>
@@ -3135,12 +4214,12 @@
       <w:szCs w:val="26"/>
     </w:rPr>
   </w:style>
-  <w:style w:type="character" w:default="1" w:styleId="DefaultParagraphFont">
+  <w:style w:type="character" w:styleId="DefaultParagraphFont" w:default="1">
     <w:name w:val="Default Paragraph Font"/>
     <w:uiPriority w:val="1"/>
     <w:unhideWhenUsed/>
   </w:style>
-  <w:style w:type="table" w:default="1" w:styleId="TableNormal">
+  <w:style w:type="table" w:styleId="TableNormal" w:default="1">
     <w:name w:val="Normal Table"/>
     <w:uiPriority w:val="99"/>
     <w:semiHidden/>
@@ -3155,20 +4234,20 @@
       </w:tblCellMar>
     </w:tblPr>
   </w:style>
-  <w:style w:type="numbering" w:default="1" w:styleId="NoList">
+  <w:style w:type="numbering" w:styleId="NoList" w:default="1">
     <w:name w:val="No List"/>
     <w:uiPriority w:val="99"/>
     <w:semiHidden/>
     <w:unhideWhenUsed/>
   </w:style>
-  <w:style w:type="character" w:customStyle="1" w:styleId="Heading2Char">
+  <w:style w:type="character" w:styleId="Heading2Char" w:customStyle="1">
     <w:name w:val="Heading 2 Char"/>
     <w:basedOn w:val="DefaultParagraphFont"/>
     <w:link w:val="Heading2"/>
     <w:uiPriority w:val="9"/>
     <w:rsid w:val="007846A0"/>
     <w:rPr>
-      <w:rFonts w:ascii="Helvetica" w:eastAsiaTheme="majorEastAsia" w:hAnsi="Helvetica" w:cstheme="majorBidi"/>
+      <w:rFonts w:ascii="Helvetica" w:hAnsi="Helvetica" w:eastAsiaTheme="majorEastAsia" w:cstheme="majorBidi"/>
       <w:b/>
       <w:color w:val="000000" w:themeColor="text1"/>
       <w:sz w:val="26"/>
@@ -3176,21 +4255,21 @@
       <w:lang w:val="en-GB"/>
     </w:rPr>
   </w:style>
-  <w:style w:type="character" w:customStyle="1" w:styleId="Heading1Char">
+  <w:style w:type="character" w:styleId="Heading1Char" w:customStyle="1">
     <w:name w:val="Heading 1 Char"/>
     <w:basedOn w:val="DefaultParagraphFont"/>
     <w:link w:val="Heading1"/>
     <w:uiPriority w:val="9"/>
     <w:rsid w:val="007846A0"/>
     <w:rPr>
-      <w:rFonts w:asciiTheme="majorHAnsi" w:eastAsiaTheme="majorEastAsia" w:hAnsiTheme="majorHAnsi" w:cstheme="majorBidi"/>
+      <w:rFonts w:asciiTheme="majorHAnsi" w:hAnsiTheme="majorHAnsi" w:eastAsiaTheme="majorEastAsia" w:cstheme="majorBidi"/>
       <w:color w:val="2F5496" w:themeColor="accent1" w:themeShade="BF"/>
       <w:sz w:val="32"/>
       <w:szCs w:val="32"/>
       <w:lang w:val="en-GB"/>
     </w:rPr>
   </w:style>
-  <w:style w:type="character" w:customStyle="1" w:styleId="code">
+  <w:style w:type="character" w:styleId="code" w:customStyle="1">
     <w:name w:val="code"/>
     <w:basedOn w:val="DefaultParagraphFont"/>
     <w:qFormat/>
@@ -3204,7 +4283,7 @@
       <w:u w:val="none"/>
     </w:rPr>
   </w:style>
-  <w:style w:type="paragraph" w:customStyle="1" w:styleId="pre">
+  <w:style w:type="paragraph" w:styleId="pre" w:customStyle="1">
     <w:name w:val="pre"/>
     <w:basedOn w:val="Normal"/>
     <w:autoRedefine/>
@@ -3214,10 +4293,10 @@
       <w:keepNext/>
       <w:keepLines/>
       <w:pBdr>
-        <w:top w:val="single" w:sz="48" w:space="1" w:color="E7E6E6" w:themeColor="background2"/>
-        <w:left w:val="single" w:sz="48" w:space="4" w:color="E7E6E6" w:themeColor="background2"/>
-        <w:bottom w:val="single" w:sz="48" w:space="1" w:color="E7E6E6" w:themeColor="background2"/>
-        <w:right w:val="single" w:sz="48" w:space="4" w:color="E7E6E6" w:themeColor="background2"/>
+        <w:top w:val="single" w:color="E7E6E6" w:themeColor="background2" w:sz="48" w:space="1"/>
+        <w:left w:val="single" w:color="E7E6E6" w:themeColor="background2" w:sz="48" w:space="4"/>
+        <w:bottom w:val="single" w:color="E7E6E6" w:themeColor="background2" w:sz="48" w:space="1"/>
+        <w:right w:val="single" w:color="E7E6E6" w:themeColor="background2" w:sz="48" w:space="4"/>
       </w:pBdr>
       <w:shd w:val="clear" w:color="auto" w:fill="E7E6E6" w:themeFill="background2"/>
       <w:suppressAutoHyphens/>
@@ -3253,16 +4332,16 @@
     <w:rsid w:val="00F65138"/>
     <w:tblPr>
       <w:tblBorders>
-        <w:top w:val="single" w:sz="4" w:space="0" w:color="auto"/>
-        <w:left w:val="single" w:sz="4" w:space="0" w:color="auto"/>
-        <w:bottom w:val="single" w:sz="4" w:space="0" w:color="auto"/>
-        <w:right w:val="single" w:sz="4" w:space="0" w:color="auto"/>
-        <w:insideH w:val="single" w:sz="4" w:space="0" w:color="auto"/>
-        <w:insideV w:val="single" w:sz="4" w:space="0" w:color="auto"/>
+        <w:top w:val="single" w:color="auto" w:sz="4" w:space="0"/>
+        <w:left w:val="single" w:color="auto" w:sz="4" w:space="0"/>
+        <w:bottom w:val="single" w:color="auto" w:sz="4" w:space="0"/>
+        <w:right w:val="single" w:color="auto" w:sz="4" w:space="0"/>
+        <w:insideH w:val="single" w:color="auto" w:sz="4" w:space="0"/>
+        <w:insideV w:val="single" w:color="auto" w:sz="4" w:space="0"/>
       </w:tblBorders>
     </w:tblPr>
   </w:style>
-  <w:style w:type="paragraph" w:customStyle="1" w:styleId="paragraph">
+  <w:style w:type="paragraph" w:styleId="paragraph" w:customStyle="1">
     <w:name w:val="paragraph"/>
     <w:basedOn w:val="Normal"/>
     <w:rsid w:val="00F65138"/>
@@ -3270,17 +4349,17 @@
       <w:spacing w:before="100" w:beforeAutospacing="1" w:after="100" w:afterAutospacing="1"/>
     </w:pPr>
     <w:rPr>
-      <w:rFonts w:ascii="Times New Roman" w:eastAsia="Times New Roman" w:hAnsi="Times New Roman" w:cs="Times New Roman"/>
+      <w:rFonts w:ascii="Times New Roman" w:hAnsi="Times New Roman" w:eastAsia="Times New Roman" w:cs="Times New Roman"/>
       <w:sz w:val="24"/>
       <w:lang w:val="en-NZ" w:eastAsia="en-GB"/>
     </w:rPr>
   </w:style>
-  <w:style w:type="character" w:customStyle="1" w:styleId="normaltextrun">
+  <w:style w:type="character" w:styleId="normaltextrun" w:customStyle="1">
     <w:name w:val="normaltextrun"/>
     <w:basedOn w:val="DefaultParagraphFont"/>
     <w:rsid w:val="00F65138"/>
   </w:style>
-  <w:style w:type="character" w:customStyle="1" w:styleId="eop">
+  <w:style w:type="character" w:styleId="eop" w:customStyle="1">
     <w:name w:val="eop"/>
     <w:basedOn w:val="DefaultParagraphFont"/>
     <w:rsid w:val="00F65138"/>
@@ -3324,7 +4403,7 @@
 </file>
 
 <file path=word/theme/theme1.xml><?xml version="1.0" encoding="utf-8"?>
-<a:theme xmlns:a="http://schemas.openxmlformats.org/drawingml/2006/main" name="Office Theme">
+<a:theme xmlns:a="http://schemas.openxmlformats.org/drawingml/2006/main" xmlns:thm15="http://schemas.microsoft.com/office/thememl/2012/main" name="Office Theme">
   <a:themeElements>
     <a:clrScheme name="Office">
       <a:dk1>

</xml_diff>

<commit_message>
add pics to user stories in pdr worksheet
</commit_message>
<xml_diff>
--- a/Studio/Studio 3 PDR Planning Worksheet.docx
+++ b/Studio/Studio 3 PDR Planning Worksheet.docx
@@ -1,6 +1,6 @@
 
 <file path=word/document.xml><?xml version="1.0" encoding="utf-8"?>
-<w:document xmlns:wpc="http://schemas.microsoft.com/office/word/2010/wordprocessingCanvas" xmlns:cx="http://schemas.microsoft.com/office/drawing/2014/chartex" xmlns:cx1="http://schemas.microsoft.com/office/drawing/2015/9/8/chartex" xmlns:cx2="http://schemas.microsoft.com/office/drawing/2015/10/21/chartex" xmlns:cx3="http://schemas.microsoft.com/office/drawing/2016/5/9/chartex" xmlns:cx4="http://schemas.microsoft.com/office/drawing/2016/5/10/chartex" xmlns:cx5="http://schemas.microsoft.com/office/drawing/2016/5/11/chartex" xmlns:cx6="http://schemas.microsoft.com/office/drawing/2016/5/12/chartex" xmlns:cx7="http://schemas.microsoft.com/office/drawing/2016/5/13/chartex" xmlns:cx8="http://schemas.microsoft.com/office/drawing/2016/5/14/chartex" xmlns:mc="http://schemas.openxmlformats.org/markup-compatibility/2006" xmlns:aink="http://schemas.microsoft.com/office/drawing/2016/ink" xmlns:am3d="http://schemas.microsoft.com/office/drawing/2017/model3d" xmlns:o="urn:schemas-microsoft-com:office:office" xmlns:oel="http://schemas.microsoft.com/office/2019/extlst" xmlns:r="http://schemas.openxmlformats.org/officeDocument/2006/relationships" xmlns:m="http://schemas.openxmlformats.org/officeDocument/2006/math" xmlns:v="urn:schemas-microsoft-com:vml" xmlns:wp14="http://schemas.microsoft.com/office/word/2010/wordprocessingDrawing" xmlns:wp="http://schemas.openxmlformats.org/drawingml/2006/wordprocessingDrawing" xmlns:w10="urn:schemas-microsoft-com:office:word" xmlns:w="http://schemas.openxmlformats.org/wordprocessingml/2006/main" xmlns:w14="http://schemas.microsoft.com/office/word/2010/wordml" xmlns:w15="http://schemas.microsoft.com/office/word/2012/wordml" xmlns:w16cex="http://schemas.microsoft.com/office/word/2018/wordml/cex" xmlns:w16cid="http://schemas.microsoft.com/office/word/2016/wordml/cid" xmlns:w16="http://schemas.microsoft.com/office/word/2018/wordml" xmlns:w16du="http://schemas.microsoft.com/office/word/2023/wordml/word16du" xmlns:w16sdtdh="http://schemas.microsoft.com/office/word/2020/wordml/sdtdatahash" xmlns:w16sdtfl="http://schemas.microsoft.com/office/word/2024/wordml/sdtformatlock" xmlns:w16se="http://schemas.microsoft.com/office/word/2015/wordml/symex" xmlns:wpg="http://schemas.microsoft.com/office/word/2010/wordprocessingGroup" xmlns:wpi="http://schemas.microsoft.com/office/word/2010/wordprocessingInk" xmlns:wne="http://schemas.microsoft.com/office/word/2006/wordml" xmlns:wps="http://schemas.microsoft.com/office/word/2010/wordprocessingShape" xmlns:a="http://schemas.openxmlformats.org/drawingml/2006/main" xmlns:pic="http://schemas.openxmlformats.org/drawingml/2006/picture" xmlns:a14="http://schemas.microsoft.com/office/drawing/2010/main" mc:Ignorable="w14 w15 w16se w16cid w16 w16cex w16sdtdh w16sdtfl w16du wp14">
+<w:document xmlns:wpc="http://schemas.microsoft.com/office/word/2010/wordprocessingCanvas" xmlns:cx="http://schemas.microsoft.com/office/drawing/2014/chartex" xmlns:cx1="http://schemas.microsoft.com/office/drawing/2015/9/8/chartex" xmlns:cx2="http://schemas.microsoft.com/office/drawing/2015/10/21/chartex" xmlns:cx3="http://schemas.microsoft.com/office/drawing/2016/5/9/chartex" xmlns:cx4="http://schemas.microsoft.com/office/drawing/2016/5/10/chartex" xmlns:cx5="http://schemas.microsoft.com/office/drawing/2016/5/11/chartex" xmlns:cx6="http://schemas.microsoft.com/office/drawing/2016/5/12/chartex" xmlns:cx7="http://schemas.microsoft.com/office/drawing/2016/5/13/chartex" xmlns:cx8="http://schemas.microsoft.com/office/drawing/2016/5/14/chartex" xmlns:mc="http://schemas.openxmlformats.org/markup-compatibility/2006" xmlns:aink="http://schemas.microsoft.com/office/drawing/2016/ink" xmlns:am3d="http://schemas.microsoft.com/office/drawing/2017/model3d" xmlns:o="urn:schemas-microsoft-com:office:office" xmlns:oel="http://schemas.microsoft.com/office/2019/extlst" xmlns:r="http://schemas.openxmlformats.org/officeDocument/2006/relationships" xmlns:m="http://schemas.openxmlformats.org/officeDocument/2006/math" xmlns:v="urn:schemas-microsoft-com:vml" xmlns:wp14="http://schemas.microsoft.com/office/word/2010/wordprocessingDrawing" xmlns:wp="http://schemas.openxmlformats.org/drawingml/2006/wordprocessingDrawing" xmlns:w10="urn:schemas-microsoft-com:office:word" xmlns:w="http://schemas.openxmlformats.org/wordprocessingml/2006/main" xmlns:w14="http://schemas.microsoft.com/office/word/2010/wordml" xmlns:w15="http://schemas.microsoft.com/office/word/2012/wordml" xmlns:w16cex="http://schemas.microsoft.com/office/word/2018/wordml/cex" xmlns:w16cid="http://schemas.microsoft.com/office/word/2016/wordml/cid" xmlns:w16="http://schemas.microsoft.com/office/word/2018/wordml" xmlns:w16du="http://schemas.microsoft.com/office/word/2023/wordml/word16du" xmlns:w16sdtdh="http://schemas.microsoft.com/office/word/2020/wordml/sdtdatahash" xmlns:w16sdtfl="http://schemas.microsoft.com/office/word/2024/wordml/sdtformatlock" xmlns:w16se="http://schemas.microsoft.com/office/word/2015/wordml/symex" xmlns:wpg="http://schemas.microsoft.com/office/word/2010/wordprocessingGroup" xmlns:wpi="http://schemas.microsoft.com/office/word/2010/wordprocessingInk" xmlns:wne="http://schemas.microsoft.com/office/word/2006/wordml" xmlns:wps="http://schemas.microsoft.com/office/word/2010/wordprocessingShape" mc:Ignorable="w14 w15 w16se w16cid w16 w16cex w16sdtdh w16sdtfl w16du wp14">
   <w:body>
     <w:p>
       <w:pPr>
@@ -623,7 +623,13 @@
               <w:rPr>
                 <w:rFonts w:cs="Arial"/>
               </w:rPr>
-              <w:t>Date of scheduled PDR meeting:                                                        Mid-semester</w:t>
+              <w:t xml:space="preserve">Date of scheduled PDR meeting:                                                        </w:t>
+            </w:r>
+            <w:r>
+              <w:rPr>
+                <w:rFonts w:cs="Arial"/>
+              </w:rPr>
+              <w:t>Final</w:t>
             </w:r>
           </w:p>
         </w:tc>
@@ -666,7 +672,7 @@
         <w:tblLook w:val="04A0" w:firstRow="1" w:lastRow="0" w:firstColumn="1" w:lastColumn="0" w:noHBand="0" w:noVBand="1"/>
       </w:tblPr>
       <w:tblGrid>
-        <w:gridCol w:w="9010"/>
+        <w:gridCol w:w="9070"/>
       </w:tblGrid>
       <w:tr>
         <w:trPr>
@@ -675,7 +681,6 @@
         <w:tc>
           <w:tcPr>
             <w:tcW w:w="9010" w:type="dxa"/>
-            <w:tcMar/>
           </w:tcPr>
           <w:p>
             <w:pPr>
@@ -727,52 +732,39 @@
               <w:rPr>
                 <w:rFonts w:eastAsia="Calibri"/>
               </w:rPr>
-              <w:t>I’d</w:t>
-            </w:r>
-            <w:r>
+              <w:t xml:space="preserve">I’d like to develop skills catered towards cybersecurity and app development namely full-stack and pen-testing. </w:t>
+            </w:r>
+          </w:p>
+          <w:p>
+            <w:pPr>
               <w:rPr>
                 <w:rFonts w:eastAsia="Calibri"/>
               </w:rPr>
-              <w:t xml:space="preserve"> like to develop skills catered towards cybersecurity and app development namely full-stack and pen-testing. </w:t>
-            </w:r>
-          </w:p>
-          <w:p>
-            <w:pPr>
+            </w:pPr>
+            <w:r>
               <w:rPr>
                 <w:rFonts w:eastAsia="Calibri"/>
               </w:rPr>
-            </w:pPr>
+              <w:t>I hope to gather experience in the field when I perform level 1 support technician work for my job</w:t>
+            </w:r>
             <w:r>
               <w:rPr>
                 <w:rFonts w:eastAsia="Calibri"/>
               </w:rPr>
-              <w:t>I hope to gather experience in the field when I perform level 1 support technician work for my job</w:t>
-            </w:r>
-            <w:r>
+              <w:t xml:space="preserve"> helping patch network vulnerabilities.</w:t>
+            </w:r>
+          </w:p>
+          <w:p>
+            <w:pPr>
               <w:rPr>
                 <w:rFonts w:eastAsia="Calibri"/>
               </w:rPr>
-              <w:t xml:space="preserve"> helping patch network vulnerabilities.</w:t>
-            </w:r>
-          </w:p>
-          <w:p>
-            <w:pPr>
-              <w:pStyle w:val="Normal"/>
+            </w:pPr>
+            <w:r>
               <w:rPr>
                 <w:rFonts w:eastAsia="Calibri"/>
               </w:rPr>
-            </w:pPr>
-            <w:r>
-              <w:rPr>
-                <w:rFonts w:eastAsia="Calibri"/>
-              </w:rPr>
-              <w:t>I’d</w:t>
-            </w:r>
-            <w:r>
-              <w:rPr>
-                <w:rFonts w:eastAsia="Calibri"/>
-              </w:rPr>
-              <w:t xml:space="preserve"> like to learn more about Linux systems along the way.</w:t>
+              <w:t>I’d like to learn more about Linux systems along the way.</w:t>
             </w:r>
           </w:p>
         </w:tc>
@@ -784,7 +776,6 @@
         <w:tc>
           <w:tcPr>
             <w:tcW w:w="9010" w:type="dxa"/>
-            <w:tcMar/>
           </w:tcPr>
           <w:p>
             <w:pPr>
@@ -832,7 +823,6 @@
               <w:t xml:space="preserve"> but I think my project work has been of a </w:t>
             </w:r>
             <w:r>
-              <w:rPr/>
               <w:t xml:space="preserve">consistently </w:t>
             </w:r>
             <w:r>
@@ -844,12 +834,7 @@
           </w:p>
           <w:p>
             <w:pPr>
-              <w:pStyle w:val="Normal"/>
-              <w:suppressLineNumbers w:val="0"/>
-              <w:bidi w:val="0"/>
-              <w:spacing w:before="120" w:beforeAutospacing="off" w:after="120" w:afterAutospacing="off" w:line="259" w:lineRule="auto"/>
-              <w:ind w:left="0" w:right="0"/>
-              <w:jc w:val="left"/>
+              <w:spacing w:line="259" w:lineRule="auto"/>
             </w:pPr>
             <w:r>
               <w:rPr>
@@ -860,30 +845,13 @@
           </w:p>
           <w:p>
             <w:pPr>
-              <w:pStyle w:val="Normal"/>
-              <w:suppressLineNumbers w:val="0"/>
-              <w:bidi w:val="0"/>
-              <w:spacing w:before="120" w:beforeAutospacing="off" w:after="120" w:afterAutospacing="off" w:line="259" w:lineRule="auto"/>
-              <w:ind w:left="0" w:right="0"/>
-              <w:jc w:val="left"/>
-            </w:pPr>
-            <w:r>
-              <w:rPr>
-                <w:rFonts w:cs="Arial"/>
-              </w:rPr>
-              <w:t xml:space="preserve">I think </w:t>
-            </w:r>
-            <w:r>
-              <w:rPr>
-                <w:rFonts w:cs="Arial"/>
-              </w:rPr>
-              <w:t>I’m</w:t>
-            </w:r>
-            <w:r>
-              <w:rPr>
-                <w:rFonts w:cs="Arial"/>
-              </w:rPr>
-              <w:t xml:space="preserve"> decent at directing a group towards what should be done or just getting them on track to considering what needs doing. </w:t>
+              <w:spacing w:line="259" w:lineRule="auto"/>
+            </w:pPr>
+            <w:r>
+              <w:rPr>
+                <w:rFonts w:cs="Arial"/>
+              </w:rPr>
+              <w:t xml:space="preserve">I think I’m decent at directing a group towards what should be done or just getting them on track to considering what needs doing. </w:t>
             </w:r>
           </w:p>
           <w:p>
@@ -902,7 +870,6 @@
         <w:tc>
           <w:tcPr>
             <w:tcW w:w="9010" w:type="dxa"/>
-            <w:tcMar/>
           </w:tcPr>
           <w:p>
             <w:pPr>
@@ -973,13 +940,7 @@
               <w:rPr>
                 <w:rFonts w:eastAsia="Calibri"/>
               </w:rPr>
-              <w:t>I’d</w:t>
-            </w:r>
-            <w:r>
-              <w:rPr>
-                <w:rFonts w:eastAsia="Calibri"/>
-              </w:rPr>
-              <w:t xml:space="preserve"> manage my schedule better to allow me more time to work on projects.</w:t>
+              <w:t>I’d manage my schedule better to allow me more time to work on projects.</w:t>
             </w:r>
           </w:p>
         </w:tc>
@@ -991,7 +952,6 @@
         <w:tc>
           <w:tcPr>
             <w:tcW w:w="9010" w:type="dxa"/>
-            <w:tcMar/>
           </w:tcPr>
           <w:p>
             <w:pPr>
@@ -1049,13 +1009,7 @@
               <w:rPr>
                 <w:rFonts w:cs="Arial"/>
               </w:rPr>
-              <w:t>I’d</w:t>
-            </w:r>
-            <w:r>
-              <w:rPr>
-                <w:rFonts w:cs="Arial"/>
-              </w:rPr>
-              <w:t xml:space="preserve"> like to remain flexible across many </w:t>
+              <w:t xml:space="preserve">I’d like to remain flexible across many </w:t>
             </w:r>
             <w:r>
               <w:rPr>
@@ -1067,19 +1021,7 @@
               <w:rPr>
                 <w:rFonts w:cs="Arial"/>
               </w:rPr>
-              <w:t xml:space="preserve"> so </w:t>
-            </w:r>
-            <w:r>
-              <w:rPr>
-                <w:rFonts w:cs="Arial"/>
-              </w:rPr>
-              <w:t>I’d</w:t>
-            </w:r>
-            <w:r>
-              <w:rPr>
-                <w:rFonts w:cs="Arial"/>
-              </w:rPr>
-              <w:t xml:space="preserve"> like to also work on my full-stack app development skills.</w:t>
+              <w:t xml:space="preserve"> so I’d like to also work on my full-stack app development skills.</w:t>
             </w:r>
           </w:p>
           <w:p>
@@ -1123,7 +1065,6 @@
         <w:tc>
           <w:tcPr>
             <w:tcW w:w="9010" w:type="dxa"/>
-            <w:tcMar/>
           </w:tcPr>
           <w:p>
             <w:pPr>
@@ -1141,15 +1082,13 @@
           </w:p>
           <w:p>
             <w:pPr>
-              <w:pStyle w:val="Normal"/>
-              <w:rPr>
-                <w:rFonts w:cs="Arial"/>
-              </w:rPr>
-            </w:pPr>
-          </w:p>
-          <w:p>
-            <w:pPr>
-              <w:pStyle w:val="Normal"/>
+              <w:rPr>
+                <w:rFonts w:cs="Arial"/>
+              </w:rPr>
+            </w:pPr>
+          </w:p>
+          <w:p>
+            <w:pPr>
               <w:rPr>
                 <w:rFonts w:cs="Arial"/>
               </w:rPr>
@@ -1176,89 +1115,39 @@
               <w:rPr>
                 <w:rFonts w:cs="Arial"/>
               </w:rPr>
-              <w:t>frequently</w:t>
-            </w:r>
-            <w:r>
-              <w:rPr>
-                <w:rFonts w:cs="Arial"/>
-              </w:rPr>
-              <w:t xml:space="preserve">. </w:t>
-            </w:r>
-            <w:r>
-              <w:rPr>
-                <w:rFonts w:cs="Arial"/>
-              </w:rPr>
-              <w:t xml:space="preserve">I hope to better manage my time by using a calendar and properly </w:t>
-            </w:r>
-            <w:r>
-              <w:rPr>
-                <w:rFonts w:cs="Arial"/>
-              </w:rPr>
-              <w:t>allocating</w:t>
-            </w:r>
-            <w:r>
-              <w:rPr>
-                <w:rFonts w:cs="Arial"/>
-              </w:rPr>
-              <w:t xml:space="preserve"> study times throughout the week.</w:t>
-            </w:r>
-            <w:r>
-              <w:rPr>
-                <w:rFonts w:cs="Arial"/>
-              </w:rPr>
-              <w:t xml:space="preserve"> </w:t>
-            </w:r>
-            <w:r>
-              <w:rPr>
-                <w:rFonts w:cs="Arial"/>
-              </w:rPr>
-              <w:t xml:space="preserve">I also plan </w:t>
-            </w:r>
-            <w:r>
-              <w:rPr>
-                <w:rFonts w:cs="Arial"/>
-              </w:rPr>
-              <w:t>on cutting</w:t>
-            </w:r>
-            <w:r>
-              <w:rPr>
-                <w:rFonts w:cs="Arial"/>
-              </w:rPr>
-              <w:t xml:space="preserve"> down extracurricular activities so I can dedicate more time to projects.</w:t>
-            </w:r>
-          </w:p>
-          <w:p>
-            <w:pPr>
-              <w:pStyle w:val="Normal"/>
-              <w:rPr>
-                <w:rFonts w:cs="Arial"/>
-              </w:rPr>
-            </w:pPr>
-          </w:p>
-          <w:p>
-            <w:pPr>
-              <w:pStyle w:val="Normal"/>
-              <w:rPr>
-                <w:rFonts w:cs="Arial"/>
-              </w:rPr>
-            </w:pPr>
-            <w:r>
-              <w:rPr>
-                <w:rFonts w:cs="Arial"/>
-              </w:rPr>
-              <w:t xml:space="preserve">My sleep schedule has been a bit messy of late, and </w:t>
-            </w:r>
-            <w:r>
-              <w:rPr>
-                <w:rFonts w:cs="Arial"/>
-              </w:rPr>
-              <w:t>I’d</w:t>
-            </w:r>
-            <w:r>
-              <w:rPr>
-                <w:rFonts w:cs="Arial"/>
-              </w:rPr>
-              <w:t xml:space="preserve"> like to work on waking up earlier to maximise </w:t>
+              <w:t xml:space="preserve">frequently. </w:t>
+            </w:r>
+            <w:r>
+              <w:rPr>
+                <w:rFonts w:cs="Arial"/>
+              </w:rPr>
+              <w:t>I hope to better manage my time by using a calendar and properly allocating study times throughout the week.</w:t>
+            </w:r>
+            <w:r>
+              <w:rPr>
+                <w:rFonts w:cs="Arial"/>
+              </w:rPr>
+              <w:t xml:space="preserve"> I also plan on cutting down extracurricular activities so I can dedicate more time to projects.</w:t>
+            </w:r>
+          </w:p>
+          <w:p>
+            <w:pPr>
+              <w:rPr>
+                <w:rFonts w:cs="Arial"/>
+              </w:rPr>
+            </w:pPr>
+          </w:p>
+          <w:p>
+            <w:pPr>
+              <w:rPr>
+                <w:rFonts w:cs="Arial"/>
+              </w:rPr>
+            </w:pPr>
+            <w:r>
+              <w:rPr>
+                <w:rFonts w:cs="Arial"/>
+              </w:rPr>
+              <w:t xml:space="preserve">My sleep schedule has been a bit messy of late, and I’d like to work on waking up earlier to maximise </w:t>
             </w:r>
             <w:r>
               <w:rPr>
@@ -1270,19 +1159,7 @@
               <w:rPr>
                 <w:rFonts w:cs="Arial"/>
               </w:rPr>
-              <w:t xml:space="preserve">time </w:t>
-            </w:r>
-            <w:r>
-              <w:rPr>
-                <w:rFonts w:cs="Arial"/>
-              </w:rPr>
-              <w:t>I’m</w:t>
-            </w:r>
-            <w:r>
-              <w:rPr>
-                <w:rFonts w:cs="Arial"/>
-              </w:rPr>
-              <w:t xml:space="preserve"> able to dedicate towards study.</w:t>
+              <w:t>time I’m able to dedicate towards study.</w:t>
             </w:r>
           </w:p>
         </w:tc>
@@ -1294,7 +1171,6 @@
         <w:tc>
           <w:tcPr>
             <w:tcW w:w="9010" w:type="dxa"/>
-            <w:tcMar/>
           </w:tcPr>
           <w:p>
             <w:pPr>
@@ -1330,118 +1206,89 @@
           </w:p>
           <w:p>
             <w:pPr>
-              <w:pStyle w:val="Normal"/>
               <w:rPr>
                 <w:rFonts w:eastAsia="Calibri" w:cs="Arial"/>
-                <w:i w:val="1"/>
-                <w:iCs w:val="1"/>
-              </w:rPr>
-            </w:pPr>
-          </w:p>
-          <w:p>
-            <w:pPr>
-              <w:pStyle w:val="Normal"/>
+                <w:i/>
+                <w:iCs/>
+              </w:rPr>
+            </w:pPr>
+          </w:p>
+          <w:p>
+            <w:pPr>
               <w:rPr>
                 <w:rFonts w:eastAsia="Calibri" w:cs="Arial"/>
-                <w:i w:val="0"/>
-                <w:iCs w:val="0"/>
               </w:rPr>
             </w:pPr>
             <w:r>
               <w:rPr>
                 <w:rFonts w:eastAsia="Calibri" w:cs="Arial"/>
-                <w:i w:val="0"/>
-                <w:iCs w:val="0"/>
               </w:rPr>
               <w:t xml:space="preserve">I entered this course to learn game programming so I could get a job in game </w:t>
             </w:r>
             <w:r>
               <w:rPr>
                 <w:rFonts w:eastAsia="Calibri" w:cs="Arial"/>
-                <w:i w:val="0"/>
-                <w:iCs w:val="0"/>
               </w:rPr>
               <w:t>development,</w:t>
             </w:r>
             <w:r>
               <w:rPr>
                 <w:rFonts w:eastAsia="Calibri" w:cs="Arial"/>
-                <w:i w:val="0"/>
-                <w:iCs w:val="0"/>
               </w:rPr>
               <w:t xml:space="preserve"> but my interests are leaning towards cybersecurity and</w:t>
             </w:r>
             <w:r>
               <w:rPr>
                 <w:rFonts w:eastAsia="Calibri" w:cs="Arial"/>
-                <w:i w:val="0"/>
-                <w:iCs w:val="0"/>
               </w:rPr>
               <w:t xml:space="preserve"> app development. </w:t>
             </w:r>
           </w:p>
           <w:p>
             <w:pPr>
-              <w:pStyle w:val="Normal"/>
               <w:rPr>
                 <w:rFonts w:eastAsia="Calibri" w:cs="Arial"/>
-                <w:i w:val="0"/>
-                <w:iCs w:val="0"/>
               </w:rPr>
             </w:pPr>
             <w:r>
               <w:rPr>
                 <w:rFonts w:eastAsia="Calibri" w:cs="Arial"/>
-                <w:i w:val="0"/>
-                <w:iCs w:val="0"/>
               </w:rPr>
               <w:t>I’ve</w:t>
             </w:r>
             <w:r>
               <w:rPr>
                 <w:rFonts w:eastAsia="Calibri" w:cs="Arial"/>
-                <w:i w:val="0"/>
-                <w:iCs w:val="0"/>
               </w:rPr>
               <w:t xml:space="preserve"> signed on for a job but have been waiting for a while to </w:t>
             </w:r>
             <w:r>
               <w:rPr>
                 <w:rFonts w:eastAsia="Calibri" w:cs="Arial"/>
-                <w:i w:val="0"/>
-                <w:iCs w:val="0"/>
               </w:rPr>
               <w:t>start</w:t>
             </w:r>
             <w:r>
               <w:rPr>
                 <w:rFonts w:eastAsia="Calibri" w:cs="Arial"/>
-                <w:i w:val="0"/>
-                <w:iCs w:val="0"/>
               </w:rPr>
               <w:t xml:space="preserve"> working</w:t>
             </w:r>
             <w:r>
               <w:rPr>
                 <w:rFonts w:eastAsia="Calibri" w:cs="Arial"/>
-                <w:i w:val="0"/>
-                <w:iCs w:val="0"/>
               </w:rPr>
               <w:t xml:space="preserve"> ~ t</w:t>
             </w:r>
             <w:r>
               <w:rPr>
                 <w:rFonts w:eastAsia="Calibri" w:cs="Arial"/>
-                <w:i w:val="0"/>
-                <w:iCs w:val="0"/>
               </w:rPr>
               <w:t>he job is contract work so my study hours may be shifted</w:t>
             </w:r>
             <w:r>
               <w:rPr>
                 <w:rFonts w:eastAsia="Calibri" w:cs="Arial"/>
-                <w:i w:val="0"/>
-                <w:iCs w:val="0"/>
               </w:rPr>
               <w:t xml:space="preserve"> around a bit.</w:t>
             </w:r>
@@ -1455,7 +1302,6 @@
         <w:tc>
           <w:tcPr>
             <w:tcW w:w="9010" w:type="dxa"/>
-            <w:tcMar/>
           </w:tcPr>
           <w:p>
             <w:pPr>
@@ -1607,17 +1453,11 @@
           <w:p>
             <w:pPr>
               <w:pStyle w:val="paragraph"/>
-              <w:spacing w:before="0" w:beforeAutospacing="off" w:after="0" w:afterAutospacing="off"/>
+              <w:spacing w:before="0" w:beforeAutospacing="0" w:after="0" w:afterAutospacing="0"/>
               <w:ind w:left="25"/>
               <w:textAlignment w:val="baseline"/>
-              <w:rPr>
-                <w:rFonts w:ascii="Arial" w:hAnsi="Arial" w:cs="Arial"/>
-                <w:sz w:val="22"/>
-                <w:szCs w:val="22"/>
-                <w:lang w:val="en-US"/>
-              </w:rPr>
-            </w:pPr>
-            <w:hyperlink r:id="R25e8698221394729">
+            </w:pPr>
+            <w:hyperlink r:id="rId8">
               <w:r>
                 <w:rPr>
                   <w:rStyle w:val="Hyperlink"/>
@@ -1626,24 +1466,8 @@
                   <w:szCs w:val="22"/>
                   <w:lang w:val="en-US"/>
                 </w:rPr>
-                <w:t>https://github.com/BIT-Studio-3/project-26-1-red-team/issues/97</w:t>
+                <w:t>https://github.com/BIT-Studio-3/project-26-1-red-te</w:t>
               </w:r>
-            </w:hyperlink>
-          </w:p>
-          <w:p>
-            <w:pPr>
-              <w:pStyle w:val="paragraph"/>
-              <w:spacing w:before="0" w:beforeAutospacing="off" w:after="0" w:afterAutospacing="off"/>
-              <w:ind w:left="25"/>
-              <w:textAlignment w:val="baseline"/>
-              <w:rPr>
-                <w:rFonts w:ascii="Arial" w:hAnsi="Arial" w:cs="Arial"/>
-                <w:sz w:val="22"/>
-                <w:szCs w:val="22"/>
-                <w:lang w:val="en-US"/>
-              </w:rPr>
-            </w:pPr>
-            <w:hyperlink r:id="R9a0671a9e66c4ef5">
               <w:r>
                 <w:rPr>
                   <w:rStyle w:val="Hyperlink"/>
@@ -1652,14 +1476,24 @@
                   <w:szCs w:val="22"/>
                   <w:lang w:val="en-US"/>
                 </w:rPr>
-                <w:t>https://github.com/BIT-Studio-3/project-26-1-red-team/issues/98\</w:t>
+                <w:t>a</w:t>
+              </w:r>
+              <w:r>
+                <w:rPr>
+                  <w:rStyle w:val="Hyperlink"/>
+                  <w:rFonts w:ascii="Arial" w:hAnsi="Arial" w:cs="Arial"/>
+                  <w:sz w:val="22"/>
+                  <w:szCs w:val="22"/>
+                  <w:lang w:val="en-US"/>
+                </w:rPr>
+                <w:t>m/issues/97</w:t>
               </w:r>
             </w:hyperlink>
           </w:p>
           <w:p>
             <w:pPr>
               <w:pStyle w:val="paragraph"/>
-              <w:spacing w:before="0" w:beforeAutospacing="off" w:after="0" w:afterAutospacing="off"/>
+              <w:spacing w:before="0" w:beforeAutospacing="0" w:after="0" w:afterAutospacing="0"/>
               <w:ind w:left="25"/>
               <w:textAlignment w:val="baseline"/>
               <w:rPr>
@@ -1667,6 +1501,191 @@
                 <w:sz w:val="22"/>
                 <w:szCs w:val="22"/>
                 <w:lang w:val="en-US"/>
+              </w:rPr>
+            </w:pPr>
+            <w:r>
+              <w:drawing>
+                <wp:inline distT="0" distB="0" distL="0" distR="0" wp14:anchorId="62C14FF4" wp14:editId="3A85005A">
+                  <wp:extent cx="5606415" cy="1283213"/>
+                  <wp:effectExtent l="0" t="0" r="0" b="0"/>
+                  <wp:docPr id="1454780889" name="Picture 1"/>
+                  <wp:cNvGraphicFramePr>
+                    <a:graphicFrameLocks xmlns:a="http://schemas.openxmlformats.org/drawingml/2006/main" noChangeAspect="1"/>
+                  </wp:cNvGraphicFramePr>
+                  <a:graphic xmlns:a="http://schemas.openxmlformats.org/drawingml/2006/main">
+                    <a:graphicData uri="http://schemas.openxmlformats.org/drawingml/2006/picture">
+                      <pic:pic xmlns:pic="http://schemas.openxmlformats.org/drawingml/2006/picture">
+                        <pic:nvPicPr>
+                          <pic:cNvPr id="1454780889" name=""/>
+                          <pic:cNvPicPr/>
+                        </pic:nvPicPr>
+                        <pic:blipFill rotWithShape="1">
+                          <a:blip r:embed="rId9"/>
+                          <a:srcRect t="42111"/>
+                          <a:stretch>
+                            <a:fillRect/>
+                          </a:stretch>
+                        </pic:blipFill>
+                        <pic:spPr bwMode="auto">
+                          <a:xfrm>
+                            <a:off x="0" y="0"/>
+                            <a:ext cx="5610853" cy="1284229"/>
+                          </a:xfrm>
+                          <a:prstGeom prst="rect">
+                            <a:avLst/>
+                          </a:prstGeom>
+                          <a:ln>
+                            <a:noFill/>
+                          </a:ln>
+                          <a:extLst>
+                            <a:ext uri="{53640926-AAD7-44D8-BBD7-CCE9431645EC}">
+                              <a14:shadowObscured xmlns:a14="http://schemas.microsoft.com/office/drawing/2010/main"/>
+                            </a:ext>
+                          </a:extLst>
+                        </pic:spPr>
+                      </pic:pic>
+                    </a:graphicData>
+                  </a:graphic>
+                </wp:inline>
+              </w:drawing>
+            </w:r>
+          </w:p>
+          <w:p>
+            <w:pPr>
+              <w:pStyle w:val="paragraph"/>
+              <w:spacing w:before="0" w:beforeAutospacing="0" w:after="0" w:afterAutospacing="0"/>
+              <w:ind w:left="25"/>
+              <w:textAlignment w:val="baseline"/>
+            </w:pPr>
+          </w:p>
+          <w:p>
+            <w:pPr>
+              <w:pStyle w:val="paragraph"/>
+              <w:spacing w:before="0" w:beforeAutospacing="0" w:after="0" w:afterAutospacing="0"/>
+              <w:ind w:left="25"/>
+              <w:textAlignment w:val="baseline"/>
+              <w:rPr>
+                <w:rFonts w:ascii="Arial" w:hAnsi="Arial" w:cs="Arial"/>
+                <w:sz w:val="22"/>
+                <w:szCs w:val="22"/>
+                <w:lang w:val="en-US"/>
+              </w:rPr>
+            </w:pPr>
+            <w:hyperlink r:id="rId10" w:history="1">
+              <w:r>
+                <w:rPr>
+                  <w:rStyle w:val="Hyperlink"/>
+                  <w:rFonts w:ascii="Arial" w:hAnsi="Arial" w:cs="Arial"/>
+                  <w:sz w:val="22"/>
+                  <w:szCs w:val="22"/>
+                  <w:lang w:val="en-US"/>
+                </w:rPr>
+                <w:t>https://github.co</w:t>
+              </w:r>
+              <w:r>
+                <w:rPr>
+                  <w:rStyle w:val="Hyperlink"/>
+                  <w:rFonts w:ascii="Arial" w:hAnsi="Arial" w:cs="Arial"/>
+                  <w:sz w:val="22"/>
+                  <w:szCs w:val="22"/>
+                  <w:lang w:val="en-US"/>
+                </w:rPr>
+                <w:t>m</w:t>
+              </w:r>
+              <w:r>
+                <w:rPr>
+                  <w:rStyle w:val="Hyperlink"/>
+                  <w:rFonts w:ascii="Arial" w:hAnsi="Arial" w:cs="Arial"/>
+                  <w:sz w:val="22"/>
+                  <w:szCs w:val="22"/>
+                  <w:lang w:val="en-US"/>
+                </w:rPr>
+                <w:t>/BIT-Studio-3/project-26-1-red-team/issues/98\</w:t>
+              </w:r>
+            </w:hyperlink>
+          </w:p>
+          <w:p>
+            <w:pPr>
+              <w:pStyle w:val="paragraph"/>
+              <w:spacing w:before="0" w:beforeAutospacing="0" w:after="0" w:afterAutospacing="0"/>
+              <w:ind w:left="25"/>
+              <w:textAlignment w:val="baseline"/>
+              <w:rPr>
+                <w:rFonts w:ascii="Arial" w:hAnsi="Arial" w:cs="Arial"/>
+                <w:sz w:val="22"/>
+                <w:szCs w:val="22"/>
+                <w:lang w:val="en-US"/>
+              </w:rPr>
+            </w:pPr>
+            <w:r>
+              <w:rPr>
+                <w:rFonts w:ascii="Arial" w:hAnsi="Arial" w:cs="Arial"/>
+                <w:sz w:val="22"/>
+                <w:szCs w:val="22"/>
+                <w:lang w:val="en-US"/>
+              </w:rPr>
+              <w:drawing>
+                <wp:inline distT="0" distB="0" distL="0" distR="0" wp14:anchorId="124E7177" wp14:editId="19162156">
+                  <wp:extent cx="5606415" cy="1352102"/>
+                  <wp:effectExtent l="0" t="0" r="0" b="635"/>
+                  <wp:docPr id="1813716185" name="Picture 1"/>
+                  <wp:cNvGraphicFramePr>
+                    <a:graphicFrameLocks xmlns:a="http://schemas.openxmlformats.org/drawingml/2006/main" noChangeAspect="1"/>
+                  </wp:cNvGraphicFramePr>
+                  <a:graphic xmlns:a="http://schemas.openxmlformats.org/drawingml/2006/main">
+                    <a:graphicData uri="http://schemas.openxmlformats.org/drawingml/2006/picture">
+                      <pic:pic xmlns:pic="http://schemas.openxmlformats.org/drawingml/2006/picture">
+                        <pic:nvPicPr>
+                          <pic:cNvPr id="1813716185" name=""/>
+                          <pic:cNvPicPr/>
+                        </pic:nvPicPr>
+                        <pic:blipFill>
+                          <a:blip r:embed="rId11"/>
+                          <a:stretch>
+                            <a:fillRect/>
+                          </a:stretch>
+                        </pic:blipFill>
+                        <pic:spPr>
+                          <a:xfrm>
+                            <a:off x="0" y="0"/>
+                            <a:ext cx="5641101" cy="1360467"/>
+                          </a:xfrm>
+                          <a:prstGeom prst="rect">
+                            <a:avLst/>
+                          </a:prstGeom>
+                        </pic:spPr>
+                      </pic:pic>
+                    </a:graphicData>
+                  </a:graphic>
+                </wp:inline>
+              </w:drawing>
+            </w:r>
+          </w:p>
+          <w:p>
+            <w:pPr>
+              <w:pStyle w:val="paragraph"/>
+              <w:spacing w:before="0" w:beforeAutospacing="0" w:after="0" w:afterAutospacing="0"/>
+              <w:ind w:left="25"/>
+              <w:textAlignment w:val="baseline"/>
+              <w:rPr>
+                <w:rStyle w:val="normaltextrun"/>
+                <w:rFonts w:ascii="Arial" w:hAnsi="Arial" w:cs="Arial"/>
+                <w:sz w:val="22"/>
+                <w:szCs w:val="22"/>
+              </w:rPr>
+            </w:pPr>
+          </w:p>
+          <w:p>
+            <w:pPr>
+              <w:pStyle w:val="paragraph"/>
+              <w:spacing w:before="0" w:beforeAutospacing="0" w:after="0" w:afterAutospacing="0"/>
+              <w:ind w:left="25"/>
+              <w:textAlignment w:val="baseline"/>
+              <w:rPr>
+                <w:rStyle w:val="normaltextrun"/>
+                <w:rFonts w:ascii="Arial" w:hAnsi="Arial" w:cs="Arial"/>
+                <w:sz w:val="22"/>
+                <w:szCs w:val="22"/>
               </w:rPr>
             </w:pPr>
           </w:p>
@@ -1748,7 +1767,7 @@
           <w:p>
             <w:pPr>
               <w:pStyle w:val="paragraph"/>
-              <w:spacing w:before="0" w:beforeAutospacing="off" w:after="0" w:afterAutospacing="off"/>
+              <w:spacing w:before="0" w:beforeAutospacing="0" w:after="0" w:afterAutospacing="0"/>
               <w:ind w:left="25"/>
               <w:textAlignment w:val="baseline"/>
               <w:rPr>
@@ -1758,7 +1777,7 @@
                 <w:lang w:val="en-GB"/>
               </w:rPr>
             </w:pPr>
-            <w:hyperlink r:id="Rd6fc3a49fc8e49d1">
+            <w:hyperlink r:id="rId12">
               <w:r>
                 <w:rPr>
                   <w:rStyle w:val="Hyperlink"/>
@@ -1767,24 +1786,8 @@
                   <w:szCs w:val="22"/>
                   <w:lang w:val="en-GB"/>
                 </w:rPr>
-                <w:t>https://github.com/BIT-Studio-3/project-26-1-red-team/pull/39</w:t>
+                <w:t>https://github.com/BIT-Studio-3/project-26-1-red-</w:t>
               </w:r>
-            </w:hyperlink>
-          </w:p>
-          <w:p>
-            <w:pPr>
-              <w:pStyle w:val="paragraph"/>
-              <w:spacing w:before="0" w:beforeAutospacing="off" w:after="0" w:afterAutospacing="off"/>
-              <w:ind w:left="25"/>
-              <w:textAlignment w:val="baseline"/>
-              <w:rPr>
-                <w:rFonts w:ascii="Arial" w:hAnsi="Arial" w:cs="Arial"/>
-                <w:sz w:val="22"/>
-                <w:szCs w:val="22"/>
-                <w:lang w:val="en-GB"/>
-              </w:rPr>
-            </w:pPr>
-            <w:hyperlink r:id="Ra9d07ce1671e4844">
               <w:r>
                 <w:rPr>
                   <w:rStyle w:val="Hyperlink"/>
@@ -1793,14 +1796,70 @@
                   <w:szCs w:val="22"/>
                   <w:lang w:val="en-GB"/>
                 </w:rPr>
-                <w:t>https://github.com/BIT-Studio-3/project-26-1-red-team/pull/64</w:t>
+                <w:t>t</w:t>
+              </w:r>
+              <w:r>
+                <w:rPr>
+                  <w:rStyle w:val="Hyperlink"/>
+                  <w:rFonts w:ascii="Arial" w:hAnsi="Arial" w:cs="Arial"/>
+                  <w:sz w:val="22"/>
+                  <w:szCs w:val="22"/>
+                  <w:lang w:val="en-GB"/>
+                </w:rPr>
+                <w:t>eam/pull/39</w:t>
               </w:r>
             </w:hyperlink>
           </w:p>
           <w:p>
             <w:pPr>
               <w:pStyle w:val="paragraph"/>
-              <w:spacing w:before="0" w:beforeAutospacing="off" w:after="0" w:afterAutospacing="off"/>
+              <w:spacing w:before="0" w:beforeAutospacing="0" w:after="0" w:afterAutospacing="0"/>
+              <w:ind w:left="25"/>
+              <w:textAlignment w:val="baseline"/>
+              <w:rPr>
+                <w:rFonts w:ascii="Arial" w:hAnsi="Arial" w:cs="Arial"/>
+                <w:sz w:val="22"/>
+                <w:szCs w:val="22"/>
+                <w:lang w:val="en-GB"/>
+              </w:rPr>
+            </w:pPr>
+            <w:hyperlink r:id="rId13">
+              <w:r>
+                <w:rPr>
+                  <w:rStyle w:val="Hyperlink"/>
+                  <w:rFonts w:ascii="Arial" w:hAnsi="Arial" w:cs="Arial"/>
+                  <w:sz w:val="22"/>
+                  <w:szCs w:val="22"/>
+                  <w:lang w:val="en-GB"/>
+                </w:rPr>
+                <w:t>https://github.com/BIT-Studio-3/proj</w:t>
+              </w:r>
+              <w:r>
+                <w:rPr>
+                  <w:rStyle w:val="Hyperlink"/>
+                  <w:rFonts w:ascii="Arial" w:hAnsi="Arial" w:cs="Arial"/>
+                  <w:sz w:val="22"/>
+                  <w:szCs w:val="22"/>
+                  <w:lang w:val="en-GB"/>
+                </w:rPr>
+                <w:t>e</w:t>
+              </w:r>
+              <w:r>
+                <w:rPr>
+                  <w:rStyle w:val="Hyperlink"/>
+                  <w:rFonts w:ascii="Arial" w:hAnsi="Arial" w:cs="Arial"/>
+                  <w:sz w:val="22"/>
+                  <w:szCs w:val="22"/>
+                  <w:lang w:val="en-GB"/>
+                </w:rPr>
+                <w:t>ct-26-1-red-team/pull/64</w:t>
+              </w:r>
+            </w:hyperlink>
+          </w:p>
+          <w:p>
+            <w:pPr>
+              <w:pStyle w:val="paragraph"/>
+              <w:spacing w:before="0" w:beforeAutospacing="0" w:after="0" w:afterAutospacing="0"/>
               <w:ind w:left="25"/>
               <w:rPr>
                 <w:rFonts w:ascii="Arial" w:hAnsi="Arial" w:cs="Arial"/>
@@ -1888,7 +1947,7 @@
           <w:p>
             <w:pPr>
               <w:pStyle w:val="paragraph"/>
-              <w:spacing w:before="0" w:beforeAutospacing="off" w:after="0" w:afterAutospacing="off"/>
+              <w:spacing w:before="0" w:beforeAutospacing="0" w:after="0" w:afterAutospacing="0"/>
               <w:ind w:left="25"/>
               <w:textAlignment w:val="baseline"/>
               <w:rPr>
@@ -1905,61 +1964,36 @@
                 <w:szCs w:val="22"/>
                 <w:lang w:val="en-US"/>
               </w:rPr>
-              <w:t>We’ve</w:t>
-            </w:r>
-            <w:r>
-              <w:rPr>
-                <w:rFonts w:ascii="Arial" w:hAnsi="Arial" w:cs="Arial"/>
-                <w:sz w:val="22"/>
-                <w:szCs w:val="22"/>
-                <w:lang w:val="en-US"/>
-              </w:rPr>
-              <w:t xml:space="preserve"> gathered information weekly (at a minimum) from the product owner and ensured we were on the right track when it came to user compatibility. </w:t>
-            </w:r>
-            <w:r>
-              <w:rPr>
-                <w:rFonts w:ascii="Arial" w:hAnsi="Arial" w:cs="Arial"/>
-                <w:sz w:val="22"/>
-                <w:szCs w:val="22"/>
-                <w:lang w:val="en-US"/>
-              </w:rPr>
-              <w:t xml:space="preserve">I made sure to ask our product owner more </w:t>
-            </w:r>
-            <w:r>
-              <w:rPr>
-                <w:rFonts w:ascii="Arial" w:hAnsi="Arial" w:cs="Arial"/>
-                <w:sz w:val="22"/>
-                <w:szCs w:val="22"/>
-                <w:lang w:val="en-US"/>
-              </w:rPr>
-              <w:t>frequently</w:t>
-            </w:r>
-            <w:r>
-              <w:rPr>
-                <w:rFonts w:ascii="Arial" w:hAnsi="Arial" w:cs="Arial"/>
-                <w:sz w:val="22"/>
-                <w:szCs w:val="22"/>
-                <w:lang w:val="en-US"/>
-              </w:rPr>
-              <w:t xml:space="preserve"> when it seemed like our progress was slowing or veering off track. </w:t>
-            </w:r>
-            <w:r>
-              <w:rPr>
-                <w:rFonts w:ascii="Arial" w:hAnsi="Arial" w:cs="Arial"/>
-                <w:sz w:val="22"/>
-                <w:szCs w:val="22"/>
-                <w:lang w:val="en-US"/>
-              </w:rPr>
-              <w:t>I’ve</w:t>
-            </w:r>
-            <w:r>
-              <w:rPr>
-                <w:rFonts w:ascii="Arial" w:hAnsi="Arial" w:cs="Arial"/>
-                <w:sz w:val="22"/>
-                <w:szCs w:val="22"/>
-                <w:lang w:val="en-US"/>
-              </w:rPr>
-              <w:t xml:space="preserve"> also included various methods to </w:t>
+              <w:t xml:space="preserve">We’ve gathered </w:t>
+            </w:r>
+            <w:proofErr w:type="gramStart"/>
+            <w:r>
+              <w:rPr>
+                <w:rFonts w:ascii="Arial" w:hAnsi="Arial" w:cs="Arial"/>
+                <w:sz w:val="22"/>
+                <w:szCs w:val="22"/>
+                <w:lang w:val="en-US"/>
+              </w:rPr>
+              <w:t>information weekly</w:t>
+            </w:r>
+            <w:proofErr w:type="gramEnd"/>
+            <w:r>
+              <w:rPr>
+                <w:rFonts w:ascii="Arial" w:hAnsi="Arial" w:cs="Arial"/>
+                <w:sz w:val="22"/>
+                <w:szCs w:val="22"/>
+                <w:lang w:val="en-US"/>
+              </w:rPr>
+              <w:t xml:space="preserve"> (at a minimum) from the product owner and ensured we were on the right track when it came to user compatibility. </w:t>
+            </w:r>
+            <w:r>
+              <w:rPr>
+                <w:rFonts w:ascii="Arial" w:hAnsi="Arial" w:cs="Arial"/>
+                <w:sz w:val="22"/>
+                <w:szCs w:val="22"/>
+                <w:lang w:val="en-US"/>
+              </w:rPr>
+              <w:t xml:space="preserve">I made sure to ask our product owner more frequently when it seemed like our progress was slowing or veering off track. I’ve also included various methods to </w:t>
             </w:r>
             <w:r>
               <w:rPr>
@@ -2028,7 +2062,7 @@
           <w:p>
             <w:pPr>
               <w:pStyle w:val="paragraph"/>
-              <w:spacing w:before="0" w:beforeAutospacing="off" w:after="0" w:afterAutospacing="off"/>
+              <w:spacing w:before="0" w:beforeAutospacing="0" w:after="0" w:afterAutospacing="0"/>
               <w:ind w:left="25"/>
               <w:rPr>
                 <w:rFonts w:ascii="Arial" w:hAnsi="Arial" w:cs="Arial"/>
@@ -2130,7 +2164,7 @@
           <w:p>
             <w:pPr>
               <w:pStyle w:val="paragraph"/>
-              <w:spacing w:before="0" w:beforeAutospacing="off" w:after="0" w:afterAutospacing="off"/>
+              <w:spacing w:before="0" w:beforeAutospacing="0" w:after="0" w:afterAutospacing="0"/>
               <w:ind w:left="25"/>
               <w:textAlignment w:val="baseline"/>
               <w:rPr>
@@ -2141,7 +2175,7 @@
                 <w:lang w:val="en-US"/>
               </w:rPr>
             </w:pPr>
-            <w:hyperlink r:id="R5d5e69d8738f45a0">
+            <w:hyperlink r:id="rId14">
               <w:r>
                 <w:rPr>
                   <w:rStyle w:val="Hyperlink"/>
@@ -2157,7 +2191,7 @@
           <w:p>
             <w:pPr>
               <w:pStyle w:val="paragraph"/>
-              <w:spacing w:before="0" w:beforeAutospacing="off" w:after="0" w:afterAutospacing="off"/>
+              <w:spacing w:before="0" w:beforeAutospacing="0" w:after="0" w:afterAutospacing="0"/>
               <w:ind w:left="25"/>
               <w:rPr>
                 <w:rStyle w:val="eop"/>
@@ -2167,7 +2201,7 @@
                 <w:lang w:val="en-US"/>
               </w:rPr>
             </w:pPr>
-            <w:hyperlink r:id="R6293f4c131c04311">
+            <w:hyperlink r:id="rId15">
               <w:r>
                 <w:rPr>
                   <w:rStyle w:val="Hyperlink"/>
@@ -2183,7 +2217,7 @@
           <w:p>
             <w:pPr>
               <w:pStyle w:val="paragraph"/>
-              <w:spacing w:before="0" w:beforeAutospacing="off" w:after="0" w:afterAutospacing="off"/>
+              <w:spacing w:before="0" w:beforeAutospacing="0" w:after="0" w:afterAutospacing="0"/>
               <w:ind w:left="25"/>
               <w:rPr>
                 <w:rStyle w:val="eop"/>
@@ -2197,7 +2231,7 @@
           <w:p>
             <w:pPr>
               <w:pStyle w:val="paragraph"/>
-              <w:spacing w:before="0" w:beforeAutospacing="off" w:after="0" w:afterAutospacing="off"/>
+              <w:spacing w:before="0" w:beforeAutospacing="0" w:after="0" w:afterAutospacing="0"/>
               <w:ind w:left="25"/>
               <w:textAlignment w:val="baseline"/>
               <w:rPr>
@@ -2220,7 +2254,7 @@
           <w:p>
             <w:pPr>
               <w:pStyle w:val="paragraph"/>
-              <w:spacing w:before="0" w:beforeAutospacing="off" w:after="0" w:afterAutospacing="off"/>
+              <w:spacing w:before="0" w:beforeAutospacing="0" w:after="0" w:afterAutospacing="0"/>
               <w:ind w:left="25"/>
               <w:rPr>
                 <w:rFonts w:ascii="Arial" w:hAnsi="Arial" w:cs="Arial"/>
@@ -2327,7 +2361,7 @@
           <w:p>
             <w:pPr>
               <w:pStyle w:val="paragraph"/>
-              <w:spacing w:before="0" w:beforeAutospacing="off" w:after="0" w:afterAutospacing="off"/>
+              <w:spacing w:before="0" w:beforeAutospacing="0" w:after="0" w:afterAutospacing="0"/>
               <w:ind w:left="25"/>
               <w:textAlignment w:val="baseline"/>
               <w:rPr>
@@ -2362,7 +2396,27 @@
                 <w:szCs w:val="22"/>
                 <w:lang w:val="en-US"/>
               </w:rPr>
-              <w:t>meetings and helping each other out with various coding issues.</w:t>
+              <w:t xml:space="preserve">meetings and </w:t>
+            </w:r>
+            <w:proofErr w:type="gramStart"/>
+            <w:r>
+              <w:rPr>
+                <w:rFonts w:ascii="Arial" w:hAnsi="Arial" w:cs="Arial"/>
+                <w:sz w:val="22"/>
+                <w:szCs w:val="22"/>
+                <w:lang w:val="en-US"/>
+              </w:rPr>
+              <w:t>helping</w:t>
+            </w:r>
+            <w:proofErr w:type="gramEnd"/>
+            <w:r>
+              <w:rPr>
+                <w:rFonts w:ascii="Arial" w:hAnsi="Arial" w:cs="Arial"/>
+                <w:sz w:val="22"/>
+                <w:szCs w:val="22"/>
+                <w:lang w:val="en-US"/>
+              </w:rPr>
+              <w:t xml:space="preserve"> each other out with various coding issues.</w:t>
             </w:r>
             <w:r>
               <w:rPr>
@@ -2380,43 +2434,37 @@
                 <w:szCs w:val="22"/>
                 <w:lang w:val="en-US"/>
               </w:rPr>
-              <w:t>I’ve</w:t>
-            </w:r>
-            <w:r>
-              <w:rPr>
-                <w:rFonts w:ascii="Arial" w:hAnsi="Arial" w:cs="Arial"/>
-                <w:sz w:val="22"/>
-                <w:szCs w:val="22"/>
-                <w:lang w:val="en-US"/>
-              </w:rPr>
-              <w:t xml:space="preserve"> also been communicating through Teams when necessary.</w:t>
-            </w:r>
-          </w:p>
-          <w:p>
-            <w:pPr>
-              <w:pStyle w:val="paragraph"/>
-              <w:spacing w:before="0" w:beforeAutospacing="off" w:after="0" w:afterAutospacing="off"/>
+              <w:t>I’ve also been communicating through Teams when necessary.</w:t>
+            </w:r>
+          </w:p>
+          <w:p>
+            <w:pPr>
+              <w:pStyle w:val="paragraph"/>
+              <w:spacing w:before="0" w:beforeAutospacing="0" w:after="0" w:afterAutospacing="0"/>
               <w:ind w:left="25"/>
               <w:textAlignment w:val="baseline"/>
             </w:pPr>
             <w:r>
+              <w:rPr>
+                <w:noProof/>
+              </w:rPr>
               <w:drawing>
-                <wp:inline wp14:editId="40A1E14C" wp14:anchorId="67AC8A30">
+                <wp:inline distT="0" distB="0" distL="0" distR="0" wp14:anchorId="67AC8A30" wp14:editId="40A1E14C">
                   <wp:extent cx="5572125" cy="2571750"/>
                   <wp:effectExtent l="0" t="0" r="0" b="0"/>
                   <wp:docPr id="331334840" name="drawing"/>
                   <wp:cNvGraphicFramePr>
-                    <a:graphicFrameLocks noChangeAspect="1"/>
+                    <a:graphicFrameLocks xmlns:a="http://schemas.openxmlformats.org/drawingml/2006/main" noChangeAspect="1"/>
                   </wp:cNvGraphicFramePr>
-                  <a:graphic>
-                    <a:graphicData xmlns:a="http://schemas.openxmlformats.org/drawingml/2006/main" uri="http://schemas.openxmlformats.org/drawingml/2006/picture">
+                  <a:graphic xmlns:a="http://schemas.openxmlformats.org/drawingml/2006/main">
+                    <a:graphicData uri="http://schemas.openxmlformats.org/drawingml/2006/picture">
                       <pic:pic xmlns:pic="http://schemas.openxmlformats.org/drawingml/2006/picture">
                         <pic:nvPicPr>
                           <pic:cNvPr id="331334840" name="Picture 331334840"/>
                           <pic:cNvPicPr/>
                         </pic:nvPicPr>
                         <pic:blipFill>
-                          <a:blip xmlns:r="http://schemas.openxmlformats.org/officeDocument/2006/relationships" r:embed="rId749722260">
+                          <a:blip r:embed="rId16">
                             <a:extLst>
                               <a:ext uri="{28A0092B-C50C-407E-A947-70E740481C1C}">
                                 <a14:useLocalDpi xmlns:a14="http://schemas.microsoft.com/office/drawing/2010/main"/>
@@ -2446,7 +2494,7 @@
           <w:p>
             <w:pPr>
               <w:pStyle w:val="paragraph"/>
-              <w:spacing w:before="0" w:beforeAutospacing="off" w:after="0" w:afterAutospacing="off"/>
+              <w:spacing w:before="0" w:beforeAutospacing="0" w:after="0" w:afterAutospacing="0"/>
               <w:ind w:left="25"/>
               <w:rPr>
                 <w:rFonts w:ascii="Arial" w:hAnsi="Arial" w:cs="Arial"/>
@@ -2471,22 +2519,13 @@
                 <w:szCs w:val="22"/>
                 <w:lang w:val="en-US"/>
               </w:rPr>
-              <w:t xml:space="preserve"> Going forward, I’ll</w:t>
-            </w:r>
-            <w:r>
-              <w:rPr>
-                <w:rFonts w:ascii="Arial" w:hAnsi="Arial" w:cs="Arial"/>
-                <w:sz w:val="22"/>
-                <w:szCs w:val="22"/>
-                <w:lang w:val="en-US"/>
-              </w:rPr>
-              <w:t xml:space="preserve"> do my best to ensure that personal business doesn’t interfere with prior group commitments.</w:t>
-            </w:r>
-          </w:p>
-          <w:p>
-            <w:pPr>
-              <w:pStyle w:val="paragraph"/>
-              <w:spacing w:before="0" w:beforeAutospacing="off" w:after="0" w:afterAutospacing="off"/>
+              <w:t xml:space="preserve"> Going forward, I’ll do my best to ensure that personal business doesn’t interfere with prior group commitments.</w:t>
+            </w:r>
+          </w:p>
+          <w:p>
+            <w:pPr>
+              <w:pStyle w:val="paragraph"/>
+              <w:spacing w:before="0" w:beforeAutospacing="0" w:after="0" w:afterAutospacing="0"/>
               <w:ind w:left="25"/>
               <w:rPr>
                 <w:rFonts w:ascii="Arial" w:hAnsi="Arial" w:cs="Arial"/>
@@ -2573,27 +2612,30 @@
           <w:p>
             <w:pPr>
               <w:pStyle w:val="paragraph"/>
-              <w:spacing w:before="0" w:beforeAutospacing="off" w:after="0" w:afterAutospacing="off"/>
+              <w:spacing w:before="0" w:beforeAutospacing="0" w:after="0" w:afterAutospacing="0"/>
               <w:ind w:left="25"/>
             </w:pPr>
             <w:r>
+              <w:rPr>
+                <w:noProof/>
+              </w:rPr>
               <w:drawing>
-                <wp:inline wp14:editId="0E7D63FE" wp14:anchorId="7DB382C0">
+                <wp:inline distT="0" distB="0" distL="0" distR="0" wp14:anchorId="7DB382C0" wp14:editId="0E7D63FE">
                   <wp:extent cx="5228571" cy="2600000"/>
                   <wp:effectExtent l="0" t="0" r="0" b="0"/>
                   <wp:docPr id="694993524" name="drawing"/>
                   <wp:cNvGraphicFramePr>
-                    <a:graphicFrameLocks noChangeAspect="1"/>
+                    <a:graphicFrameLocks xmlns:a="http://schemas.openxmlformats.org/drawingml/2006/main" noChangeAspect="1"/>
                   </wp:cNvGraphicFramePr>
-                  <a:graphic>
-                    <a:graphicData xmlns:a="http://schemas.openxmlformats.org/drawingml/2006/main" uri="http://schemas.openxmlformats.org/drawingml/2006/picture">
+                  <a:graphic xmlns:a="http://schemas.openxmlformats.org/drawingml/2006/main">
+                    <a:graphicData uri="http://schemas.openxmlformats.org/drawingml/2006/picture">
                       <pic:pic xmlns:pic="http://schemas.openxmlformats.org/drawingml/2006/picture">
                         <pic:nvPicPr>
                           <pic:cNvPr id="694993524" name="Picture 694993524"/>
                           <pic:cNvPicPr/>
                         </pic:nvPicPr>
                         <pic:blipFill>
-                          <a:blip xmlns:r="http://schemas.openxmlformats.org/officeDocument/2006/relationships" r:embed="rId1969938474">
+                          <a:blip r:embed="rId17">
                             <a:extLst>
                               <a:ext uri="{28A0092B-C50C-407E-A947-70E740481C1C}">
                                 <a14:useLocalDpi xmlns:a14="http://schemas.microsoft.com/office/drawing/2010/main"/>
@@ -2623,7 +2665,7 @@
           <w:p>
             <w:pPr>
               <w:pStyle w:val="paragraph"/>
-              <w:spacing w:before="0" w:beforeAutospacing="off" w:after="0" w:afterAutospacing="off"/>
+              <w:spacing w:before="0" w:beforeAutospacing="0" w:after="0" w:afterAutospacing="0"/>
               <w:ind w:left="25"/>
               <w:textAlignment w:val="baseline"/>
               <w:rPr>
@@ -2640,31 +2682,33 @@
                 <w:szCs w:val="22"/>
                 <w:lang w:val="en-US"/>
               </w:rPr>
-              <w:t xml:space="preserve">I had a pretty strong presence early </w:t>
-            </w:r>
-            <w:r>
-              <w:rPr>
-                <w:rFonts w:ascii="Arial" w:hAnsi="Arial" w:cs="Arial"/>
-                <w:sz w:val="22"/>
-                <w:szCs w:val="22"/>
-                <w:lang w:val="en-US"/>
-              </w:rPr>
-              <w:t>on,</w:t>
-            </w:r>
-            <w:r>
-              <w:rPr>
-                <w:rFonts w:ascii="Arial" w:hAnsi="Arial" w:cs="Arial"/>
-                <w:sz w:val="22"/>
-                <w:szCs w:val="22"/>
-                <w:lang w:val="en-US"/>
-              </w:rPr>
-              <w:t xml:space="preserve"> but I will admit that I’ve been dropping off a small bit due to complications with other classes and life getting in the way.</w:t>
-            </w:r>
-          </w:p>
-          <w:p>
-            <w:pPr>
-              <w:pStyle w:val="paragraph"/>
-              <w:spacing w:before="0" w:beforeAutospacing="off" w:after="0" w:afterAutospacing="off"/>
+              <w:t xml:space="preserve">I had a </w:t>
+            </w:r>
+            <w:proofErr w:type="gramStart"/>
+            <w:r>
+              <w:rPr>
+                <w:rFonts w:ascii="Arial" w:hAnsi="Arial" w:cs="Arial"/>
+                <w:sz w:val="22"/>
+                <w:szCs w:val="22"/>
+                <w:lang w:val="en-US"/>
+              </w:rPr>
+              <w:t>pretty strong</w:t>
+            </w:r>
+            <w:proofErr w:type="gramEnd"/>
+            <w:r>
+              <w:rPr>
+                <w:rFonts w:ascii="Arial" w:hAnsi="Arial" w:cs="Arial"/>
+                <w:sz w:val="22"/>
+                <w:szCs w:val="22"/>
+                <w:lang w:val="en-US"/>
+              </w:rPr>
+              <w:t xml:space="preserve"> presence early on, but I will admit that I’ve been dropping off a small bit due to complications with other classes and life getting in the way.</w:t>
+            </w:r>
+          </w:p>
+          <w:p>
+            <w:pPr>
+              <w:pStyle w:val="paragraph"/>
+              <w:spacing w:before="0" w:beforeAutospacing="0" w:after="0" w:afterAutospacing="0"/>
               <w:ind w:left="25"/>
               <w:rPr>
                 <w:rFonts w:ascii="Arial" w:hAnsi="Arial" w:cs="Arial"/>
@@ -2695,6 +2739,7 @@
                 <w:sz w:val="22"/>
                 <w:szCs w:val="22"/>
               </w:rPr>
+              <w:lastRenderedPageBreak/>
               <w:t>Contribute to producing safe, accessible, usable and useful software</w:t>
             </w:r>
             <w:r>
@@ -2751,7 +2796,7 @@
           <w:p>
             <w:pPr>
               <w:pStyle w:val="paragraph"/>
-              <w:spacing w:before="0" w:beforeAutospacing="off" w:after="0" w:afterAutospacing="off"/>
+              <w:spacing w:before="0" w:beforeAutospacing="0" w:after="0" w:afterAutospacing="0"/>
               <w:ind w:left="25"/>
               <w:textAlignment w:val="baseline"/>
               <w:rPr>
@@ -2768,42 +2813,36 @@
                 <w:szCs w:val="22"/>
                 <w:lang w:val="en-US"/>
               </w:rPr>
-              <w:t>I’ve</w:t>
-            </w:r>
-            <w:r>
-              <w:rPr>
-                <w:rFonts w:ascii="Arial" w:hAnsi="Arial" w:cs="Arial"/>
-                <w:sz w:val="22"/>
-                <w:szCs w:val="22"/>
-                <w:lang w:val="en-US"/>
-              </w:rPr>
-              <w:t xml:space="preserve"> added a dark mode to the site to reduce eye strain when viewing for extended periods or at night.</w:t>
-            </w:r>
-          </w:p>
-          <w:p>
-            <w:pPr>
-              <w:pStyle w:val="paragraph"/>
-              <w:spacing w:before="0" w:beforeAutospacing="off" w:after="0" w:afterAutospacing="off"/>
+              <w:t>I’ve added a dark mode to the site to reduce eye strain when viewing for extended periods or at night.</w:t>
+            </w:r>
+          </w:p>
+          <w:p>
+            <w:pPr>
+              <w:pStyle w:val="paragraph"/>
+              <w:spacing w:before="0" w:beforeAutospacing="0" w:after="0" w:afterAutospacing="0"/>
               <w:ind w:left="25"/>
             </w:pPr>
             <w:r>
+              <w:rPr>
+                <w:noProof/>
+              </w:rPr>
               <w:drawing>
-                <wp:inline wp14:editId="5A4492CA" wp14:anchorId="28CA0484">
+                <wp:inline distT="0" distB="0" distL="0" distR="0" wp14:anchorId="28CA0484" wp14:editId="5A4492CA">
                   <wp:extent cx="5572125" cy="2838450"/>
                   <wp:effectExtent l="0" t="0" r="0" b="0"/>
                   <wp:docPr id="238259084" name="drawing"/>
                   <wp:cNvGraphicFramePr>
-                    <a:graphicFrameLocks noChangeAspect="1"/>
+                    <a:graphicFrameLocks xmlns:a="http://schemas.openxmlformats.org/drawingml/2006/main" noChangeAspect="1"/>
                   </wp:cNvGraphicFramePr>
-                  <a:graphic>
-                    <a:graphicData xmlns:a="http://schemas.openxmlformats.org/drawingml/2006/main" uri="http://schemas.openxmlformats.org/drawingml/2006/picture">
+                  <a:graphic xmlns:a="http://schemas.openxmlformats.org/drawingml/2006/main">
+                    <a:graphicData uri="http://schemas.openxmlformats.org/drawingml/2006/picture">
                       <pic:pic xmlns:pic="http://schemas.openxmlformats.org/drawingml/2006/picture">
                         <pic:nvPicPr>
                           <pic:cNvPr id="238259084" name="Picture 238259084"/>
                           <pic:cNvPicPr/>
                         </pic:nvPicPr>
                         <pic:blipFill>
-                          <a:blip xmlns:r="http://schemas.openxmlformats.org/officeDocument/2006/relationships" r:embed="rId1370205352">
+                          <a:blip r:embed="rId18">
                             <a:extLst>
                               <a:ext uri="{28A0092B-C50C-407E-A947-70E740481C1C}">
                                 <a14:useLocalDpi xmlns:a14="http://schemas.microsoft.com/office/drawing/2010/main"/>
@@ -2830,23 +2869,26 @@
               </w:drawing>
             </w:r>
             <w:r>
+              <w:rPr>
+                <w:noProof/>
+              </w:rPr>
               <w:drawing>
-                <wp:inline wp14:editId="679FD135" wp14:anchorId="4AD3D58B">
+                <wp:inline distT="0" distB="0" distL="0" distR="0" wp14:anchorId="4AD3D58B" wp14:editId="679FD135">
                   <wp:extent cx="5572125" cy="3181350"/>
                   <wp:effectExtent l="0" t="0" r="0" b="0"/>
                   <wp:docPr id="726063474" name="drawing"/>
                   <wp:cNvGraphicFramePr>
-                    <a:graphicFrameLocks noChangeAspect="1"/>
+                    <a:graphicFrameLocks xmlns:a="http://schemas.openxmlformats.org/drawingml/2006/main" noChangeAspect="1"/>
                   </wp:cNvGraphicFramePr>
-                  <a:graphic>
-                    <a:graphicData xmlns:a="http://schemas.openxmlformats.org/drawingml/2006/main" uri="http://schemas.openxmlformats.org/drawingml/2006/picture">
+                  <a:graphic xmlns:a="http://schemas.openxmlformats.org/drawingml/2006/main">
+                    <a:graphicData uri="http://schemas.openxmlformats.org/drawingml/2006/picture">
                       <pic:pic xmlns:pic="http://schemas.openxmlformats.org/drawingml/2006/picture">
                         <pic:nvPicPr>
                           <pic:cNvPr id="726063474" name="Picture 726063474"/>
                           <pic:cNvPicPr/>
                         </pic:nvPicPr>
                         <pic:blipFill>
-                          <a:blip xmlns:r="http://schemas.openxmlformats.org/officeDocument/2006/relationships" r:embed="rId772530672">
+                          <a:blip r:embed="rId19">
                             <a:extLst>
                               <a:ext uri="{28A0092B-C50C-407E-A947-70E740481C1C}">
                                 <a14:useLocalDpi xmlns:a14="http://schemas.microsoft.com/office/drawing/2010/main"/>
@@ -2924,22 +2966,22 @@
           <w:p>
             <w:pPr>
               <w:pStyle w:val="paragraph"/>
-              <w:spacing w:before="0" w:beforeAutospacing="off" w:after="0" w:afterAutospacing="off"/>
+              <w:spacing w:before="0" w:beforeAutospacing="0" w:after="0" w:afterAutospacing="0"/>
               <w:textAlignment w:val="baseline"/>
               <w:rPr>
                 <w:rFonts w:ascii="Arial" w:hAnsi="Arial" w:cs="Arial"/>
-                <w:i w:val="1"/>
-                <w:iCs w:val="1"/>
-                <w:sz w:val="22"/>
-                <w:szCs w:val="22"/>
-                <w:lang w:val="en-US"/>
-              </w:rPr>
-            </w:pPr>
-            <w:r>
-              <w:rPr>
-                <w:rFonts w:ascii="Arial" w:hAnsi="Arial" w:cs="Arial"/>
-                <w:i w:val="1"/>
-                <w:iCs w:val="1"/>
+                <w:i/>
+                <w:iCs/>
+                <w:sz w:val="22"/>
+                <w:szCs w:val="22"/>
+                <w:lang w:val="en-US"/>
+              </w:rPr>
+            </w:pPr>
+            <w:r>
+              <w:rPr>
+                <w:rFonts w:ascii="Arial" w:hAnsi="Arial" w:cs="Arial"/>
+                <w:i/>
+                <w:iCs/>
                 <w:sz w:val="22"/>
                 <w:szCs w:val="22"/>
                 <w:lang w:val="en-US"/>
@@ -2950,152 +2992,38 @@
           <w:p>
             <w:pPr>
               <w:pStyle w:val="paragraph"/>
-              <w:spacing w:before="0" w:beforeAutospacing="off" w:after="0" w:afterAutospacing="off"/>
+              <w:spacing w:before="0" w:beforeAutospacing="0" w:after="0" w:afterAutospacing="0"/>
               <w:textAlignment w:val="baseline"/>
               <w:rPr>
                 <w:rFonts w:ascii="Arial" w:hAnsi="Arial" w:cs="Arial"/>
-                <w:i w:val="1"/>
-                <w:iCs w:val="1"/>
-                <w:sz w:val="22"/>
-                <w:szCs w:val="22"/>
-                <w:lang w:val="en-US"/>
-              </w:rPr>
-            </w:pPr>
-          </w:p>
-          <w:p>
-            <w:pPr>
-              <w:pStyle w:val="paragraph"/>
-              <w:spacing w:before="0" w:beforeAutospacing="off" w:after="0" w:afterAutospacing="off"/>
+                <w:i/>
+                <w:iCs/>
+                <w:sz w:val="22"/>
+                <w:szCs w:val="22"/>
+                <w:lang w:val="en-US"/>
+              </w:rPr>
+            </w:pPr>
+          </w:p>
+          <w:p>
+            <w:pPr>
+              <w:pStyle w:val="paragraph"/>
+              <w:spacing w:before="0" w:beforeAutospacing="0" w:after="0" w:afterAutospacing="0"/>
               <w:textAlignment w:val="baseline"/>
               <w:rPr>
                 <w:rFonts w:ascii="Arial" w:hAnsi="Arial" w:cs="Arial"/>
-                <w:i w:val="0"/>
-                <w:iCs w:val="0"/>
-                <w:sz w:val="22"/>
-                <w:szCs w:val="22"/>
-                <w:lang w:val="en-US"/>
-              </w:rPr>
-            </w:pPr>
-            <w:r>
-              <w:rPr>
-                <w:rFonts w:ascii="Arial" w:hAnsi="Arial" w:cs="Arial"/>
-                <w:i w:val="0"/>
-                <w:iCs w:val="0"/>
-                <w:sz w:val="22"/>
-                <w:szCs w:val="22"/>
-                <w:lang w:val="en-US"/>
-              </w:rPr>
-              <w:t xml:space="preserve">I </w:t>
-            </w:r>
-            <w:r>
-              <w:rPr>
-                <w:rFonts w:ascii="Arial" w:hAnsi="Arial" w:cs="Arial"/>
-                <w:i w:val="0"/>
-                <w:iCs w:val="0"/>
-                <w:sz w:val="22"/>
-                <w:szCs w:val="22"/>
-                <w:lang w:val="en-US"/>
-              </w:rPr>
-              <w:t>haven’t</w:t>
-            </w:r>
-            <w:r>
-              <w:rPr>
-                <w:rFonts w:ascii="Arial" w:hAnsi="Arial" w:cs="Arial"/>
-                <w:i w:val="0"/>
-                <w:iCs w:val="0"/>
-                <w:sz w:val="22"/>
-                <w:szCs w:val="22"/>
-                <w:lang w:val="en-US"/>
-              </w:rPr>
-              <w:t xml:space="preserve"> had the chance to be a scum </w:t>
-            </w:r>
-            <w:r>
-              <w:rPr>
-                <w:rFonts w:ascii="Arial" w:hAnsi="Arial" w:cs="Arial"/>
-                <w:i w:val="0"/>
-                <w:iCs w:val="0"/>
-                <w:sz w:val="22"/>
-                <w:szCs w:val="22"/>
-                <w:lang w:val="en-US"/>
-              </w:rPr>
-              <w:t>leader,</w:t>
-            </w:r>
-            <w:r>
-              <w:rPr>
-                <w:rFonts w:ascii="Arial" w:hAnsi="Arial" w:cs="Arial"/>
-                <w:i w:val="0"/>
-                <w:iCs w:val="0"/>
-                <w:sz w:val="22"/>
-                <w:szCs w:val="22"/>
-                <w:lang w:val="en-US"/>
-              </w:rPr>
-              <w:t xml:space="preserve"> but </w:t>
-            </w:r>
-            <w:r>
-              <w:rPr>
-                <w:rFonts w:ascii="Arial" w:hAnsi="Arial" w:cs="Arial"/>
-                <w:i w:val="0"/>
-                <w:iCs w:val="0"/>
-                <w:sz w:val="22"/>
-                <w:szCs w:val="22"/>
-                <w:lang w:val="en-US"/>
-              </w:rPr>
-              <w:t>I’ve</w:t>
-            </w:r>
-            <w:r>
-              <w:rPr>
-                <w:rFonts w:ascii="Arial" w:hAnsi="Arial" w:cs="Arial"/>
-                <w:i w:val="0"/>
-                <w:iCs w:val="0"/>
-                <w:sz w:val="22"/>
-                <w:szCs w:val="22"/>
-                <w:lang w:val="en-US"/>
-              </w:rPr>
-              <w:t xml:space="preserve"> pushed the team occasionally to speak with our product manager and to progress through team meetings. </w:t>
-            </w:r>
-            <w:r>
-              <w:rPr>
-                <w:rFonts w:ascii="Arial" w:hAnsi="Arial" w:cs="Arial"/>
-                <w:i w:val="0"/>
-                <w:iCs w:val="0"/>
-                <w:sz w:val="22"/>
-                <w:szCs w:val="22"/>
-                <w:lang w:val="en-US"/>
-              </w:rPr>
-              <w:t>I’ve</w:t>
-            </w:r>
-            <w:r>
-              <w:rPr>
-                <w:rFonts w:ascii="Arial" w:hAnsi="Arial" w:cs="Arial"/>
-                <w:i w:val="0"/>
-                <w:iCs w:val="0"/>
-                <w:sz w:val="22"/>
-                <w:szCs w:val="22"/>
-                <w:lang w:val="en-US"/>
-              </w:rPr>
-              <w:t xml:space="preserve"> also </w:t>
-            </w:r>
-            <w:r>
-              <w:rPr>
-                <w:rFonts w:ascii="Arial" w:hAnsi="Arial" w:cs="Arial"/>
-                <w:i w:val="0"/>
-                <w:iCs w:val="0"/>
-                <w:sz w:val="22"/>
-                <w:szCs w:val="22"/>
-                <w:lang w:val="en-US"/>
-              </w:rPr>
-              <w:t>requested</w:t>
-            </w:r>
-            <w:r>
-              <w:rPr>
-                <w:rFonts w:ascii="Arial" w:hAnsi="Arial" w:cs="Arial"/>
-                <w:i w:val="0"/>
-                <w:iCs w:val="0"/>
-                <w:sz w:val="22"/>
-                <w:szCs w:val="22"/>
-                <w:lang w:val="en-US"/>
-              </w:rPr>
-              <w:t xml:space="preserve"> that the team meet outside of our typical meeting times in class.</w:t>
+                <w:sz w:val="22"/>
+                <w:szCs w:val="22"/>
+                <w:lang w:val="en-US"/>
+              </w:rPr>
+            </w:pPr>
+            <w:r>
+              <w:rPr>
+                <w:rFonts w:ascii="Arial" w:hAnsi="Arial" w:cs="Arial"/>
+                <w:sz w:val="22"/>
+                <w:szCs w:val="22"/>
+                <w:lang w:val="en-US"/>
+              </w:rPr>
+              <w:t>I haven’t had the chance to be a scum leader, but I’ve pushed the team occasionally to speak with our product manager and to progress through team meetings. I’ve also requested that the team meet outside of our typical meeting times in class.</w:t>
             </w:r>
           </w:p>
         </w:tc>
@@ -3103,7 +3031,7 @@
     </w:tbl>
     <w:p/>
     <w:sectPr>
-      <w:pgSz w:w="11900" w:h="16840" w:orient="portrait"/>
+      <w:pgSz w:w="11900" w:h="16840"/>
       <w:pgMar w:top="1440" w:right="1080" w:bottom="1440" w:left="1080" w:header="708" w:footer="708" w:gutter="0"/>
       <w:cols w:space="708"/>
       <w:docGrid w:linePitch="360"/>
@@ -3143,7 +3071,7 @@
         <w:ind w:left="1440" w:hanging="360"/>
       </w:pPr>
       <w:rPr>
-        <w:rFonts w:hint="default" w:ascii="Symbol" w:hAnsi="Symbol"/>
+        <w:rFonts w:ascii="Symbol" w:hAnsi="Symbol" w:hint="default"/>
         <w:sz w:val="20"/>
       </w:rPr>
     </w:lvl>
@@ -3159,7 +3087,7 @@
         <w:ind w:left="2160" w:hanging="360"/>
       </w:pPr>
       <w:rPr>
-        <w:rFonts w:hint="default" w:ascii="Symbol" w:hAnsi="Symbol"/>
+        <w:rFonts w:ascii="Symbol" w:hAnsi="Symbol" w:hint="default"/>
         <w:sz w:val="20"/>
       </w:rPr>
     </w:lvl>
@@ -3175,7 +3103,7 @@
         <w:ind w:left="2880" w:hanging="360"/>
       </w:pPr>
       <w:rPr>
-        <w:rFonts w:hint="default" w:ascii="Symbol" w:hAnsi="Symbol"/>
+        <w:rFonts w:ascii="Symbol" w:hAnsi="Symbol" w:hint="default"/>
         <w:sz w:val="20"/>
       </w:rPr>
     </w:lvl>
@@ -3191,7 +3119,7 @@
         <w:ind w:left="3600" w:hanging="360"/>
       </w:pPr>
       <w:rPr>
-        <w:rFonts w:hint="default" w:ascii="Symbol" w:hAnsi="Symbol"/>
+        <w:rFonts w:ascii="Symbol" w:hAnsi="Symbol" w:hint="default"/>
         <w:sz w:val="20"/>
       </w:rPr>
     </w:lvl>
@@ -3207,7 +3135,7 @@
         <w:ind w:left="4320" w:hanging="360"/>
       </w:pPr>
       <w:rPr>
-        <w:rFonts w:hint="default" w:ascii="Symbol" w:hAnsi="Symbol"/>
+        <w:rFonts w:ascii="Symbol" w:hAnsi="Symbol" w:hint="default"/>
         <w:sz w:val="20"/>
       </w:rPr>
     </w:lvl>
@@ -3223,7 +3151,7 @@
         <w:ind w:left="5040" w:hanging="360"/>
       </w:pPr>
       <w:rPr>
-        <w:rFonts w:hint="default" w:ascii="Symbol" w:hAnsi="Symbol"/>
+        <w:rFonts w:ascii="Symbol" w:hAnsi="Symbol" w:hint="default"/>
         <w:sz w:val="20"/>
       </w:rPr>
     </w:lvl>
@@ -3239,7 +3167,7 @@
         <w:ind w:left="5760" w:hanging="360"/>
       </w:pPr>
       <w:rPr>
-        <w:rFonts w:hint="default" w:ascii="Symbol" w:hAnsi="Symbol"/>
+        <w:rFonts w:ascii="Symbol" w:hAnsi="Symbol" w:hint="default"/>
         <w:sz w:val="20"/>
       </w:rPr>
     </w:lvl>
@@ -3255,7 +3183,7 @@
         <w:ind w:left="6480" w:hanging="360"/>
       </w:pPr>
       <w:rPr>
-        <w:rFonts w:hint="default" w:ascii="Symbol" w:hAnsi="Symbol"/>
+        <w:rFonts w:ascii="Symbol" w:hAnsi="Symbol" w:hint="default"/>
         <w:sz w:val="20"/>
       </w:rPr>
     </w:lvl>
@@ -3402,7 +3330,7 @@
         <w:ind w:left="1440" w:hanging="360"/>
       </w:pPr>
       <w:rPr>
-        <w:rFonts w:hint="default" w:ascii="Symbol" w:hAnsi="Symbol"/>
+        <w:rFonts w:ascii="Symbol" w:hAnsi="Symbol" w:hint="default"/>
         <w:sz w:val="20"/>
       </w:rPr>
     </w:lvl>
@@ -3418,7 +3346,7 @@
         <w:ind w:left="2160" w:hanging="360"/>
       </w:pPr>
       <w:rPr>
-        <w:rFonts w:hint="default" w:ascii="Symbol" w:hAnsi="Symbol"/>
+        <w:rFonts w:ascii="Symbol" w:hAnsi="Symbol" w:hint="default"/>
         <w:sz w:val="20"/>
       </w:rPr>
     </w:lvl>
@@ -3434,7 +3362,7 @@
         <w:ind w:left="2880" w:hanging="360"/>
       </w:pPr>
       <w:rPr>
-        <w:rFonts w:hint="default" w:ascii="Symbol" w:hAnsi="Symbol"/>
+        <w:rFonts w:ascii="Symbol" w:hAnsi="Symbol" w:hint="default"/>
         <w:sz w:val="20"/>
       </w:rPr>
     </w:lvl>
@@ -3450,7 +3378,7 @@
         <w:ind w:left="3600" w:hanging="360"/>
       </w:pPr>
       <w:rPr>
-        <w:rFonts w:hint="default" w:ascii="Symbol" w:hAnsi="Symbol"/>
+        <w:rFonts w:ascii="Symbol" w:hAnsi="Symbol" w:hint="default"/>
         <w:sz w:val="20"/>
       </w:rPr>
     </w:lvl>
@@ -3466,7 +3394,7 @@
         <w:ind w:left="4320" w:hanging="360"/>
       </w:pPr>
       <w:rPr>
-        <w:rFonts w:hint="default" w:ascii="Symbol" w:hAnsi="Symbol"/>
+        <w:rFonts w:ascii="Symbol" w:hAnsi="Symbol" w:hint="default"/>
         <w:sz w:val="20"/>
       </w:rPr>
     </w:lvl>
@@ -3482,7 +3410,7 @@
         <w:ind w:left="5040" w:hanging="360"/>
       </w:pPr>
       <w:rPr>
-        <w:rFonts w:hint="default" w:ascii="Symbol" w:hAnsi="Symbol"/>
+        <w:rFonts w:ascii="Symbol" w:hAnsi="Symbol" w:hint="default"/>
         <w:sz w:val="20"/>
       </w:rPr>
     </w:lvl>
@@ -3498,7 +3426,7 @@
         <w:ind w:left="5760" w:hanging="360"/>
       </w:pPr>
       <w:rPr>
-        <w:rFonts w:hint="default" w:ascii="Symbol" w:hAnsi="Symbol"/>
+        <w:rFonts w:ascii="Symbol" w:hAnsi="Symbol" w:hint="default"/>
         <w:sz w:val="20"/>
       </w:rPr>
     </w:lvl>
@@ -3514,7 +3442,7 @@
         <w:ind w:left="6480" w:hanging="360"/>
       </w:pPr>
       <w:rPr>
-        <w:rFonts w:hint="default" w:ascii="Symbol" w:hAnsi="Symbol"/>
+        <w:rFonts w:ascii="Symbol" w:hAnsi="Symbol" w:hint="default"/>
         <w:sz w:val="20"/>
       </w:rPr>
     </w:lvl>
@@ -3655,7 +3583,7 @@
         <w:ind w:left="360" w:hanging="360"/>
       </w:pPr>
       <w:rPr>
-        <w:rFonts w:hint="default" w:ascii="Arial" w:hAnsi="Arial" w:cs="Arial"/>
+        <w:rFonts w:ascii="Arial" w:hAnsi="Arial" w:cs="Arial" w:hint="default"/>
       </w:rPr>
     </w:lvl>
     <w:lvl w:ilvl="2">
@@ -3668,7 +3596,7 @@
         <w:ind w:left="720" w:hanging="720"/>
       </w:pPr>
       <w:rPr>
-        <w:rFonts w:hint="default" w:ascii="Arial" w:hAnsi="Arial" w:cs="Arial"/>
+        <w:rFonts w:ascii="Arial" w:hAnsi="Arial" w:cs="Arial" w:hint="default"/>
       </w:rPr>
     </w:lvl>
     <w:lvl w:ilvl="3">
@@ -3681,7 +3609,7 @@
         <w:ind w:left="720" w:hanging="720"/>
       </w:pPr>
       <w:rPr>
-        <w:rFonts w:hint="default" w:ascii="Arial" w:hAnsi="Arial" w:cs="Arial"/>
+        <w:rFonts w:ascii="Arial" w:hAnsi="Arial" w:cs="Arial" w:hint="default"/>
       </w:rPr>
     </w:lvl>
     <w:lvl w:ilvl="4">
@@ -3694,7 +3622,7 @@
         <w:ind w:left="1080" w:hanging="1080"/>
       </w:pPr>
       <w:rPr>
-        <w:rFonts w:hint="default" w:ascii="Arial" w:hAnsi="Arial" w:cs="Arial"/>
+        <w:rFonts w:ascii="Arial" w:hAnsi="Arial" w:cs="Arial" w:hint="default"/>
       </w:rPr>
     </w:lvl>
     <w:lvl w:ilvl="5">
@@ -3707,7 +3635,7 @@
         <w:ind w:left="1080" w:hanging="1080"/>
       </w:pPr>
       <w:rPr>
-        <w:rFonts w:hint="default" w:ascii="Arial" w:hAnsi="Arial" w:cs="Arial"/>
+        <w:rFonts w:ascii="Arial" w:hAnsi="Arial" w:cs="Arial" w:hint="default"/>
       </w:rPr>
     </w:lvl>
     <w:lvl w:ilvl="6">
@@ -3720,7 +3648,7 @@
         <w:ind w:left="1440" w:hanging="1440"/>
       </w:pPr>
       <w:rPr>
-        <w:rFonts w:hint="default" w:ascii="Arial" w:hAnsi="Arial" w:cs="Arial"/>
+        <w:rFonts w:ascii="Arial" w:hAnsi="Arial" w:cs="Arial" w:hint="default"/>
       </w:rPr>
     </w:lvl>
     <w:lvl w:ilvl="7">
@@ -3733,7 +3661,7 @@
         <w:ind w:left="1440" w:hanging="1440"/>
       </w:pPr>
       <w:rPr>
-        <w:rFonts w:hint="default" w:ascii="Arial" w:hAnsi="Arial" w:cs="Arial"/>
+        <w:rFonts w:ascii="Arial" w:hAnsi="Arial" w:cs="Arial" w:hint="default"/>
       </w:rPr>
     </w:lvl>
     <w:lvl w:ilvl="8">
@@ -3746,7 +3674,7 @@
         <w:ind w:left="1800" w:hanging="1800"/>
       </w:pPr>
       <w:rPr>
-        <w:rFonts w:hint="default" w:ascii="Arial" w:hAnsi="Arial" w:cs="Arial"/>
+        <w:rFonts w:ascii="Arial" w:hAnsi="Arial" w:cs="Arial" w:hint="default"/>
       </w:rPr>
     </w:lvl>
   </w:abstractNum>
@@ -3773,7 +3701,7 @@
   <w:docDefaults>
     <w:rPrDefault>
       <w:rPr>
-        <w:rFonts w:asciiTheme="minorHAnsi" w:hAnsiTheme="minorHAnsi" w:eastAsiaTheme="minorHAnsi" w:cstheme="minorBidi"/>
+        <w:rFonts w:asciiTheme="minorHAnsi" w:eastAsiaTheme="minorHAnsi" w:hAnsiTheme="minorHAnsi" w:cstheme="minorBidi"/>
         <w:sz w:val="24"/>
         <w:szCs w:val="24"/>
         <w:lang w:val="en-NZ" w:eastAsia="en-US" w:bidi="ar-SA"/>
@@ -3784,14 +3712,14 @@
   <w:latentStyles w:defLockedState="0" w:defUIPriority="99" w:defSemiHidden="0" w:defUnhideWhenUsed="0" w:defQFormat="0" w:count="376">
     <w:lsdException w:name="Normal" w:uiPriority="0" w:qFormat="1"/>
     <w:lsdException w:name="heading 1" w:uiPriority="9" w:qFormat="1"/>
-    <w:lsdException w:name="heading 2" w:uiPriority="9" w:semiHidden="1" w:unhideWhenUsed="1" w:qFormat="1"/>
-    <w:lsdException w:name="heading 3" w:uiPriority="9" w:semiHidden="1" w:unhideWhenUsed="1" w:qFormat="1"/>
-    <w:lsdException w:name="heading 4" w:uiPriority="9" w:semiHidden="1" w:unhideWhenUsed="1" w:qFormat="1"/>
-    <w:lsdException w:name="heading 5" w:uiPriority="9" w:semiHidden="1" w:unhideWhenUsed="1" w:qFormat="1"/>
-    <w:lsdException w:name="heading 6" w:uiPriority="9" w:semiHidden="1" w:unhideWhenUsed="1" w:qFormat="1"/>
-    <w:lsdException w:name="heading 7" w:uiPriority="9" w:semiHidden="1" w:unhideWhenUsed="1" w:qFormat="1"/>
-    <w:lsdException w:name="heading 8" w:uiPriority="9" w:semiHidden="1" w:unhideWhenUsed="1" w:qFormat="1"/>
-    <w:lsdException w:name="heading 9" w:uiPriority="9" w:semiHidden="1" w:unhideWhenUsed="1" w:qFormat="1"/>
+    <w:lsdException w:name="heading 2" w:semiHidden="1" w:uiPriority="9" w:unhideWhenUsed="1" w:qFormat="1"/>
+    <w:lsdException w:name="heading 3" w:semiHidden="1" w:uiPriority="9" w:unhideWhenUsed="1" w:qFormat="1"/>
+    <w:lsdException w:name="heading 4" w:semiHidden="1" w:uiPriority="9" w:unhideWhenUsed="1" w:qFormat="1"/>
+    <w:lsdException w:name="heading 5" w:semiHidden="1" w:uiPriority="9" w:unhideWhenUsed="1" w:qFormat="1"/>
+    <w:lsdException w:name="heading 6" w:semiHidden="1" w:uiPriority="9" w:unhideWhenUsed="1" w:qFormat="1"/>
+    <w:lsdException w:name="heading 7" w:semiHidden="1" w:uiPriority="9" w:unhideWhenUsed="1" w:qFormat="1"/>
+    <w:lsdException w:name="heading 8" w:semiHidden="1" w:uiPriority="9" w:unhideWhenUsed="1" w:qFormat="1"/>
+    <w:lsdException w:name="heading 9" w:semiHidden="1" w:uiPriority="9" w:unhideWhenUsed="1" w:qFormat="1"/>
     <w:lsdException w:name="index 1" w:semiHidden="1" w:unhideWhenUsed="1"/>
     <w:lsdException w:name="index 2" w:semiHidden="1" w:unhideWhenUsed="1"/>
     <w:lsdException w:name="index 3" w:semiHidden="1" w:unhideWhenUsed="1"/>
@@ -3801,22 +3729,22 @@
     <w:lsdException w:name="index 7" w:semiHidden="1" w:unhideWhenUsed="1"/>
     <w:lsdException w:name="index 8" w:semiHidden="1" w:unhideWhenUsed="1"/>
     <w:lsdException w:name="index 9" w:semiHidden="1" w:unhideWhenUsed="1"/>
-    <w:lsdException w:name="toc 1" w:uiPriority="39" w:semiHidden="1" w:unhideWhenUsed="1"/>
-    <w:lsdException w:name="toc 2" w:uiPriority="39" w:semiHidden="1" w:unhideWhenUsed="1"/>
-    <w:lsdException w:name="toc 3" w:uiPriority="39" w:semiHidden="1" w:unhideWhenUsed="1"/>
-    <w:lsdException w:name="toc 4" w:uiPriority="39" w:semiHidden="1" w:unhideWhenUsed="1"/>
-    <w:lsdException w:name="toc 5" w:uiPriority="39" w:semiHidden="1" w:unhideWhenUsed="1"/>
-    <w:lsdException w:name="toc 6" w:uiPriority="39" w:semiHidden="1" w:unhideWhenUsed="1"/>
-    <w:lsdException w:name="toc 7" w:uiPriority="39" w:semiHidden="1" w:unhideWhenUsed="1"/>
-    <w:lsdException w:name="toc 8" w:uiPriority="39" w:semiHidden="1" w:unhideWhenUsed="1"/>
-    <w:lsdException w:name="toc 9" w:uiPriority="39" w:semiHidden="1" w:unhideWhenUsed="1"/>
+    <w:lsdException w:name="toc 1" w:semiHidden="1" w:uiPriority="39" w:unhideWhenUsed="1"/>
+    <w:lsdException w:name="toc 2" w:semiHidden="1" w:uiPriority="39" w:unhideWhenUsed="1"/>
+    <w:lsdException w:name="toc 3" w:semiHidden="1" w:uiPriority="39" w:unhideWhenUsed="1"/>
+    <w:lsdException w:name="toc 4" w:semiHidden="1" w:uiPriority="39" w:unhideWhenUsed="1"/>
+    <w:lsdException w:name="toc 5" w:semiHidden="1" w:uiPriority="39" w:unhideWhenUsed="1"/>
+    <w:lsdException w:name="toc 6" w:semiHidden="1" w:uiPriority="39" w:unhideWhenUsed="1"/>
+    <w:lsdException w:name="toc 7" w:semiHidden="1" w:uiPriority="39" w:unhideWhenUsed="1"/>
+    <w:lsdException w:name="toc 8" w:semiHidden="1" w:uiPriority="39" w:unhideWhenUsed="1"/>
+    <w:lsdException w:name="toc 9" w:semiHidden="1" w:uiPriority="39" w:unhideWhenUsed="1"/>
     <w:lsdException w:name="Normal Indent" w:semiHidden="1" w:unhideWhenUsed="1"/>
     <w:lsdException w:name="footnote text" w:semiHidden="1" w:unhideWhenUsed="1"/>
     <w:lsdException w:name="annotation text" w:semiHidden="1" w:unhideWhenUsed="1"/>
     <w:lsdException w:name="header" w:semiHidden="1" w:unhideWhenUsed="1"/>
     <w:lsdException w:name="footer" w:semiHidden="1" w:unhideWhenUsed="1"/>
     <w:lsdException w:name="index heading" w:semiHidden="1" w:unhideWhenUsed="1"/>
-    <w:lsdException w:name="caption" w:uiPriority="35" w:semiHidden="1" w:unhideWhenUsed="1" w:qFormat="1"/>
+    <w:lsdException w:name="caption" w:semiHidden="1" w:uiPriority="35" w:unhideWhenUsed="1" w:qFormat="1"/>
     <w:lsdException w:name="table of figures" w:semiHidden="1" w:unhideWhenUsed="1"/>
     <w:lsdException w:name="envelope address" w:semiHidden="1" w:unhideWhenUsed="1"/>
     <w:lsdException w:name="envelope return" w:semiHidden="1" w:unhideWhenUsed="1"/>
@@ -3847,7 +3775,7 @@
     <w:lsdException w:name="Title" w:uiPriority="10" w:qFormat="1"/>
     <w:lsdException w:name="Closing" w:semiHidden="1" w:unhideWhenUsed="1"/>
     <w:lsdException w:name="Signature" w:semiHidden="1" w:unhideWhenUsed="1"/>
-    <w:lsdException w:name="Default Paragraph Font" w:uiPriority="1" w:semiHidden="1" w:unhideWhenUsed="1"/>
+    <w:lsdException w:name="Default Paragraph Font" w:semiHidden="1" w:uiPriority="1" w:unhideWhenUsed="1"/>
     <w:lsdException w:name="Body Text" w:semiHidden="1" w:unhideWhenUsed="1"/>
     <w:lsdException w:name="Body Text Indent" w:semiHidden="1" w:unhideWhenUsed="1"/>
     <w:lsdException w:name="List Continue" w:semiHidden="1" w:unhideWhenUsed="1"/>
@@ -4047,8 +3975,8 @@
     <w:lsdException w:name="Subtle Reference" w:uiPriority="31" w:qFormat="1"/>
     <w:lsdException w:name="Intense Reference" w:uiPriority="32" w:qFormat="1"/>
     <w:lsdException w:name="Book Title" w:uiPriority="33" w:qFormat="1"/>
-    <w:lsdException w:name="Bibliography" w:uiPriority="37" w:semiHidden="1" w:unhideWhenUsed="1"/>
-    <w:lsdException w:name="TOC Heading" w:uiPriority="39" w:semiHidden="1" w:unhideWhenUsed="1" w:qFormat="1"/>
+    <w:lsdException w:name="Bibliography" w:semiHidden="1" w:uiPriority="37" w:unhideWhenUsed="1"/>
+    <w:lsdException w:name="TOC Heading" w:semiHidden="1" w:uiPriority="39" w:unhideWhenUsed="1" w:qFormat="1"/>
     <w:lsdException w:name="Plain Table 1" w:uiPriority="41"/>
     <w:lsdException w:name="Plain Table 2" w:uiPriority="42"/>
     <w:lsdException w:name="Plain Table 3" w:uiPriority="43"/>
@@ -4159,7 +4087,7 @@
     <w:lsdException w:name="Unresolved Mention" w:semiHidden="1" w:unhideWhenUsed="1"/>
     <w:lsdException w:name="Smart Link" w:semiHidden="1" w:unhideWhenUsed="1"/>
   </w:latentStyles>
-  <w:style w:type="paragraph" w:styleId="Normal" w:default="1">
+  <w:style w:type="paragraph" w:default="1" w:styleId="Normal">
     <w:name w:val="Normal"/>
     <w:qFormat/>
     <w:rsid w:val="00F65138"/>
@@ -4187,7 +4115,7 @@
       <w:outlineLvl w:val="0"/>
     </w:pPr>
     <w:rPr>
-      <w:rFonts w:asciiTheme="majorHAnsi" w:hAnsiTheme="majorHAnsi" w:eastAsiaTheme="majorEastAsia" w:cstheme="majorBidi"/>
+      <w:rFonts w:asciiTheme="majorHAnsi" w:eastAsiaTheme="majorEastAsia" w:hAnsiTheme="majorHAnsi" w:cstheme="majorBidi"/>
       <w:color w:val="2F5496" w:themeColor="accent1" w:themeShade="BF"/>
       <w:sz w:val="32"/>
       <w:szCs w:val="32"/>
@@ -4214,12 +4142,13 @@
       <w:szCs w:val="26"/>
     </w:rPr>
   </w:style>
-  <w:style w:type="character" w:styleId="DefaultParagraphFont" w:default="1">
+  <w:style w:type="character" w:default="1" w:styleId="DefaultParagraphFont">
     <w:name w:val="Default Paragraph Font"/>
     <w:uiPriority w:val="1"/>
+    <w:semiHidden/>
     <w:unhideWhenUsed/>
   </w:style>
-  <w:style w:type="table" w:styleId="TableNormal" w:default="1">
+  <w:style w:type="table" w:default="1" w:styleId="TableNormal">
     <w:name w:val="Normal Table"/>
     <w:uiPriority w:val="99"/>
     <w:semiHidden/>
@@ -4234,20 +4163,20 @@
       </w:tblCellMar>
     </w:tblPr>
   </w:style>
-  <w:style w:type="numbering" w:styleId="NoList" w:default="1">
+  <w:style w:type="numbering" w:default="1" w:styleId="NoList">
     <w:name w:val="No List"/>
     <w:uiPriority w:val="99"/>
     <w:semiHidden/>
     <w:unhideWhenUsed/>
   </w:style>
-  <w:style w:type="character" w:styleId="Heading2Char" w:customStyle="1">
+  <w:style w:type="character" w:customStyle="1" w:styleId="Heading2Char">
     <w:name w:val="Heading 2 Char"/>
     <w:basedOn w:val="DefaultParagraphFont"/>
     <w:link w:val="Heading2"/>
     <w:uiPriority w:val="9"/>
     <w:rsid w:val="007846A0"/>
     <w:rPr>
-      <w:rFonts w:ascii="Helvetica" w:hAnsi="Helvetica" w:eastAsiaTheme="majorEastAsia" w:cstheme="majorBidi"/>
+      <w:rFonts w:ascii="Helvetica" w:eastAsiaTheme="majorEastAsia" w:hAnsi="Helvetica" w:cstheme="majorBidi"/>
       <w:b/>
       <w:color w:val="000000" w:themeColor="text1"/>
       <w:sz w:val="26"/>
@@ -4255,21 +4184,21 @@
       <w:lang w:val="en-GB"/>
     </w:rPr>
   </w:style>
-  <w:style w:type="character" w:styleId="Heading1Char" w:customStyle="1">
+  <w:style w:type="character" w:customStyle="1" w:styleId="Heading1Char">
     <w:name w:val="Heading 1 Char"/>
     <w:basedOn w:val="DefaultParagraphFont"/>
     <w:link w:val="Heading1"/>
     <w:uiPriority w:val="9"/>
     <w:rsid w:val="007846A0"/>
     <w:rPr>
-      <w:rFonts w:asciiTheme="majorHAnsi" w:hAnsiTheme="majorHAnsi" w:eastAsiaTheme="majorEastAsia" w:cstheme="majorBidi"/>
+      <w:rFonts w:asciiTheme="majorHAnsi" w:eastAsiaTheme="majorEastAsia" w:hAnsiTheme="majorHAnsi" w:cstheme="majorBidi"/>
       <w:color w:val="2F5496" w:themeColor="accent1" w:themeShade="BF"/>
       <w:sz w:val="32"/>
       <w:szCs w:val="32"/>
       <w:lang w:val="en-GB"/>
     </w:rPr>
   </w:style>
-  <w:style w:type="character" w:styleId="code" w:customStyle="1">
+  <w:style w:type="character" w:customStyle="1" w:styleId="code">
     <w:name w:val="code"/>
     <w:basedOn w:val="DefaultParagraphFont"/>
     <w:qFormat/>
@@ -4283,7 +4212,7 @@
       <w:u w:val="none"/>
     </w:rPr>
   </w:style>
-  <w:style w:type="paragraph" w:styleId="pre" w:customStyle="1">
+  <w:style w:type="paragraph" w:customStyle="1" w:styleId="pre">
     <w:name w:val="pre"/>
     <w:basedOn w:val="Normal"/>
     <w:autoRedefine/>
@@ -4293,10 +4222,10 @@
       <w:keepNext/>
       <w:keepLines/>
       <w:pBdr>
-        <w:top w:val="single" w:color="E7E6E6" w:themeColor="background2" w:sz="48" w:space="1"/>
-        <w:left w:val="single" w:color="E7E6E6" w:themeColor="background2" w:sz="48" w:space="4"/>
-        <w:bottom w:val="single" w:color="E7E6E6" w:themeColor="background2" w:sz="48" w:space="1"/>
-        <w:right w:val="single" w:color="E7E6E6" w:themeColor="background2" w:sz="48" w:space="4"/>
+        <w:top w:val="single" w:sz="48" w:space="1" w:color="E7E6E6" w:themeColor="background2"/>
+        <w:left w:val="single" w:sz="48" w:space="4" w:color="E7E6E6" w:themeColor="background2"/>
+        <w:bottom w:val="single" w:sz="48" w:space="1" w:color="E7E6E6" w:themeColor="background2"/>
+        <w:right w:val="single" w:sz="48" w:space="4" w:color="E7E6E6" w:themeColor="background2"/>
       </w:pBdr>
       <w:shd w:val="clear" w:color="auto" w:fill="E7E6E6" w:themeFill="background2"/>
       <w:suppressAutoHyphens/>
@@ -4332,16 +4261,16 @@
     <w:rsid w:val="00F65138"/>
     <w:tblPr>
       <w:tblBorders>
-        <w:top w:val="single" w:color="auto" w:sz="4" w:space="0"/>
-        <w:left w:val="single" w:color="auto" w:sz="4" w:space="0"/>
-        <w:bottom w:val="single" w:color="auto" w:sz="4" w:space="0"/>
-        <w:right w:val="single" w:color="auto" w:sz="4" w:space="0"/>
-        <w:insideH w:val="single" w:color="auto" w:sz="4" w:space="0"/>
-        <w:insideV w:val="single" w:color="auto" w:sz="4" w:space="0"/>
+        <w:top w:val="single" w:sz="4" w:space="0" w:color="auto"/>
+        <w:left w:val="single" w:sz="4" w:space="0" w:color="auto"/>
+        <w:bottom w:val="single" w:sz="4" w:space="0" w:color="auto"/>
+        <w:right w:val="single" w:sz="4" w:space="0" w:color="auto"/>
+        <w:insideH w:val="single" w:sz="4" w:space="0" w:color="auto"/>
+        <w:insideV w:val="single" w:sz="4" w:space="0" w:color="auto"/>
       </w:tblBorders>
     </w:tblPr>
   </w:style>
-  <w:style w:type="paragraph" w:styleId="paragraph" w:customStyle="1">
+  <w:style w:type="paragraph" w:customStyle="1" w:styleId="paragraph">
     <w:name w:val="paragraph"/>
     <w:basedOn w:val="Normal"/>
     <w:rsid w:val="00F65138"/>
@@ -4349,17 +4278,17 @@
       <w:spacing w:before="100" w:beforeAutospacing="1" w:after="100" w:afterAutospacing="1"/>
     </w:pPr>
     <w:rPr>
-      <w:rFonts w:ascii="Times New Roman" w:hAnsi="Times New Roman" w:eastAsia="Times New Roman" w:cs="Times New Roman"/>
+      <w:rFonts w:ascii="Times New Roman" w:eastAsia="Times New Roman" w:hAnsi="Times New Roman" w:cs="Times New Roman"/>
       <w:sz w:val="24"/>
       <w:lang w:val="en-NZ" w:eastAsia="en-GB"/>
     </w:rPr>
   </w:style>
-  <w:style w:type="character" w:styleId="normaltextrun" w:customStyle="1">
+  <w:style w:type="character" w:customStyle="1" w:styleId="normaltextrun">
     <w:name w:val="normaltextrun"/>
     <w:basedOn w:val="DefaultParagraphFont"/>
     <w:rsid w:val="00F65138"/>
   </w:style>
-  <w:style w:type="character" w:styleId="eop" w:customStyle="1">
+  <w:style w:type="character" w:customStyle="1" w:styleId="eop">
     <w:name w:val="eop"/>
     <w:basedOn w:val="DefaultParagraphFont"/>
     <w:rsid w:val="00F65138"/>
@@ -4399,11 +4328,23 @@
       <w:shd w:val="clear" w:color="auto" w:fill="E1DFDD"/>
     </w:rPr>
   </w:style>
+  <w:style w:type="character" w:styleId="FollowedHyperlink">
+    <w:name w:val="FollowedHyperlink"/>
+    <w:basedOn w:val="DefaultParagraphFont"/>
+    <w:uiPriority w:val="99"/>
+    <w:semiHidden/>
+    <w:unhideWhenUsed/>
+    <w:rsid w:val="00AC1159"/>
+    <w:rPr>
+      <w:color w:val="954F72" w:themeColor="followedHyperlink"/>
+      <w:u w:val="single"/>
+    </w:rPr>
+  </w:style>
 </w:styles>
 </file>
 
 <file path=word/theme/theme1.xml><?xml version="1.0" encoding="utf-8"?>
-<a:theme xmlns:a="http://schemas.openxmlformats.org/drawingml/2006/main" xmlns:thm15="http://schemas.microsoft.com/office/thememl/2012/main" name="Office Theme">
+<a:theme xmlns:a="http://schemas.openxmlformats.org/drawingml/2006/main" name="Office Theme">
   <a:themeElements>
     <a:clrScheme name="Office">
       <a:dk1>
@@ -4698,6 +4639,12 @@
 </file>
 
 <file path=customXml/item1.xml><?xml version="1.0" encoding="utf-8"?>
+<p:properties xmlns:p="http://schemas.microsoft.com/office/2006/metadata/properties" xmlns:xsi="http://www.w3.org/2001/XMLSchema-instance" xmlns:pc="http://schemas.microsoft.com/office/infopath/2007/PartnerControls">
+  <documentManagement/>
+</p:properties>
+</file>
+
+<file path=customXml/item2.xml><?xml version="1.0" encoding="utf-8"?>
 <ct:contentTypeSchema xmlns:ct="http://schemas.microsoft.com/office/2006/metadata/contentType" xmlns:ma="http://schemas.microsoft.com/office/2006/metadata/properties/metaAttributes" ct:_="" ma:_="" ma:contentTypeName="Document" ma:contentTypeID="0x010100550783370546224FB9D7AF4BB1E7BCFB" ma:contentTypeVersion="9" ma:contentTypeDescription="Create a new document." ma:contentTypeScope="" ma:versionID="04215a905a15e7b6afeaab886e76884a">
   <xsd:schema xmlns:xsd="http://www.w3.org/2001/XMLSchema" xmlns:xs="http://www.w3.org/2001/XMLSchema" xmlns:p="http://schemas.microsoft.com/office/2006/metadata/properties" xmlns:ns2="cbde9e05-863a-4060-b84e-02e49cc59596" targetNamespace="http://schemas.microsoft.com/office/2006/metadata/properties" ma:root="true" ma:fieldsID="159f4c2f0e3c7e8cf0e850dda9a1de34" ns2:_="">
     <xsd:import namespace="cbde9e05-863a-4060-b84e-02e49cc59596"/>
@@ -4875,12 +4822,6 @@
 </ct:contentTypeSchema>
 </file>
 
-<file path=customXml/item2.xml><?xml version="1.0" encoding="utf-8"?>
-<p:properties xmlns:p="http://schemas.microsoft.com/office/2006/metadata/properties" xmlns:xsi="http://www.w3.org/2001/XMLSchema-instance" xmlns:pc="http://schemas.microsoft.com/office/infopath/2007/PartnerControls">
-  <documentManagement/>
-</p:properties>
-</file>
-
 <file path=customXml/item3.xml><?xml version="1.0" encoding="utf-8"?>
 <?mso-contentType ?>
 <FormTemplates xmlns="http://schemas.microsoft.com/sharepoint/v3/contenttype/forms">
@@ -4891,6 +4832,15 @@
 </file>
 
 <file path=customXml/itemProps1.xml><?xml version="1.0" encoding="utf-8"?>
+<ds:datastoreItem xmlns:ds="http://schemas.openxmlformats.org/officeDocument/2006/customXml" ds:itemID="{B11290AE-63BC-4188-BAAB-F2BC551E95A7}">
+  <ds:schemaRefs>
+    <ds:schemaRef ds:uri="http://schemas.microsoft.com/office/2006/metadata/properties"/>
+    <ds:schemaRef ds:uri="http://schemas.microsoft.com/office/infopath/2007/PartnerControls"/>
+  </ds:schemaRefs>
+</ds:datastoreItem>
+</file>
+
+<file path=customXml/itemProps2.xml><?xml version="1.0" encoding="utf-8"?>
 <ds:datastoreItem xmlns:ds="http://schemas.openxmlformats.org/officeDocument/2006/customXml" ds:itemID="{D1A90ABE-418A-4EFE-B383-2D8CC73AE9CB}">
   <ds:schemaRefs>
     <ds:schemaRef ds:uri="http://schemas.microsoft.com/office/2006/metadata/contentType"/>
@@ -4908,15 +4858,6 @@
 </ds:datastoreItem>
 </file>
 
-<file path=customXml/itemProps2.xml><?xml version="1.0" encoding="utf-8"?>
-<ds:datastoreItem xmlns:ds="http://schemas.openxmlformats.org/officeDocument/2006/customXml" ds:itemID="{B11290AE-63BC-4188-BAAB-F2BC551E95A7}">
-  <ds:schemaRefs>
-    <ds:schemaRef ds:uri="http://schemas.microsoft.com/office/2006/metadata/properties"/>
-    <ds:schemaRef ds:uri="http://schemas.microsoft.com/office/infopath/2007/PartnerControls"/>
-  </ds:schemaRefs>
-</ds:datastoreItem>
-</file>
-
 <file path=customXml/itemProps3.xml><?xml version="1.0" encoding="utf-8"?>
 <ds:datastoreItem xmlns:ds="http://schemas.openxmlformats.org/officeDocument/2006/customXml" ds:itemID="{9691FF8D-F691-4758-BFC4-E5E2CB0521CF}">
   <ds:schemaRefs>

</xml_diff>